<commit_message>
Improve scoring and specialist calibration flow
</commit_message>
<xml_diff>
--- a/docs/Q-Project-Structure-Base-de-donnees.docx
+++ b/docs/Q-Project-Structure-Base-de-donnees.docx
@@ -26,13 +26,15 @@
         <w:t>Version documentaire :</w:t>
       </w:r>
       <w:r>
-        <w:t xml:space="preserve"> 31 août 2026 </w:t>
-      </w:r>
-      <w:r>
-        <w:rPr>
-          <w:b/>
-        </w:rPr>
-        <w:t>Migration de référence :</w:t>
+        <w:t xml:space="preserve"> 5 septembre 2026</w:t>
+      </w:r>
+    </w:p>
+    <w:p>
+      <w:r>
+        <w:rPr>
+          <w:b/>
+        </w:rPr>
+        <w:t>Migrations de référence :</w:t>
       </w:r>
       <w:r>
         <w:t xml:space="preserve"> </w:t>
@@ -45,8 +47,17 @@
         <w:t>supabase/migrations/20260831120000_specialist_admin_portal.sql</w:t>
       </w:r>
       <w:r>
-        <w:t xml:space="preserve"> </w:t>
-      </w:r>
+        <w:t xml:space="preserve"> et </w:t>
+      </w:r>
+      <w:r>
+        <w:rPr>
+          <w:rFonts w:ascii="Consolas" w:hAnsi="Consolas"/>
+          <w:shd w:fill="EEF2F4"/>
+        </w:rPr>
+        <w:t>supabase/migrations/20260904193000_accuracy_and_qualitative_specialist_v2.sql</w:t>
+      </w:r>
+    </w:p>
+    <w:p>
       <w:r>
         <w:rPr>
           <w:b/>
@@ -555,7 +566,41 @@
         <w:t xml:space="preserve">• </w:t>
       </w:r>
       <w:r>
-        <w:t>chaque nouvelle soumission v2 enregistre la version exacte du catalogue utilisée ;</w:t>
+        <w:t>chaque nouvelle soumission de schéma 2, envoyée par une RPC v3, enregistre la version exacte du catalogue utilisée ;</w:t>
+      </w:r>
+    </w:p>
+    <w:p>
+      <w:pPr>
+        <w:pStyle w:val="ListBullet"/>
+        <w:ind w:left="520" w:hanging="280"/>
+        <w:spacing w:after="70"/>
+      </w:pPr>
+      <w:r>
+        <w:rPr>
+          <w:b/>
+          <w:color w:val="0B6B70"/>
+        </w:rPr>
+        <w:t xml:space="preserve">• </w:t>
+      </w:r>
+      <w:r>
+        <w:t>l'entretien spécialiste de schéma 2 collecte cinq réponses qualitatives après les 81 items, au lieu des anciens champs structurés d'expérience, satisfaction, intention de changement et caractère volontaire du choix ;</w:t>
+      </w:r>
+    </w:p>
+    <w:p>
+      <w:pPr>
+        <w:pStyle w:val="ListBullet"/>
+        <w:ind w:left="520" w:hanging="280"/>
+        <w:spacing w:after="70"/>
+      </w:pPr>
+      <w:r>
+        <w:rPr>
+          <w:b/>
+          <w:color w:val="0B6B70"/>
+        </w:rPr>
+        <w:t xml:space="preserve">• </w:t>
+      </w:r>
+      <w:r>
+        <w:t>les anciennes colonnes et les anciennes RPC restent présentes afin de conserver l'historique sans le mélanger au protocole courant ;</w:t>
       </w:r>
     </w:p>
     <w:p>
@@ -587,7 +632,27 @@
         <w:t>20260831120000_specialist_admin_portal.sql</w:t>
       </w:r>
       <w:r>
-        <w:t xml:space="preserve"> ajoute cette couche sans supprimer les fonctions v1 historiques. Les appels v2 assurent désormais la provenance du catalogue de spécialités.</w:t>
+        <w:t xml:space="preserve"> ajoute la couche éditoriale sans supprimer les fonctions v1 historiques. La migration </w:t>
+      </w:r>
+      <w:r>
+        <w:rPr>
+          <w:rFonts w:ascii="Consolas" w:hAnsi="Consolas"/>
+          <w:shd w:fill="EEF2F4"/>
+        </w:rPr>
+        <w:t>20260904193000_accuracy_and_qualitative_specialist_v2.sql</w:t>
+      </w:r>
+      <w:r>
+        <w:t xml:space="preserve"> ajoute le schéma de soumission 2 et les RPC v3, publie un nouvel instantané immuable qui complète les traits clés mesurés manquants, et laisse volontairement </w:t>
+      </w:r>
+      <w:r>
+        <w:rPr>
+          <w:rFonts w:ascii="Consolas" w:hAnsi="Consolas"/>
+          <w:shd w:fill="EEF2F4"/>
+        </w:rPr>
+        <w:t>prevention_orientation</w:t>
+      </w:r>
+      <w:r>
+        <w:t xml:space="preserve"> non mesuré. Les appels v2 restent utilisables pour l'historique ; les nouvelles collectes utilisent v3.</w:t>
       </w:r>
     </w:p>
     <w:p>
@@ -678,7 +743,7 @@
           <w:sz w:val="18"/>
           <w:szCs w:val="18"/>
         </w:rPr>
-        <w:t xml:space="preserve">│  - soumissions v2                 - brouillon de configuration       │</w:t>
+        <w:t xml:space="preserve">│  - soumissions v3 / schéma 2      - réponses qualitatives            │</w:t>
       </w:r>
       <w:r>
         <w:br/>
@@ -798,7 +863,7 @@
           <w:sz w:val="18"/>
           <w:szCs w:val="18"/>
         </w:rPr>
-        <w:t xml:space="preserve">│ submit_*_response_v1/v2            get/save/publish/list/restore     │</w:t>
+        <w:t xml:space="preserve">│ submit_*_response_v1/v2/v3         get/save/publish/list/restore     │</w:t>
       </w:r>
       <w:r>
         <w:br/>
@@ -975,7 +1040,17 @@
         <w:t xml:space="preserve">3. </w:t>
       </w:r>
       <w:r>
-        <w:t>La soumission v2 transmet l’identifiant UUID de la version publiée utilisée.</w:t>
+        <w:t xml:space="preserve">La soumission v3 transmet l’identifiant UUID de la version publiée utilisée et crée une ligne de </w:t>
+      </w:r>
+      <w:r>
+        <w:rPr>
+          <w:rFonts w:ascii="Consolas" w:hAnsi="Consolas"/>
+          <w:shd w:fill="EEF2F4"/>
+        </w:rPr>
+        <w:t>submission_schema_version = 2</w:t>
+      </w:r>
+      <w:r>
+        <w:t>.</w:t>
       </w:r>
     </w:p>
     <w:p>
@@ -1014,6 +1089,23 @@
     </w:p>
     <w:p>
       <w:pPr>
+        <w:pStyle w:val="ListNumber"/>
+        <w:ind w:left="520" w:hanging="280"/>
+        <w:spacing w:after="70"/>
+      </w:pPr>
+      <w:r>
+        <w:rPr>
+          <w:b/>
+          <w:color w:val="0B6B70"/>
+        </w:rPr>
+        <w:t xml:space="preserve">6. </w:t>
+      </w:r>
+      <w:r>
+        <w:t>Pour un spécialiste, la spécialité réelle et les cinq réponses qualitatives ne sont demandées qu'après les 81 notes et le choix des valeurs, afin de réduire le biais d'ancrage pendant le questionnaire principal.</w:t>
+      </w:r>
+    </w:p>
+    <w:p>
+      <w:pPr>
         <w:pStyle w:val="Heading2"/>
       </w:pPr>
       <w:r>
@@ -1075,7 +1167,7 @@
         <w:t xml:space="preserve">3. </w:t>
       </w:r>
       <w:r>
-        <w:t>Les données de recherche restent accessibles uniquement aux chercheurs allowlistés.</w:t>
+        <w:t>Les données de recherche, y compris le verbatim qualitatif des spécialistes et les exports, restent accessibles uniquement aux chercheurs allowlistés.</w:t>
       </w:r>
     </w:p>
     <w:p>
@@ -2897,6 +2989,51 @@
       </w:r>
     </w:p>
     <w:p>
+      <w:r>
+        <w:t>Le catalogue courant contient 96 traits : 92 sont produits par les notes du questionnaire, 3 (</w:t>
+      </w:r>
+      <w:r>
+        <w:rPr>
+          <w:rFonts w:ascii="Consolas" w:hAnsi="Consolas"/>
+          <w:shd w:fill="EEF2F4"/>
+        </w:rPr>
+        <w:t>manual_orientation</w:t>
+      </w:r>
+      <w:r>
+        <w:t xml:space="preserve">, </w:t>
+      </w:r>
+      <w:r>
+        <w:rPr>
+          <w:rFonts w:ascii="Consolas" w:hAnsi="Consolas"/>
+          <w:shd w:fill="EEF2F4"/>
+        </w:rPr>
+        <w:t>prestige_priority</w:t>
+      </w:r>
+      <w:r>
+        <w:t xml:space="preserve">, </w:t>
+      </w:r>
+      <w:r>
+        <w:rPr>
+          <w:rFonts w:ascii="Consolas" w:hAnsi="Consolas"/>
+          <w:shd w:fill="EEF2F4"/>
+        </w:rPr>
+        <w:t>security_priority</w:t>
+      </w:r>
+      <w:r>
+        <w:t>) uniquement lorsqu'une valeur professionnelle correspondante est sélectionnée, et 1 (</w:t>
+      </w:r>
+      <w:r>
+        <w:rPr>
+          <w:rFonts w:ascii="Consolas" w:hAnsi="Consolas"/>
+          <w:shd w:fill="EEF2F4"/>
+        </w:rPr>
+        <w:t>prevention_orientation</w:t>
+      </w:r>
+      <w:r>
+        <w:t>) n'est actuellement produit par aucune question ni valeur.</w:t>
+      </w:r>
+    </w:p>
+    <w:p>
       <w:pPr>
         <w:pStyle w:val="Heading2"/>
       </w:pPr>
@@ -4539,6 +4676,206 @@
     </w:p>
     <w:p>
       <w:pPr>
+        <w:pStyle w:val="Heading3"/>
+      </w:pPr>
+      <w:r>
+        <w:t>Révision d'intégrité du schéma 2</w:t>
+      </w:r>
+    </w:p>
+    <w:p>
+      <w:r>
+        <w:t xml:space="preserve">La migration du 4 septembre 2026 ne modifie pas en place l'instantané actif. Elle en crée une copie, complète uniquement des clés absentes puis publie la copie comme une nouvelle révision immuable. L'ancien actif devient </w:t>
+      </w:r>
+      <w:r>
+        <w:rPr>
+          <w:rFonts w:ascii="Consolas" w:hAnsi="Consolas"/>
+          <w:shd w:fill="EEF2F4"/>
+        </w:rPr>
+        <w:t>archived</w:t>
+      </w:r>
+      <w:r>
+        <w:t xml:space="preserve">, un nouveau checksum est calculé et l'opération est inscrite dans </w:t>
+      </w:r>
+      <w:r>
+        <w:rPr>
+          <w:rFonts w:ascii="Consolas" w:hAnsi="Consolas"/>
+          <w:shd w:fill="EEF2F4"/>
+        </w:rPr>
+        <w:t>private.specialty_catalog_audit</w:t>
+      </w:r>
+      <w:r>
+        <w:t xml:space="preserve"> avec l'acteur </w:t>
+      </w:r>
+      <w:r>
+        <w:rPr>
+          <w:rFonts w:ascii="Consolas" w:hAnsi="Consolas"/>
+          <w:shd w:fill="EEF2F4"/>
+        </w:rPr>
+        <w:t>system</w:t>
+      </w:r>
+      <w:r>
+        <w:t>.</w:t>
+      </w:r>
+    </w:p>
+    <w:p>
+      <w:r>
+        <w:t xml:space="preserve">Cette réparation aligne les profils avec les traits clés déjà annoncés dans les métadonnées des spécialités, par exemple </w:t>
+      </w:r>
+      <w:r>
+        <w:rPr>
+          <w:rFonts w:ascii="Consolas" w:hAnsi="Consolas"/>
+          <w:shd w:fill="EEF2F4"/>
+        </w:rPr>
+        <w:t>communication</w:t>
+      </w:r>
+      <w:r>
+        <w:t xml:space="preserve">, </w:t>
+      </w:r>
+      <w:r>
+        <w:rPr>
+          <w:rFonts w:ascii="Consolas" w:hAnsi="Consolas"/>
+          <w:shd w:fill="EEF2F4"/>
+        </w:rPr>
+        <w:t>precision</w:t>
+      </w:r>
+      <w:r>
+        <w:t xml:space="preserve">, </w:t>
+      </w:r>
+      <w:r>
+        <w:rPr>
+          <w:rFonts w:ascii="Consolas" w:hAnsi="Consolas"/>
+          <w:shd w:fill="EEF2F4"/>
+        </w:rPr>
+        <w:t>detail_orientation</w:t>
+      </w:r>
+      <w:r>
+        <w:t xml:space="preserve">, </w:t>
+      </w:r>
+      <w:r>
+        <w:rPr>
+          <w:rFonts w:ascii="Consolas" w:hAnsi="Consolas"/>
+          <w:shd w:fill="EEF2F4"/>
+        </w:rPr>
+        <w:t>long_term_orientation</w:t>
+      </w:r>
+      <w:r>
+        <w:t xml:space="preserve">, </w:t>
+      </w:r>
+      <w:r>
+        <w:rPr>
+          <w:rFonts w:ascii="Consolas" w:hAnsi="Consolas"/>
+          <w:shd w:fill="EEF2F4"/>
+        </w:rPr>
+        <w:t>cognitive_empathy</w:t>
+      </w:r>
+      <w:r>
+        <w:t xml:space="preserve">, </w:t>
+      </w:r>
+      <w:r>
+        <w:rPr>
+          <w:rFonts w:ascii="Consolas" w:hAnsi="Consolas"/>
+          <w:shd w:fill="EEF2F4"/>
+        </w:rPr>
+        <w:t>care_coordination</w:t>
+      </w:r>
+      <w:r>
+        <w:t xml:space="preserve">, </w:t>
+      </w:r>
+      <w:r>
+        <w:rPr>
+          <w:rFonts w:ascii="Consolas" w:hAnsi="Consolas"/>
+          <w:shd w:fill="EEF2F4"/>
+        </w:rPr>
+        <w:t>teamwork</w:t>
+      </w:r>
+      <w:r>
+        <w:t xml:space="preserve">, </w:t>
+      </w:r>
+      <w:r>
+        <w:rPr>
+          <w:rFonts w:ascii="Consolas" w:hAnsi="Consolas"/>
+          <w:shd w:fill="EEF2F4"/>
+        </w:rPr>
+        <w:t>patience</w:t>
+      </w:r>
+      <w:r>
+        <w:t xml:space="preserve">, </w:t>
+      </w:r>
+      <w:r>
+        <w:rPr>
+          <w:rFonts w:ascii="Consolas" w:hAnsi="Consolas"/>
+          <w:shd w:fill="EEF2F4"/>
+        </w:rPr>
+        <w:t>technology_interest</w:t>
+      </w:r>
+      <w:r>
+        <w:t xml:space="preserve">, </w:t>
+      </w:r>
+      <w:r>
+        <w:rPr>
+          <w:rFonts w:ascii="Consolas" w:hAnsi="Consolas"/>
+          <w:shd w:fill="EEF2F4"/>
+        </w:rPr>
+        <w:t>social_energy</w:t>
+      </w:r>
+      <w:r>
+        <w:t xml:space="preserve">, </w:t>
+      </w:r>
+      <w:r>
+        <w:rPr>
+          <w:rFonts w:ascii="Consolas" w:hAnsi="Consolas"/>
+          <w:shd w:fill="EEF2F4"/>
+        </w:rPr>
+        <w:t>independence</w:t>
+      </w:r>
+      <w:r>
+        <w:t xml:space="preserve"> et </w:t>
+      </w:r>
+      <w:r>
+        <w:rPr>
+          <w:rFonts w:ascii="Consolas" w:hAnsi="Consolas"/>
+          <w:shd w:fill="EEF2F4"/>
+        </w:rPr>
+        <w:t>lifestyle_priority</w:t>
+      </w:r>
+      <w:r>
+        <w:t xml:space="preserve">. Une cible existante gagne toujours sur la valeur proposée par la migration : seules les omissions sont comblées. Un éventuel brouillon en cours reçoit la même réparation additive, son </w:t>
+      </w:r>
+      <w:r>
+        <w:rPr>
+          <w:rFonts w:ascii="Consolas" w:hAnsi="Consolas"/>
+          <w:shd w:fill="EEF2F4"/>
+        </w:rPr>
+        <w:t>lock_version</w:t>
+      </w:r>
+      <w:r>
+        <w:t xml:space="preserve"> est incrémenté et chaque changement est audité.</w:t>
+      </w:r>
+    </w:p>
+    <w:p>
+      <w:r>
+        <w:rPr>
+          <w:rFonts w:ascii="Consolas" w:hAnsi="Consolas"/>
+          <w:shd w:fill="EEF2F4"/>
+        </w:rPr>
+        <w:t>prevention_orientation</w:t>
+      </w:r>
+      <w:r>
+        <w:t xml:space="preserve"> est explicitement exclu de cette opération. Sa présence dans une description ou parmi des traits clés ne transforme pas ce concept en mesure : </w:t>
+      </w:r>
+      <w:r>
+        <w:rPr>
+          <w:rFonts w:ascii="Consolas" w:hAnsi="Consolas"/>
+          <w:shd w:fill="EEF2F4"/>
+        </w:rPr>
+        <w:t>q81-v1</w:t>
+      </w:r>
+      <w:r>
+        <w:t xml:space="preserve"> ne produit toujours aucune valeur comparable pour ce trait.</w:t>
+      </w:r>
+    </w:p>
+    <w:p>
+      <w:pPr>
         <w:pStyle w:val="Heading2"/>
       </w:pPr>
       <w:r>
@@ -5796,7 +6133,7 @@
               <w:spacing w:after="0"/>
             </w:pPr>
             <w:r>
-              <w:t>Instantané publié utilisé par une soumission v2.</w:t>
+              <w:t>Instantané publié exact utilisé par les soumissions v2 et v3 ; obligatoire pour le schéma 2.</w:t>
             </w:r>
           </w:p>
         </w:tc>
@@ -6126,7 +6463,7 @@
               <w:spacing w:after="0"/>
             </w:pPr>
             <w:r>
-              <w:t>Métadonnées de carrière</w:t>
+              <w:t>Entretien qualitatif courant</w:t>
             </w:r>
           </w:p>
         </w:tc>
@@ -6144,7 +6481,7 @@
                 <w:rFonts w:ascii="Consolas" w:hAnsi="Consolas"/>
                 <w:shd w:fill="EEF2F4"/>
               </w:rPr>
-              <w:t>years_of_experience</w:t>
+              <w:t>current_specialty_view</w:t>
             </w:r>
             <w:r>
               <w:t xml:space="preserve">, </w:t>
@@ -6154,7 +6491,27 @@
                 <w:rFonts w:ascii="Consolas" w:hAnsi="Consolas"/>
                 <w:shd w:fill="EEF2F4"/>
               </w:rPr>
-              <w:t>career_satisfaction</w:t>
+              <w:t>specialty_changes_over_years</w:t>
+            </w:r>
+            <w:r>
+              <w:t xml:space="preserve">, </w:t>
+            </w:r>
+            <w:r>
+              <w:rPr>
+                <w:rFonts w:ascii="Consolas" w:hAnsi="Consolas"/>
+                <w:shd w:fill="EEF2F4"/>
+              </w:rPr>
+              <w:t>most_important_specialty_quality</w:t>
+            </w:r>
+            <w:r>
+              <w:t xml:space="preserve">, </w:t>
+            </w:r>
+            <w:r>
+              <w:rPr>
+                <w:rFonts w:ascii="Consolas" w:hAnsi="Consolas"/>
+                <w:shd w:fill="EEF2F4"/>
+              </w:rPr>
+              <w:t>student_self_question</w:t>
             </w:r>
           </w:p>
         </w:tc>
@@ -6168,7 +6525,7 @@
               <w:spacing w:after="0"/>
             </w:pPr>
             <w:r>
-              <w:t>Expérience et satisfaction facultatives.</w:t>
+              <w:t>Quatre textes obligatoires du schéma 2, nettoyés des espaces périphériques. Les trois premiers acceptent 3 à 2 000 caractères ; la question destinée à l'étudiant, 3 à 1 000 caractères.</w:t>
             </w:r>
           </w:p>
         </w:tc>
@@ -6184,7 +6541,7 @@
               <w:spacing w:after="0"/>
             </w:pPr>
             <w:r>
-              <w:t>Choix professionnel</w:t>
+              <w:t>Choix à refaire</w:t>
             </w:r>
           </w:p>
         </w:tc>
@@ -6212,31 +6569,71 @@
                 <w:rFonts w:ascii="Consolas" w:hAnsi="Consolas"/>
                 <w:shd w:fill="EEF2F4"/>
               </w:rPr>
-              <w:t>intention_to_change_code</w:t>
-            </w:r>
-            <w:r>
-              <w:t xml:space="preserve">, </w:t>
-            </w:r>
-            <w:r>
-              <w:rPr>
-                <w:rFonts w:ascii="Consolas" w:hAnsi="Consolas"/>
-                <w:shd w:fill="EEF2F4"/>
-              </w:rPr>
-              <w:t>voluntary_choice_code</w:t>
-            </w:r>
-          </w:p>
-        </w:tc>
-        <w:tc>
-          <w:tcPr>
-            <w:shd w:fill="FFFFFF"/>
-          </w:tcPr>
-          <w:p>
-            <w:pPr>
-              <w:pStyle w:val="TableText"/>
-              <w:spacing w:after="0"/>
-            </w:pPr>
-            <w:r>
-              <w:t>Codes canoniques indépendants de la langue.</w:t>
+              <w:t>would_not_choose_again_reason</w:t>
+            </w:r>
+          </w:p>
+        </w:tc>
+        <w:tc>
+          <w:tcPr>
+            <w:shd w:fill="FFFFFF"/>
+          </w:tcPr>
+          <w:p>
+            <w:pPr>
+              <w:pStyle w:val="TableText"/>
+              <w:spacing w:after="0"/>
+            </w:pPr>
+            <w:r>
+              <w:t xml:space="preserve">Code obligatoire </w:t>
+            </w:r>
+            <w:r>
+              <w:rPr>
+                <w:rFonts w:ascii="Consolas" w:hAnsi="Consolas"/>
+                <w:shd w:fill="EEF2F4"/>
+              </w:rPr>
+              <w:t>yes</w:t>
+            </w:r>
+            <w:r>
+              <w:t xml:space="preserve"> ou </w:t>
+            </w:r>
+            <w:r>
+              <w:rPr>
+                <w:rFonts w:ascii="Consolas" w:hAnsi="Consolas"/>
+                <w:shd w:fill="EEF2F4"/>
+              </w:rPr>
+              <w:t>no</w:t>
+            </w:r>
+            <w:r>
+              <w:t xml:space="preserve">. La raison de 3 à 2 000 caractères est obligatoire si la réponse vaut </w:t>
+            </w:r>
+            <w:r>
+              <w:rPr>
+                <w:rFonts w:ascii="Consolas" w:hAnsi="Consolas"/>
+                <w:shd w:fill="EEF2F4"/>
+              </w:rPr>
+              <w:t>no</w:t>
+            </w:r>
+            <w:r>
+              <w:t xml:space="preserve"> et doit rester </w:t>
+            </w:r>
+            <w:r>
+              <w:rPr>
+                <w:rFonts w:ascii="Consolas" w:hAnsi="Consolas"/>
+                <w:shd w:fill="EEF2F4"/>
+              </w:rPr>
+              <w:t>NULL</w:t>
+            </w:r>
+            <w:r>
+              <w:t xml:space="preserve"> si elle vaut </w:t>
+            </w:r>
+            <w:r>
+              <w:rPr>
+                <w:rFonts w:ascii="Consolas" w:hAnsi="Consolas"/>
+                <w:shd w:fill="EEF2F4"/>
+              </w:rPr>
+              <w:t>yes</w:t>
+            </w:r>
+            <w:r>
+              <w:t>.</w:t>
             </w:r>
           </w:p>
         </w:tc>
@@ -6252,7 +6649,7 @@
               <w:spacing w:after="0"/>
             </w:pPr>
             <w:r>
-              <w:t>Colonnes legacy</w:t>
+              <w:t>Champs structurés legacy</w:t>
             </w:r>
           </w:p>
         </w:tc>
@@ -6270,7 +6667,7 @@
                 <w:rFonts w:ascii="Consolas" w:hAnsi="Consolas"/>
                 <w:shd w:fill="EEF2F4"/>
               </w:rPr>
-              <w:t>would_choose_again</w:t>
+              <w:t>years_of_experience</w:t>
             </w:r>
             <w:r>
               <w:t xml:space="preserve">, </w:t>
@@ -6280,7 +6677,7 @@
                 <w:rFonts w:ascii="Consolas" w:hAnsi="Consolas"/>
                 <w:shd w:fill="EEF2F4"/>
               </w:rPr>
-              <w:t>intention_to_change</w:t>
+              <w:t>career_satisfaction</w:t>
             </w:r>
             <w:r>
               <w:t xml:space="preserve">, </w:t>
@@ -6290,7 +6687,17 @@
                 <w:rFonts w:ascii="Consolas" w:hAnsi="Consolas"/>
                 <w:shd w:fill="EEF2F4"/>
               </w:rPr>
-              <w:t>voluntary_choice</w:t>
+              <w:t>intention_to_change_code</w:t>
+            </w:r>
+            <w:r>
+              <w:t xml:space="preserve">, </w:t>
+            </w:r>
+            <w:r>
+              <w:rPr>
+                <w:rFonts w:ascii="Consolas" w:hAnsi="Consolas"/>
+                <w:shd w:fill="EEF2F4"/>
+              </w:rPr>
+              <w:t>voluntary_choice_code</w:t>
             </w:r>
           </w:p>
         </w:tc>
@@ -6304,7 +6711,17 @@
               <w:spacing w:after="0"/>
             </w:pPr>
             <w:r>
-              <w:t>Anciennes étiquettes localisées, conservées pour l’historique.</w:t>
+              <w:t xml:space="preserve">Anciens champs conservés pour relire les lignes historiques. Les nouvelles lignes de schéma 2 les laissent à </w:t>
+            </w:r>
+            <w:r>
+              <w:rPr>
+                <w:rFonts w:ascii="Consolas" w:hAnsi="Consolas"/>
+                <w:shd w:fill="EEF2F4"/>
+              </w:rPr>
+              <w:t>NULL</w:t>
+            </w:r>
+            <w:r>
+              <w:t>.</w:t>
             </w:r>
           </w:p>
         </w:tc>
@@ -6320,25 +6737,25 @@
               <w:spacing w:after="0"/>
             </w:pPr>
             <w:r>
-              <w:t>Versions scientifiques</w:t>
-            </w:r>
-          </w:p>
-        </w:tc>
-        <w:tc>
-          <w:tcPr>
-            <w:shd w:fill="FFFFFF"/>
-          </w:tcPr>
-          <w:p>
-            <w:pPr>
-              <w:pStyle w:val="TableText"/>
-              <w:spacing w:after="0"/>
-            </w:pPr>
-            <w:r>
-              <w:rPr>
-                <w:rFonts w:ascii="Consolas" w:hAnsi="Consolas"/>
-                <w:shd w:fill="EEF2F4"/>
-              </w:rPr>
-              <w:t>submission_schema_version</w:t>
+              <w:t>Libellés legacy</w:t>
+            </w:r>
+          </w:p>
+        </w:tc>
+        <w:tc>
+          <w:tcPr>
+            <w:shd w:fill="FFFFFF"/>
+          </w:tcPr>
+          <w:p>
+            <w:pPr>
+              <w:pStyle w:val="TableText"/>
+              <w:spacing w:after="0"/>
+            </w:pPr>
+            <w:r>
+              <w:rPr>
+                <w:rFonts w:ascii="Consolas" w:hAnsi="Consolas"/>
+                <w:shd w:fill="EEF2F4"/>
+              </w:rPr>
+              <w:t>would_choose_again</w:t>
             </w:r>
             <w:r>
               <w:t xml:space="preserve">, </w:t>
@@ -6348,7 +6765,7 @@
                 <w:rFonts w:ascii="Consolas" w:hAnsi="Consolas"/>
                 <w:shd w:fill="EEF2F4"/>
               </w:rPr>
-              <w:t>questionnaire_version</w:t>
+              <w:t>intention_to_change</w:t>
             </w:r>
             <w:r>
               <w:t xml:space="preserve">, </w:t>
@@ -6358,51 +6775,31 @@
                 <w:rFonts w:ascii="Consolas" w:hAnsi="Consolas"/>
                 <w:shd w:fill="EEF2F4"/>
               </w:rPr>
-              <w:t>value_catalog_version</w:t>
-            </w:r>
-            <w:r>
-              <w:t xml:space="preserve">, </w:t>
-            </w:r>
-            <w:r>
-              <w:rPr>
-                <w:rFonts w:ascii="Consolas" w:hAnsi="Consolas"/>
-                <w:shd w:fill="EEF2F4"/>
-              </w:rPr>
-              <w:t>specialty_catalog_version</w:t>
-            </w:r>
-            <w:r>
-              <w:t xml:space="preserve">, </w:t>
-            </w:r>
-            <w:r>
-              <w:rPr>
-                <w:rFonts w:ascii="Consolas" w:hAnsi="Consolas"/>
-                <w:shd w:fill="EEF2F4"/>
-              </w:rPr>
-              <w:t>calibration_version</w:t>
-            </w:r>
-            <w:r>
-              <w:t xml:space="preserve">, </w:t>
-            </w:r>
-            <w:r>
-              <w:rPr>
-                <w:rFonts w:ascii="Consolas" w:hAnsi="Consolas"/>
-                <w:shd w:fill="EEF2F4"/>
-              </w:rPr>
-              <w:t>consent_version</w:t>
-            </w:r>
-          </w:p>
-        </w:tc>
-        <w:tc>
-          <w:tcPr>
-            <w:shd w:fill="FFFFFF"/>
-          </w:tcPr>
-          <w:p>
-            <w:pPr>
-              <w:pStyle w:val="TableText"/>
-              <w:spacing w:after="0"/>
-            </w:pPr>
-            <w:r>
-              <w:t>Versions nécessaires à l’analyse.</w:t>
+              <w:t>voluntary_choice</w:t>
+            </w:r>
+          </w:p>
+        </w:tc>
+        <w:tc>
+          <w:tcPr>
+            <w:shd w:fill="FFFFFF"/>
+          </w:tcPr>
+          <w:p>
+            <w:pPr>
+              <w:pStyle w:val="TableText"/>
+              <w:spacing w:after="0"/>
+            </w:pPr>
+            <w:r>
+              <w:t xml:space="preserve">Anciennes étiquettes localisées conservées pour l'historique ; elles restent </w:t>
+            </w:r>
+            <w:r>
+              <w:rPr>
+                <w:rFonts w:ascii="Consolas" w:hAnsi="Consolas"/>
+                <w:shd w:fill="EEF2F4"/>
+              </w:rPr>
+              <w:t>NULL</w:t>
+            </w:r>
+            <w:r>
+              <w:t xml:space="preserve"> pour le schéma 2.</w:t>
             </w:r>
           </w:p>
         </w:tc>
@@ -6418,13 +6815,111 @@
               <w:spacing w:after="0"/>
             </w:pPr>
             <w:r>
+              <w:t>Versions scientifiques</w:t>
+            </w:r>
+          </w:p>
+        </w:tc>
+        <w:tc>
+          <w:tcPr>
+            <w:shd w:fill="F5F8F8"/>
+          </w:tcPr>
+          <w:p>
+            <w:pPr>
+              <w:pStyle w:val="TableText"/>
+              <w:spacing w:after="0"/>
+            </w:pPr>
+            <w:r>
+              <w:rPr>
+                <w:rFonts w:ascii="Consolas" w:hAnsi="Consolas"/>
+                <w:shd w:fill="EEF2F4"/>
+              </w:rPr>
+              <w:t>submission_schema_version</w:t>
+            </w:r>
+            <w:r>
+              <w:t xml:space="preserve">, </w:t>
+            </w:r>
+            <w:r>
+              <w:rPr>
+                <w:rFonts w:ascii="Consolas" w:hAnsi="Consolas"/>
+                <w:shd w:fill="EEF2F4"/>
+              </w:rPr>
+              <w:t>questionnaire_version</w:t>
+            </w:r>
+            <w:r>
+              <w:t xml:space="preserve">, </w:t>
+            </w:r>
+            <w:r>
+              <w:rPr>
+                <w:rFonts w:ascii="Consolas" w:hAnsi="Consolas"/>
+                <w:shd w:fill="EEF2F4"/>
+              </w:rPr>
+              <w:t>value_catalog_version</w:t>
+            </w:r>
+            <w:r>
+              <w:t xml:space="preserve">, </w:t>
+            </w:r>
+            <w:r>
+              <w:rPr>
+                <w:rFonts w:ascii="Consolas" w:hAnsi="Consolas"/>
+                <w:shd w:fill="EEF2F4"/>
+              </w:rPr>
+              <w:t>specialty_catalog_version</w:t>
+            </w:r>
+            <w:r>
+              <w:t xml:space="preserve">, </w:t>
+            </w:r>
+            <w:r>
+              <w:rPr>
+                <w:rFonts w:ascii="Consolas" w:hAnsi="Consolas"/>
+                <w:shd w:fill="EEF2F4"/>
+              </w:rPr>
+              <w:t>calibration_version</w:t>
+            </w:r>
+            <w:r>
+              <w:t xml:space="preserve">, </w:t>
+            </w:r>
+            <w:r>
+              <w:rPr>
+                <w:rFonts w:ascii="Consolas" w:hAnsi="Consolas"/>
+                <w:shd w:fill="EEF2F4"/>
+              </w:rPr>
+              <w:t>consent_version</w:t>
+            </w:r>
+          </w:p>
+        </w:tc>
+        <w:tc>
+          <w:tcPr>
+            <w:shd w:fill="F5F8F8"/>
+          </w:tcPr>
+          <w:p>
+            <w:pPr>
+              <w:pStyle w:val="TableText"/>
+              <w:spacing w:after="0"/>
+            </w:pPr>
+            <w:r>
+              <w:t>Versions nécessaires à l’analyse.</w:t>
+            </w:r>
+          </w:p>
+        </w:tc>
+      </w:tr>
+      <w:tr>
+        <w:tc>
+          <w:tcPr>
+            <w:shd w:fill="FFFFFF"/>
+          </w:tcPr>
+          <w:p>
+            <w:pPr>
+              <w:pStyle w:val="TableText"/>
+              <w:spacing w:after="0"/>
+            </w:pPr>
+            <w:r>
               <w:t>Provenance du catalogue</w:t>
             </w:r>
           </w:p>
         </w:tc>
         <w:tc>
           <w:tcPr>
-            <w:shd w:fill="F5F8F8"/>
+            <w:shd w:fill="FFFFFF"/>
           </w:tcPr>
           <w:p>
             <w:pPr>
@@ -6452,15 +6947,15 @@
         </w:tc>
         <w:tc>
           <w:tcPr>
-            <w:shd w:fill="F5F8F8"/>
-          </w:tcPr>
-          <w:p>
-            <w:pPr>
-              <w:pStyle w:val="TableText"/>
-              <w:spacing w:after="0"/>
-            </w:pPr>
-            <w:r>
-              <w:t>Instantané publié utilisé par une soumission v2.</w:t>
+            <w:shd w:fill="FFFFFF"/>
+          </w:tcPr>
+          <w:p>
+            <w:pPr>
+              <w:pStyle w:val="TableText"/>
+              <w:spacing w:after="0"/>
+            </w:pPr>
+            <w:r>
+              <w:t>Instantané publié exact utilisé par les soumissions v2 et v3 ; obligatoire pour le schéma 2.</w:t>
             </w:r>
           </w:p>
         </w:tc>
@@ -6483,7 +6978,205 @@
         <w:t>(specialty_config_version_id, specialty_config_revision)</w:t>
       </w:r>
       <w:r>
-        <w:t xml:space="preserve"> est cohérente et contrôlée par une clé étrangère composite.</w:t>
+        <w:t xml:space="preserve"> est cohérente et contrôlée par une clé étrangère composite. La suppression de l'ancien formulaire ne supprime donc aucune colonne ni aucune réponse historique : elle sépare le protocole courant de l'ancien par </w:t>
+      </w:r>
+      <w:r>
+        <w:rPr>
+          <w:rFonts w:ascii="Consolas" w:hAnsi="Consolas"/>
+          <w:shd w:fill="EEF2F4"/>
+        </w:rPr>
+        <w:t>submission_schema_version</w:t>
+      </w:r>
+      <w:r>
+        <w:t xml:space="preserve"> et les versions scientifiques.</w:t>
+      </w:r>
+    </w:p>
+    <w:p>
+      <w:r>
+        <w:t>Pour le protocole courant, les versions enregistrées sont :</w:t>
+      </w:r>
+    </w:p>
+    <w:p>
+      <w:pPr>
+        <w:pStyle w:val="ListBullet"/>
+        <w:ind w:left="520" w:hanging="280"/>
+        <w:spacing w:after="70"/>
+      </w:pPr>
+      <w:r>
+        <w:rPr>
+          <w:b/>
+          <w:color w:val="0B6B70"/>
+        </w:rPr>
+        <w:t xml:space="preserve">• </w:t>
+      </w:r>
+      <w:r>
+        <w:rPr>
+          <w:rFonts w:ascii="Consolas" w:hAnsi="Consolas"/>
+          <w:shd w:fill="EEF2F4"/>
+        </w:rPr>
+        <w:t>submission_schema_version = 2</w:t>
+      </w:r>
+      <w:r>
+        <w:t xml:space="preserve"> ;</w:t>
+      </w:r>
+    </w:p>
+    <w:p>
+      <w:pPr>
+        <w:pStyle w:val="ListBullet"/>
+        <w:ind w:left="520" w:hanging="280"/>
+        <w:spacing w:after="70"/>
+      </w:pPr>
+      <w:r>
+        <w:rPr>
+          <w:b/>
+          <w:color w:val="0B6B70"/>
+        </w:rPr>
+        <w:t xml:space="preserve">• </w:t>
+      </w:r>
+      <w:r>
+        <w:rPr>
+          <w:rFonts w:ascii="Consolas" w:hAnsi="Consolas"/>
+          <w:shd w:fill="EEF2F4"/>
+        </w:rPr>
+        <w:t>questionnaire_version = q81-v1</w:t>
+      </w:r>
+      <w:r>
+        <w:t xml:space="preserve"> ;</w:t>
+      </w:r>
+    </w:p>
+    <w:p>
+      <w:pPr>
+        <w:pStyle w:val="ListBullet"/>
+        <w:ind w:left="520" w:hanging="280"/>
+        <w:spacing w:after="70"/>
+      </w:pPr>
+      <w:r>
+        <w:rPr>
+          <w:b/>
+          <w:color w:val="0B6B70"/>
+        </w:rPr>
+        <w:t xml:space="preserve">• </w:t>
+      </w:r>
+      <w:r>
+        <w:rPr>
+          <w:rFonts w:ascii="Consolas" w:hAnsi="Consolas"/>
+          <w:shd w:fill="EEF2F4"/>
+        </w:rPr>
+        <w:t>value_catalog_version = career-values-v1</w:t>
+      </w:r>
+      <w:r>
+        <w:t xml:space="preserve"> ;</w:t>
+      </w:r>
+    </w:p>
+    <w:p>
+      <w:pPr>
+        <w:pStyle w:val="ListBullet"/>
+        <w:ind w:left="520" w:hanging="280"/>
+        <w:spacing w:after="70"/>
+      </w:pPr>
+      <w:r>
+        <w:rPr>
+          <w:b/>
+          <w:color w:val="0B6B70"/>
+        </w:rPr>
+        <w:t xml:space="preserve">• </w:t>
+      </w:r>
+      <w:r>
+        <w:rPr>
+          <w:rFonts w:ascii="Consolas" w:hAnsi="Consolas"/>
+          <w:shd w:fill="EEF2F4"/>
+        </w:rPr>
+        <w:t>specialty_catalog_version = medical-specialties-v1</w:t>
+      </w:r>
+      <w:r>
+        <w:t xml:space="preserve"> ;</w:t>
+      </w:r>
+    </w:p>
+    <w:p>
+      <w:pPr>
+        <w:pStyle w:val="ListBullet"/>
+        <w:ind w:left="520" w:hanging="280"/>
+        <w:spacing w:after="70"/>
+      </w:pPr>
+      <w:r>
+        <w:rPr>
+          <w:b/>
+          <w:color w:val="0B6B70"/>
+        </w:rPr>
+        <w:t xml:space="preserve">• </w:t>
+      </w:r>
+      <w:r>
+        <w:rPr>
+          <w:rFonts w:ascii="Consolas" w:hAnsi="Consolas"/>
+          <w:shd w:fill="EEF2F4"/>
+        </w:rPr>
+        <w:t>scoring_version = client-scoring-v2</w:t>
+      </w:r>
+      <w:r>
+        <w:t xml:space="preserve"> pour les étudiants ;</w:t>
+      </w:r>
+    </w:p>
+    <w:p>
+      <w:pPr>
+        <w:pStyle w:val="ListBullet"/>
+        <w:ind w:left="520" w:hanging="280"/>
+        <w:spacing w:after="70"/>
+      </w:pPr>
+      <w:r>
+        <w:rPr>
+          <w:b/>
+          <w:color w:val="0B6B70"/>
+        </w:rPr>
+        <w:t xml:space="preserve">• </w:t>
+      </w:r>
+      <w:r>
+        <w:rPr>
+          <w:rFonts w:ascii="Consolas" w:hAnsi="Consolas"/>
+          <w:shd w:fill="EEF2F4"/>
+        </w:rPr>
+        <w:t>calibration_version = calibration-v2-qualitative</w:t>
+      </w:r>
+      <w:r>
+        <w:t xml:space="preserve"> pour les spécialistes ;</w:t>
+      </w:r>
+    </w:p>
+    <w:p>
+      <w:pPr>
+        <w:pStyle w:val="ListBullet"/>
+        <w:ind w:left="520" w:hanging="280"/>
+        <w:spacing w:after="70"/>
+      </w:pPr>
+      <w:r>
+        <w:rPr>
+          <w:b/>
+          <w:color w:val="0B6B70"/>
+        </w:rPr>
+        <w:t xml:space="preserve">• </w:t>
+      </w:r>
+      <w:r>
+        <w:rPr>
+          <w:rFonts w:ascii="Consolas" w:hAnsi="Consolas"/>
+          <w:shd w:fill="EEF2F4"/>
+        </w:rPr>
+        <w:t>consent_version = research-consent-2026-09-04</w:t>
+      </w:r>
+      <w:r>
+        <w:t>.</w:t>
+      </w:r>
+    </w:p>
+    <w:p>
+      <w:r>
+        <w:t xml:space="preserve">Le libellé stable </w:t>
+      </w:r>
+      <w:r>
+        <w:rPr>
+          <w:rFonts w:ascii="Consolas" w:hAnsi="Consolas"/>
+          <w:shd w:fill="EEF2F4"/>
+        </w:rPr>
+        <w:t>medical-specialties-v1</w:t>
+      </w:r>
+      <w:r>
+        <w:t xml:space="preserve"> désigne le format canonique du catalogue. La provenance de son contenu effectif est donnée séparément par l'UUID et la révision de l'instantané publié.</w:t>
       </w:r>
     </w:p>
     <w:p>
@@ -6998,6 +7691,385 @@
     <w:p>
       <w:r>
         <w:t>Les fonctions restent idempotentes sur l’UUID de soumission. Un rejeu avec une provenance différente est refusé.</w:t>
+      </w:r>
+    </w:p>
+    <w:p>
+      <w:pPr>
+        <w:pStyle w:val="Heading3"/>
+      </w:pPr>
+      <w:r>
+        <w:rPr>
+          <w:rFonts w:ascii="Consolas" w:hAnsi="Consolas"/>
+          <w:shd w:fill="EEF2F4"/>
+        </w:rPr>
+        <w:t>submit_student_response_v3(...)</w:t>
+      </w:r>
+    </w:p>
+    <w:p>
+      <w:r>
+        <w:t xml:space="preserve">Point d'entrée courant des étudiants. Il conserve les 81 items et le catalogue de valeurs, impose </w:t>
+      </w:r>
+      <w:r>
+        <w:rPr>
+          <w:rFonts w:ascii="Consolas" w:hAnsi="Consolas"/>
+          <w:shd w:fill="EEF2F4"/>
+        </w:rPr>
+        <w:t>client-scoring-v2</w:t>
+      </w:r>
+      <w:r>
+        <w:t xml:space="preserve">, </w:t>
+      </w:r>
+      <w:r>
+        <w:rPr>
+          <w:rFonts w:ascii="Consolas" w:hAnsi="Consolas"/>
+          <w:shd w:fill="EEF2F4"/>
+        </w:rPr>
+        <w:t>research-consent-2026-09-04</w:t>
+      </w:r>
+      <w:r>
+        <w:t xml:space="preserve"> et la provenance exacte d'un catalogue publié, puis écrit </w:t>
+      </w:r>
+      <w:r>
+        <w:rPr>
+          <w:rFonts w:ascii="Consolas" w:hAnsi="Consolas"/>
+          <w:shd w:fill="EEF2F4"/>
+        </w:rPr>
+        <w:t>submission_schema_version = 2</w:t>
+      </w:r>
+      <w:r>
+        <w:t>. L'UUID fourni par le client reste idempotent : un rejeu strictement identique renvoie le même identifiant, tandis qu'un payload différent avec le même UUID est refusé.</w:t>
+      </w:r>
+    </w:p>
+    <w:p>
+      <w:pPr>
+        <w:pStyle w:val="Heading3"/>
+      </w:pPr>
+      <w:r>
+        <w:rPr>
+          <w:rFonts w:ascii="Consolas" w:hAnsi="Consolas"/>
+          <w:shd w:fill="EEF2F4"/>
+        </w:rPr>
+        <w:t>submit_specialist_response_v3(...)</w:t>
+      </w:r>
+    </w:p>
+    <w:p>
+      <w:r>
+        <w:t>Point d'entrée courant des spécialistes. Après les 81 notes et les valeurs, il reçoit :</w:t>
+      </w:r>
+    </w:p>
+    <w:p>
+      <w:pPr>
+        <w:pStyle w:val="ListNumber"/>
+        <w:ind w:left="520" w:hanging="280"/>
+        <w:spacing w:after="70"/>
+      </w:pPr>
+      <w:r>
+        <w:rPr>
+          <w:b/>
+          <w:color w:val="0B6B70"/>
+        </w:rPr>
+        <w:t xml:space="preserve">1. </w:t>
+      </w:r>
+      <w:r>
+        <w:t>la spécialité actuelle ;</w:t>
+      </w:r>
+    </w:p>
+    <w:p>
+      <w:pPr>
+        <w:pStyle w:val="ListNumber"/>
+        <w:ind w:left="520" w:hanging="280"/>
+        <w:spacing w:after="70"/>
+      </w:pPr>
+      <w:r>
+        <w:rPr>
+          <w:b/>
+          <w:color w:val="0B6B70"/>
+        </w:rPr>
+        <w:t xml:space="preserve">2. </w:t>
+      </w:r>
+      <w:r>
+        <w:t>la manière dont le spécialiste voit aujourd'hui sa spécialité ;</w:t>
+      </w:r>
+    </w:p>
+    <w:p>
+      <w:pPr>
+        <w:pStyle w:val="ListNumber"/>
+        <w:ind w:left="520" w:hanging="280"/>
+        <w:spacing w:after="70"/>
+      </w:pPr>
+      <w:r>
+        <w:rPr>
+          <w:b/>
+          <w:color w:val="0B6B70"/>
+        </w:rPr>
+        <w:t xml:space="preserve">3. </w:t>
+      </w:r>
+      <w:r>
+        <w:t>ce qui a changé au fil des années ;</w:t>
+      </w:r>
+    </w:p>
+    <w:p>
+      <w:pPr>
+        <w:pStyle w:val="ListNumber"/>
+        <w:ind w:left="520" w:hanging="280"/>
+        <w:spacing w:after="70"/>
+      </w:pPr>
+      <w:r>
+        <w:rPr>
+          <w:b/>
+          <w:color w:val="0B6B70"/>
+        </w:rPr>
+        <w:t xml:space="preserve">4. </w:t>
+      </w:r>
+      <w:r>
+        <w:t>la qualité la plus importante pour cette spécialité ;</w:t>
+      </w:r>
+    </w:p>
+    <w:p>
+      <w:pPr>
+        <w:pStyle w:val="ListNumber"/>
+        <w:ind w:left="520" w:hanging="280"/>
+        <w:spacing w:after="70"/>
+      </w:pPr>
+      <w:r>
+        <w:rPr>
+          <w:b/>
+          <w:color w:val="0B6B70"/>
+        </w:rPr>
+        <w:t xml:space="preserve">5. </w:t>
+      </w:r>
+      <w:r>
+        <w:t xml:space="preserve">le choix </w:t>
+      </w:r>
+      <w:r>
+        <w:rPr>
+          <w:rFonts w:ascii="Consolas" w:hAnsi="Consolas"/>
+          <w:shd w:fill="EEF2F4"/>
+        </w:rPr>
+        <w:t>yes</w:t>
+      </w:r>
+      <w:r>
+        <w:t xml:space="preserve"> ou </w:t>
+      </w:r>
+      <w:r>
+        <w:rPr>
+          <w:rFonts w:ascii="Consolas" w:hAnsi="Consolas"/>
+          <w:shd w:fill="EEF2F4"/>
+        </w:rPr>
+        <w:t>no</w:t>
+      </w:r>
+      <w:r>
+        <w:t xml:space="preserve"> de refaire la même spécialité, avec une justification obligatoire seulement pour </w:t>
+      </w:r>
+      <w:r>
+        <w:rPr>
+          <w:rFonts w:ascii="Consolas" w:hAnsi="Consolas"/>
+          <w:shd w:fill="EEF2F4"/>
+        </w:rPr>
+        <w:t>no</w:t>
+      </w:r>
+      <w:r>
+        <w:t xml:space="preserve"> ;</w:t>
+      </w:r>
+    </w:p>
+    <w:p>
+      <w:pPr>
+        <w:pStyle w:val="ListNumber"/>
+        <w:ind w:left="520" w:hanging="280"/>
+        <w:spacing w:after="70"/>
+      </w:pPr>
+      <w:r>
+        <w:rPr>
+          <w:b/>
+          <w:color w:val="0B6B70"/>
+        </w:rPr>
+        <w:t xml:space="preserve">6. </w:t>
+      </w:r>
+      <w:r>
+        <w:t>la question qu'un étudiant devrait se poser avant de choisir cette spécialité.</w:t>
+      </w:r>
+    </w:p>
+    <w:p>
+      <w:r>
+        <w:t xml:space="preserve">La fonction normalise les espaces périphériques, vérifie les longueurs et le caractère conditionnel de la justification, exige </w:t>
+      </w:r>
+      <w:r>
+        <w:rPr>
+          <w:rFonts w:ascii="Consolas" w:hAnsi="Consolas"/>
+          <w:shd w:fill="EEF2F4"/>
+        </w:rPr>
+        <w:t>calibration-v2-qualitative</w:t>
+      </w:r>
+      <w:r>
+        <w:t xml:space="preserve">, </w:t>
+      </w:r>
+      <w:r>
+        <w:rPr>
+          <w:rFonts w:ascii="Consolas" w:hAnsi="Consolas"/>
+          <w:shd w:fill="EEF2F4"/>
+        </w:rPr>
+        <w:t>research-consent-2026-09-04</w:t>
+      </w:r>
+      <w:r>
+        <w:t xml:space="preserve"> et une provenance publiée, puis écrit une ligne de schéma 2. Les anciens champs d'expérience, satisfaction, intention de changement et caractère volontaire sont volontairement écrits à </w:t>
+      </w:r>
+      <w:r>
+        <w:rPr>
+          <w:rFonts w:ascii="Consolas" w:hAnsi="Consolas"/>
+          <w:shd w:fill="EEF2F4"/>
+        </w:rPr>
+        <w:t>NULL</w:t>
+      </w:r>
+      <w:r>
+        <w:t>.</w:t>
+      </w:r>
+    </w:p>
+    <w:p>
+      <w:r>
+        <w:t xml:space="preserve">Les façades </w:t>
+      </w:r>
+      <w:r>
+        <w:rPr>
+          <w:rFonts w:ascii="Consolas" w:hAnsi="Consolas"/>
+          <w:shd w:fill="EEF2F4"/>
+        </w:rPr>
+        <w:t>public.*_v3</w:t>
+      </w:r>
+      <w:r>
+        <w:t xml:space="preserve"> sont exécutables par </w:t>
+      </w:r>
+      <w:r>
+        <w:rPr>
+          <w:rFonts w:ascii="Consolas" w:hAnsi="Consolas"/>
+          <w:shd w:fill="EEF2F4"/>
+        </w:rPr>
+        <w:t>anon</w:t>
+      </w:r>
+      <w:r>
+        <w:t xml:space="preserve"> et </w:t>
+      </w:r>
+      <w:r>
+        <w:rPr>
+          <w:rFonts w:ascii="Consolas" w:hAnsi="Consolas"/>
+          <w:shd w:fill="EEF2F4"/>
+        </w:rPr>
+        <w:t>authenticated</w:t>
+      </w:r>
+      <w:r>
+        <w:t xml:space="preserve">. Elles délèguent aux implémentations </w:t>
+      </w:r>
+      <w:r>
+        <w:rPr>
+          <w:rFonts w:ascii="Consolas" w:hAnsi="Consolas"/>
+          <w:shd w:fill="EEF2F4"/>
+        </w:rPr>
+        <w:t>private.*_v3</w:t>
+      </w:r>
+      <w:r>
+        <w:t>, auxquelles ces rôles n'ont aucun droit direct.</w:t>
+      </w:r>
+    </w:p>
+    <w:p>
+      <w:pPr>
+        <w:pStyle w:val="Heading2"/>
+      </w:pPr>
+      <w:r>
+        <w:t>6.5 Consultation et export des réponses qualitatives</w:t>
+      </w:r>
+    </w:p>
+    <w:p>
+      <w:r>
+        <w:t>Les comptes allowlistés disposant du droit de recherche peuvent :</w:t>
+      </w:r>
+    </w:p>
+    <w:p>
+      <w:pPr>
+        <w:pStyle w:val="ListBullet"/>
+        <w:ind w:left="520" w:hanging="280"/>
+        <w:spacing w:after="70"/>
+      </w:pPr>
+      <w:r>
+        <w:rPr>
+          <w:b/>
+          <w:color w:val="0B6B70"/>
+        </w:rPr>
+        <w:t xml:space="preserve">• </w:t>
+      </w:r>
+      <w:r>
+        <w:t>filtrer les spécialistes selon la complétude de l'entretien qualitatif ;</w:t>
+      </w:r>
+    </w:p>
+    <w:p>
+      <w:pPr>
+        <w:pStyle w:val="ListBullet"/>
+        <w:ind w:left="520" w:hanging="280"/>
+        <w:spacing w:after="70"/>
+      </w:pPr>
+      <w:r>
+        <w:rPr>
+          <w:b/>
+          <w:color w:val="0B6B70"/>
+        </w:rPr>
+        <w:t xml:space="preserve">• </w:t>
+      </w:r>
+      <w:r>
+        <w:t>prévisualiser la réponse sur la perception actuelle dans la liste ;</w:t>
+      </w:r>
+    </w:p>
+    <w:p>
+      <w:pPr>
+        <w:pStyle w:val="ListBullet"/>
+        <w:ind w:left="520" w:hanging="280"/>
+        <w:spacing w:after="70"/>
+      </w:pPr>
+      <w:r>
+        <w:rPr>
+          <w:b/>
+          <w:color w:val="0B6B70"/>
+        </w:rPr>
+        <w:t xml:space="preserve">• </w:t>
+      </w:r>
+      <w:r>
+        <w:t>ouvrir le détail d'une réponse et lire les cinq réponses dans leur intégralité ;</w:t>
+      </w:r>
+    </w:p>
+    <w:p>
+      <w:pPr>
+        <w:pStyle w:val="ListBullet"/>
+        <w:ind w:left="520" w:hanging="280"/>
+        <w:spacing w:after="70"/>
+      </w:pPr>
+      <w:r>
+        <w:rPr>
+          <w:b/>
+          <w:color w:val="0B6B70"/>
+        </w:rPr>
+        <w:t xml:space="preserve">• </w:t>
+      </w:r>
+      <w:r>
+        <w:t>exporter les colonnes qualitatives en JSON ou dans les CSV large, long et analytique ;</w:t>
+      </w:r>
+    </w:p>
+    <w:p>
+      <w:pPr>
+        <w:pStyle w:val="ListBullet"/>
+        <w:ind w:left="520" w:hanging="280"/>
+        <w:spacing w:after="70"/>
+      </w:pPr>
+      <w:r>
+        <w:rPr>
+          <w:b/>
+          <w:color w:val="0B6B70"/>
+        </w:rPr>
+        <w:t xml:space="preserve">• </w:t>
+      </w:r>
+      <w:r>
+        <w:t>consulter séparément les anciens champs pour les lignes antérieures au schéma 2.</w:t>
+      </w:r>
+    </w:p>
+    <w:p>
+      <w:r>
+        <w:t>La recherche, la pagination et l'export passent par les politiques RLS existantes. Les cellules CSV commençant comme une formule de tableur sont préfixées afin de limiter l'injection de formules lors de l'ouverture dans Excel ou un logiciel équivalent.</w:t>
       </w:r>
     </w:p>
     <w:p>
@@ -7257,7 +8329,7 @@
               <w:spacing w:after="0"/>
             </w:pPr>
             <w:r>
-              <w:t>Soumettre une réponse v1/v2</w:t>
+              <w:t>Soumettre une réponse v1/v2/v3</w:t>
             </w:r>
           </w:p>
         </w:tc>
@@ -7429,7 +8501,7 @@
               <w:spacing w:after="0"/>
             </w:pPr>
             <w:r>
-              <w:t>Lire le brouillon</w:t>
+              <w:t>Lire/exporter les verbatims spécialistes</w:t>
             </w:r>
           </w:p>
         </w:tc>
@@ -7471,7 +8543,7 @@
               <w:spacing w:after="0"/>
             </w:pPr>
             <w:r>
-              <w:t>Non</w:t>
+              <w:t>Oui</w:t>
             </w:r>
           </w:p>
         </w:tc>
@@ -7515,7 +8587,7 @@
               <w:spacing w:after="0"/>
             </w:pPr>
             <w:r>
-              <w:t>Modifier le brouillon</w:t>
+              <w:t>Lire le brouillon</w:t>
             </w:r>
           </w:p>
         </w:tc>
@@ -7601,7 +8673,7 @@
               <w:spacing w:after="0"/>
             </w:pPr>
             <w:r>
-              <w:t>Consulter l’historique éditorial</w:t>
+              <w:t>Modifier le brouillon</w:t>
             </w:r>
           </w:p>
         </w:tc>
@@ -7687,7 +8759,7 @@
               <w:spacing w:after="0"/>
             </w:pPr>
             <w:r>
-              <w:t>Publier une version</w:t>
+              <w:t>Consulter l’historique éditorial</w:t>
             </w:r>
           </w:p>
         </w:tc>
@@ -7743,7 +8815,7 @@
               <w:spacing w:after="0"/>
             </w:pPr>
             <w:r>
-              <w:t>Non</w:t>
+              <w:t>Oui</w:t>
             </w:r>
           </w:p>
         </w:tc>
@@ -7773,7 +8845,7 @@
               <w:spacing w:after="0"/>
             </w:pPr>
             <w:r>
-              <w:t>Demander une restauration</w:t>
+              <w:t>Publier une version</w:t>
             </w:r>
           </w:p>
         </w:tc>
@@ -7859,7 +8931,7 @@
               <w:spacing w:after="0"/>
             </w:pPr>
             <w:r>
-              <w:t>Écrire directement dans les tables privées</w:t>
+              <w:t>Demander une restauration</w:t>
             </w:r>
           </w:p>
         </w:tc>
@@ -7929,7 +9001,7 @@
               <w:spacing w:after="0"/>
             </w:pPr>
             <w:r>
-              <w:t>Non</w:t>
+              <w:t>Oui</w:t>
             </w:r>
           </w:p>
         </w:tc>
@@ -7945,13 +9017,99 @@
               <w:spacing w:after="0"/>
             </w:pPr>
             <w:r>
+              <w:t>Écrire directement dans les tables privées</w:t>
+            </w:r>
+          </w:p>
+        </w:tc>
+        <w:tc>
+          <w:tcPr>
+            <w:shd w:fill="F5F8F8"/>
+          </w:tcPr>
+          <w:p>
+            <w:pPr>
+              <w:pStyle w:val="TableText"/>
+              <w:spacing w:after="0"/>
+            </w:pPr>
+            <w:r>
+              <w:t>Non</w:t>
+            </w:r>
+          </w:p>
+        </w:tc>
+        <w:tc>
+          <w:tcPr>
+            <w:shd w:fill="F5F8F8"/>
+          </w:tcPr>
+          <w:p>
+            <w:pPr>
+              <w:pStyle w:val="TableText"/>
+              <w:spacing w:after="0"/>
+            </w:pPr>
+            <w:r>
+              <w:t>Non</w:t>
+            </w:r>
+          </w:p>
+        </w:tc>
+        <w:tc>
+          <w:tcPr>
+            <w:shd w:fill="F5F8F8"/>
+          </w:tcPr>
+          <w:p>
+            <w:pPr>
+              <w:pStyle w:val="TableText"/>
+              <w:spacing w:after="0"/>
+            </w:pPr>
+            <w:r>
+              <w:t>Non</w:t>
+            </w:r>
+          </w:p>
+        </w:tc>
+        <w:tc>
+          <w:tcPr>
+            <w:shd w:fill="F5F8F8"/>
+          </w:tcPr>
+          <w:p>
+            <w:pPr>
+              <w:pStyle w:val="TableText"/>
+              <w:spacing w:after="0"/>
+            </w:pPr>
+            <w:r>
+              <w:t>Non</w:t>
+            </w:r>
+          </w:p>
+        </w:tc>
+        <w:tc>
+          <w:tcPr>
+            <w:shd w:fill="F5F8F8"/>
+          </w:tcPr>
+          <w:p>
+            <w:pPr>
+              <w:pStyle w:val="TableText"/>
+              <w:spacing w:after="0"/>
+            </w:pPr>
+            <w:r>
+              <w:t>Non</w:t>
+            </w:r>
+          </w:p>
+        </w:tc>
+      </w:tr>
+      <w:tr>
+        <w:tc>
+          <w:tcPr>
+            <w:shd w:fill="FFFFFF"/>
+          </w:tcPr>
+          <w:p>
+            <w:pPr>
+              <w:pStyle w:val="TableText"/>
+              <w:spacing w:after="0"/>
+            </w:pPr>
+            <w:r>
               <w:t>Modifier/supprimer directement les réponses</w:t>
             </w:r>
           </w:p>
         </w:tc>
         <w:tc>
           <w:tcPr>
-            <w:shd w:fill="F5F8F8"/>
+            <w:shd w:fill="FFFFFF"/>
           </w:tcPr>
           <w:p>
             <w:pPr>
@@ -7965,7 +9123,7 @@
         </w:tc>
         <w:tc>
           <w:tcPr>
-            <w:shd w:fill="F5F8F8"/>
+            <w:shd w:fill="FFFFFF"/>
           </w:tcPr>
           <w:p>
             <w:pPr>
@@ -7979,7 +9137,7 @@
         </w:tc>
         <w:tc>
           <w:tcPr>
-            <w:shd w:fill="F5F8F8"/>
+            <w:shd w:fill="FFFFFF"/>
           </w:tcPr>
           <w:p>
             <w:pPr>
@@ -7993,7 +9151,7 @@
         </w:tc>
         <w:tc>
           <w:tcPr>
-            <w:shd w:fill="F5F8F8"/>
+            <w:shd w:fill="FFFFFF"/>
           </w:tcPr>
           <w:p>
             <w:pPr>
@@ -8007,7 +9165,7 @@
         </w:tc>
         <w:tc>
           <w:tcPr>
-            <w:shd w:fill="F5F8F8"/>
+            <w:shd w:fill="FFFFFF"/>
           </w:tcPr>
           <w:p>
             <w:pPr>
@@ -8811,7 +9969,83 @@
     </w:p>
     <w:p>
       <w:r>
-        <w:t>Pour les lignes v1 courantes, la base contrôle notamment :</w:t>
+        <w:t>Les contraintes de table distinguent trois générations sans réinterpréter les anciennes lignes :</w:t>
+      </w:r>
+    </w:p>
+    <w:p>
+      <w:pPr>
+        <w:pStyle w:val="ListBullet"/>
+        <w:ind w:left="520" w:hanging="280"/>
+        <w:spacing w:after="70"/>
+      </w:pPr>
+      <w:r>
+        <w:rPr>
+          <w:b/>
+          <w:color w:val="0B6B70"/>
+        </w:rPr>
+        <w:t xml:space="preserve">• </w:t>
+      </w:r>
+      <w:r>
+        <w:t>le schéma 0 reste lisible comme legacy ;</w:t>
+      </w:r>
+    </w:p>
+    <w:p>
+      <w:pPr>
+        <w:pStyle w:val="ListBullet"/>
+        <w:ind w:left="520" w:hanging="280"/>
+        <w:spacing w:after="70"/>
+      </w:pPr>
+      <w:r>
+        <w:rPr>
+          <w:b/>
+          <w:color w:val="0B6B70"/>
+        </w:rPr>
+        <w:t xml:space="preserve">• </w:t>
+      </w:r>
+      <w:r>
+        <w:t xml:space="preserve">le schéma 1 conserve exactement </w:t>
+      </w:r>
+      <w:r>
+        <w:rPr>
+          <w:rFonts w:ascii="Consolas" w:hAnsi="Consolas"/>
+          <w:shd w:fill="EEF2F4"/>
+        </w:rPr>
+        <w:t>client-scoring-v1</w:t>
+      </w:r>
+      <w:r>
+        <w:t xml:space="preserve"> ou </w:t>
+      </w:r>
+      <w:r>
+        <w:rPr>
+          <w:rFonts w:ascii="Consolas" w:hAnsi="Consolas"/>
+          <w:shd w:fill="EEF2F4"/>
+        </w:rPr>
+        <w:t>calibration-v1</w:t>
+      </w:r>
+      <w:r>
+        <w:t xml:space="preserve"> et le consentement du 26 août 2026 ;</w:t>
+      </w:r>
+    </w:p>
+    <w:p>
+      <w:pPr>
+        <w:pStyle w:val="ListBullet"/>
+        <w:ind w:left="520" w:hanging="280"/>
+        <w:spacing w:after="70"/>
+      </w:pPr>
+      <w:r>
+        <w:rPr>
+          <w:b/>
+          <w:color w:val="0B6B70"/>
+        </w:rPr>
+        <w:t xml:space="preserve">• </w:t>
+      </w:r>
+      <w:r>
+        <w:t>le schéma 2 exige les versions courantes, les deux colonnes de provenance et les nouvelles règles qualitatives.</w:t>
+      </w:r>
+    </w:p>
+    <w:p>
+      <w:r>
+        <w:t>Pour le schéma 2, la base contrôle notamment :</w:t>
       </w:r>
     </w:p>
     <w:p>
@@ -8943,29 +10177,161 @@
         <w:t xml:space="preserve">• </w:t>
       </w:r>
       <w:r>
-        <w:t>les versions exactes du questionnaire, des catalogues, du scoring/calibrage et du consentement ;</w:t>
-      </w:r>
-    </w:p>
-    <w:p>
-      <w:pPr>
-        <w:pStyle w:val="ListBullet"/>
-        <w:ind w:left="520" w:hanging="280"/>
-        <w:spacing w:after="70"/>
-      </w:pPr>
-      <w:r>
-        <w:rPr>
-          <w:b/>
-          <w:color w:val="0B6B70"/>
-        </w:rPr>
-        <w:t xml:space="preserve">• </w:t>
-      </w:r>
-      <w:r>
-        <w:t>la structure des scores clients étudiants.</w:t>
-      </w:r>
-    </w:p>
-    <w:p>
-      <w:r>
-        <w:t>Les lignes historiques v0 sont conservées et identifiées comme legacy ; elles ne doivent pas être confondues avec une réponse éligible au protocole courant.</w:t>
+        <w:t>les versions exactes du questionnaire, des catalogues, du scoring ou du calibrage et du consentement ;</w:t>
+      </w:r>
+    </w:p>
+    <w:p>
+      <w:pPr>
+        <w:pStyle w:val="ListBullet"/>
+        <w:ind w:left="520" w:hanging="280"/>
+        <w:spacing w:after="70"/>
+      </w:pPr>
+      <w:r>
+        <w:rPr>
+          <w:b/>
+          <w:color w:val="0B6B70"/>
+        </w:rPr>
+        <w:t xml:space="preserve">• </w:t>
+      </w:r>
+      <w:r>
+        <w:t>la structure des scores clients étudiants ;</w:t>
+      </w:r>
+    </w:p>
+    <w:p>
+      <w:pPr>
+        <w:pStyle w:val="ListBullet"/>
+        <w:ind w:left="520" w:hanging="280"/>
+        <w:spacing w:after="70"/>
+      </w:pPr>
+      <w:r>
+        <w:rPr>
+          <w:b/>
+          <w:color w:val="0B6B70"/>
+        </w:rPr>
+        <w:t xml:space="preserve">• </w:t>
+      </w:r>
+      <w:r>
+        <w:t>l'existence de l'instantané publié référencé et la cohérence UUID/révision ;</w:t>
+      </w:r>
+    </w:p>
+    <w:p>
+      <w:pPr>
+        <w:pStyle w:val="ListBullet"/>
+        <w:ind w:left="520" w:hanging="280"/>
+        <w:spacing w:after="70"/>
+      </w:pPr>
+      <w:r>
+        <w:rPr>
+          <w:b/>
+          <w:color w:val="0B6B70"/>
+        </w:rPr>
+        <w:t xml:space="preserve">• </w:t>
+      </w:r>
+      <w:r>
+        <w:t>quatre textes spécialistes obligatoires, non vides après normalisation et dans leurs longueurs maximales ;</w:t>
+      </w:r>
+    </w:p>
+    <w:p>
+      <w:pPr>
+        <w:pStyle w:val="ListBullet"/>
+        <w:ind w:left="520" w:hanging="280"/>
+        <w:spacing w:after="70"/>
+      </w:pPr>
+      <w:r>
+        <w:rPr>
+          <w:b/>
+          <w:color w:val="0B6B70"/>
+        </w:rPr>
+        <w:t xml:space="preserve">• </w:t>
+      </w:r>
+      <w:r>
+        <w:rPr>
+          <w:rFonts w:ascii="Consolas" w:hAnsi="Consolas"/>
+          <w:shd w:fill="EEF2F4"/>
+        </w:rPr>
+        <w:t>would_choose_again_code</w:t>
+      </w:r>
+      <w:r>
+        <w:t xml:space="preserve"> limité à </w:t>
+      </w:r>
+      <w:r>
+        <w:rPr>
+          <w:rFonts w:ascii="Consolas" w:hAnsi="Consolas"/>
+          <w:shd w:fill="EEF2F4"/>
+        </w:rPr>
+        <w:t>yes</w:t>
+      </w:r>
+      <w:r>
+        <w:t xml:space="preserve"> ou </w:t>
+      </w:r>
+      <w:r>
+        <w:rPr>
+          <w:rFonts w:ascii="Consolas" w:hAnsi="Consolas"/>
+          <w:shd w:fill="EEF2F4"/>
+        </w:rPr>
+        <w:t>no</w:t>
+      </w:r>
+      <w:r>
+        <w:t xml:space="preserve"> ;</w:t>
+      </w:r>
+    </w:p>
+    <w:p>
+      <w:pPr>
+        <w:pStyle w:val="ListBullet"/>
+        <w:ind w:left="520" w:hanging="280"/>
+        <w:spacing w:after="70"/>
+      </w:pPr>
+      <w:r>
+        <w:rPr>
+          <w:b/>
+          <w:color w:val="0B6B70"/>
+        </w:rPr>
+        <w:t xml:space="preserve">• </w:t>
+      </w:r>
+      <w:r>
+        <w:t xml:space="preserve">la présence d'une justification uniquement lorsque le choix vaut </w:t>
+      </w:r>
+      <w:r>
+        <w:rPr>
+          <w:rFonts w:ascii="Consolas" w:hAnsi="Consolas"/>
+          <w:shd w:fill="EEF2F4"/>
+        </w:rPr>
+        <w:t>no</w:t>
+      </w:r>
+      <w:r>
+        <w:t xml:space="preserve"> ;</w:t>
+      </w:r>
+    </w:p>
+    <w:p>
+      <w:pPr>
+        <w:pStyle w:val="ListBullet"/>
+        <w:ind w:left="520" w:hanging="280"/>
+        <w:spacing w:after="70"/>
+      </w:pPr>
+      <w:r>
+        <w:rPr>
+          <w:b/>
+          <w:color w:val="0B6B70"/>
+        </w:rPr>
+        <w:t xml:space="preserve">• </w:t>
+      </w:r>
+      <w:r>
+        <w:t>la nullité des anciens champs structurés dans toute nouvelle réponse spécialiste.</w:t>
+      </w:r>
+    </w:p>
+    <w:p>
+      <w:r>
+        <w:t xml:space="preserve">Les contrôles existent à la fois dans les RPC et dans des contraintes </w:t>
+      </w:r>
+      <w:r>
+        <w:rPr>
+          <w:rFonts w:ascii="Consolas" w:hAnsi="Consolas"/>
+          <w:shd w:fill="EEF2F4"/>
+        </w:rPr>
+        <w:t>CHECK</w:t>
+      </w:r>
+      <w:r>
+        <w:t>, afin qu'une erreur interne ne puisse pas créer silencieusement une ligne de schéma 2 incohérente. Les lignes historiques restent consultables et exportables, mais le dashboard les signale comme incompatibles avec les indicateurs du protocole courant.</w:t>
       </w:r>
     </w:p>
     <w:p>
@@ -9119,7 +10485,7 @@
     </w:p>
     <w:p>
       <w:r>
-        <w:t>Les RPC v2 enregistrent les deux derniers champs de provenance dans la ligne de réponse. Cela permet de retrouver l’instantané exact même après plusieurs publications.</w:t>
+        <w:t>Les RPC v2 et v3 enregistrent les deux derniers champs de provenance dans la ligne de réponse. Les RPC v3 les rendent obligatoires pour le schéma 2. Cela permet de retrouver l'instantané exact même après plusieurs publications et d'éviter d'analyser une réponse avec un catalogue différent de celui réellement utilisé.</w:t>
       </w:r>
     </w:p>
     <w:p>
@@ -9174,41 +10540,41 @@
     </w:p>
     <w:p>
       <w:r>
-        <w:t>Les fonctions v1 restent disponibles pour la compatibilité et certaines lignes peuvent ne pas avoir une provenance dynamique complète. Le dashboard doit distinguer :</w:t>
-      </w:r>
-    </w:p>
-    <w:p>
-      <w:pPr>
-        <w:pStyle w:val="ListBullet"/>
-        <w:ind w:left="520" w:hanging="280"/>
-        <w:spacing w:after="70"/>
-      </w:pPr>
-      <w:r>
-        <w:rPr>
-          <w:b/>
-          <w:color w:val="0B6B70"/>
-        </w:rPr>
-        <w:t xml:space="preserve">• </w:t>
-      </w:r>
-      <w:r>
-        <w:t>données courantes et reproductibles ;</w:t>
-      </w:r>
-    </w:p>
-    <w:p>
-      <w:pPr>
-        <w:pStyle w:val="ListBullet"/>
-        <w:ind w:left="520" w:hanging="280"/>
-        <w:spacing w:after="70"/>
-      </w:pPr>
-      <w:r>
-        <w:rPr>
-          <w:b/>
-          <w:color w:val="0B6B70"/>
-        </w:rPr>
-        <w:t xml:space="preserve">• </w:t>
-      </w:r>
-      <w:r>
-        <w:t>données legacy consultables ;</w:t>
+        <w:t>Les fonctions v1 et v2 restent disponibles pour la compatibilité et certaines lignes anciennes peuvent ne pas avoir une provenance dynamique complète. Le dashboard distingue :</w:t>
+      </w:r>
+    </w:p>
+    <w:p>
+      <w:pPr>
+        <w:pStyle w:val="ListBullet"/>
+        <w:ind w:left="520" w:hanging="280"/>
+        <w:spacing w:after="70"/>
+      </w:pPr>
+      <w:r>
+        <w:rPr>
+          <w:b/>
+          <w:color w:val="0B6B70"/>
+        </w:rPr>
+        <w:t xml:space="preserve">• </w:t>
+      </w:r>
+      <w:r>
+        <w:t>données de schéma 2 courantes et reproductibles ;</w:t>
+      </w:r>
+    </w:p>
+    <w:p>
+      <w:pPr>
+        <w:pStyle w:val="ListBullet"/>
+        <w:ind w:left="520" w:hanging="280"/>
+        <w:spacing w:after="70"/>
+      </w:pPr>
+      <w:r>
+        <w:rPr>
+          <w:b/>
+          <w:color w:val="0B6B70"/>
+        </w:rPr>
+        <w:t xml:space="preserve">• </w:t>
+      </w:r>
+      <w:r>
+        <w:t>données de schéma 0 ou 1 consultables et exportables comme legacy ;</w:t>
       </w:r>
     </w:p>
     <w:p>
@@ -9288,7 +10654,32 @@
     </w:p>
     <w:p>
       <w:r>
-        <w:t>Ce trait n’est créé que lorsqu’un participant sélectionne la valeur « Manual/hands-on activity ». Il n’est donc pas mesuré pour toute la cohorte. Si une spécialité utilise ce trait, les participants qui ne sélectionnent pas cette valeur ne disposent pas d’une mesure comparable issue du questionnaire.</w:t>
+        <w:t xml:space="preserve">Ce trait n'est créé que lorsqu'un participant sélectionne la valeur « Manual/hands-on activity ». Dans </w:t>
+      </w:r>
+      <w:r>
+        <w:rPr>
+          <w:rFonts w:ascii="Consolas" w:hAnsi="Consolas"/>
+          <w:shd w:fill="EEF2F4"/>
+        </w:rPr>
+        <w:t>client-scoring-v2</w:t>
+      </w:r>
+      <w:r>
+        <w:t>, cette sélection produit un signal explicite de 90/100. Elle ne part plus d'une pseudo-valeur neutre de 50 susceptible de pénaliser paradoxalement les spécialités manuelles. Pour les traits déjà mesurés par les 81 réponses, les valeurs de carrière ne changent plus le niveau du trait : elles augmentent seulement son importance dans la comparaison avec les spécialités.</w:t>
+      </w:r>
+    </w:p>
+    <w:p>
+      <w:r>
+        <w:t xml:space="preserve">Cette correction supprime un défaut directionnel du moteur précédent, mais elle ne transforme pas </w:t>
+      </w:r>
+      <w:r>
+        <w:rPr>
+          <w:rFonts w:ascii="Consolas" w:hAnsi="Consolas"/>
+          <w:shd w:fill="EEF2F4"/>
+        </w:rPr>
+        <w:t>manual_orientation</w:t>
+      </w:r>
+      <w:r>
+        <w:t xml:space="preserve"> en mesure de questionnaire. Les participants qui ne sélectionnent pas cette valeur ne disposent toujours pas d'une mesure comparable de ce trait.</w:t>
       </w:r>
     </w:p>
     <w:p>
@@ -9502,7 +10893,45 @@
         <w:pStyle w:val="Heading2"/>
       </w:pPr>
       <w:r>
-        <w:t>11.3 Interprétation des Top-k</w:t>
+        <w:t>11.3 Dimensions non observées et portée du score</w:t>
+      </w:r>
+    </w:p>
+    <w:p>
+      <w:r>
+        <w:t xml:space="preserve">Lorsqu'un profil de spécialité ne contient aucun trait d'une dimension, </w:t>
+      </w:r>
+      <w:r>
+        <w:rPr>
+          <w:rFonts w:ascii="Consolas" w:hAnsi="Consolas"/>
+          <w:shd w:fill="EEF2F4"/>
+        </w:rPr>
+        <w:t>client-scoring-v2</w:t>
+      </w:r>
+      <w:r>
+        <w:t xml:space="preserve"> représente le sous-score comme non mesuré (</w:t>
+      </w:r>
+      <w:r>
+        <w:rPr>
+          <w:rFonts w:ascii="Consolas" w:hAnsi="Consolas"/>
+          <w:shd w:fill="EEF2F4"/>
+        </w:rPr>
+        <w:t>NULL</w:t>
+      </w:r>
+      <w:r>
+        <w:t xml:space="preserve"> dans le modèle applicatif, affiché par un tiret) et non comme 0 %. Cette distinction évite de présenter une absence de preuve comme une incompatibilité.</w:t>
+      </w:r>
+    </w:p>
+    <w:p>
+      <w:r>
+        <w:t>Le score global reste un indice de proximité interne au moteur et au catalogue versionnés. Il ne doit pas être interprété comme une probabilité de réussite, une certitude d'orientation ou une validation clinique. Les poids par défaut et les préférences sélectionnées doivent toujours accompagner un export analytique afin de rendre le calcul interprétable.</w:t>
+      </w:r>
+    </w:p>
+    <w:p>
+      <w:pPr>
+        <w:pStyle w:val="Heading2"/>
+      </w:pPr>
+      <w:r>
+        <w:t>11.4 Interprétation des Top-k</w:t>
       </w:r>
     </w:p>
     <w:p>
@@ -10136,6 +11565,23 @@
         <w:t xml:space="preserve">• </w:t>
       </w:r>
       <w:r>
+        <w:t>rejet d'un même UUID rejoué avec un payload ou une provenance différente ;</w:t>
+      </w:r>
+    </w:p>
+    <w:p>
+      <w:pPr>
+        <w:pStyle w:val="ListBullet"/>
+        <w:ind w:left="520" w:hanging="280"/>
+        <w:spacing w:after="70"/>
+      </w:pPr>
+      <w:r>
+        <w:rPr>
+          <w:b/>
+          <w:color w:val="0B6B70"/>
+        </w:rPr>
+        <w:t xml:space="preserve">• </w:t>
+      </w:r>
+      <w:r>
         <w:t>allowlist de recherche ;</w:t>
       </w:r>
     </w:p>
@@ -10406,7 +11852,7 @@
         <w:t xml:space="preserve">• </w:t>
       </w:r>
       <w:r>
-        <w:t>les appels v2 refusent une version non publiée ;</w:t>
+        <w:t>les appels v2 et v3 refusent une version non publiée ;</w:t>
       </w:r>
     </w:p>
     <w:p>
@@ -10440,7 +11886,193 @@
         <w:t xml:space="preserve">• </w:t>
       </w:r>
       <w:r>
-        <w:t>les fonctions v1 restent compatibles avec les données historiques.</w:t>
+        <w:t>les fonctions v1 et v2 restent compatibles avec les données historiques ;</w:t>
+      </w:r>
+    </w:p>
+    <w:p>
+      <w:pPr>
+        <w:pStyle w:val="ListBullet"/>
+        <w:ind w:left="520" w:hanging="280"/>
+        <w:spacing w:after="70"/>
+      </w:pPr>
+      <w:r>
+        <w:rPr>
+          <w:b/>
+          <w:color w:val="0B6B70"/>
+        </w:rPr>
+        <w:t xml:space="preserve">• </w:t>
+      </w:r>
+      <w:r>
+        <w:t>les soumissions v3 écrivent le schéma 2 et les versions scientifiques exactes ;</w:t>
+      </w:r>
+    </w:p>
+    <w:p>
+      <w:pPr>
+        <w:pStyle w:val="ListBullet"/>
+        <w:ind w:left="520" w:hanging="280"/>
+        <w:spacing w:after="70"/>
+      </w:pPr>
+      <w:r>
+        <w:rPr>
+          <w:b/>
+          <w:color w:val="0B6B70"/>
+        </w:rPr>
+        <w:t xml:space="preserve">• </w:t>
+      </w:r>
+      <w:r>
+        <w:t xml:space="preserve">les quatre textes permanents et, pour une réponse </w:t>
+      </w:r>
+      <w:r>
+        <w:rPr>
+          <w:rFonts w:ascii="Consolas" w:hAnsi="Consolas"/>
+          <w:shd w:fill="EEF2F4"/>
+        </w:rPr>
+        <w:t>no</w:t>
+      </w:r>
+      <w:r>
+        <w:t>, le texte conditionnel sont obligatoires selon leurs règles de longueur ;</w:t>
+      </w:r>
+    </w:p>
+    <w:p>
+      <w:pPr>
+        <w:pStyle w:val="ListBullet"/>
+        <w:ind w:left="520" w:hanging="280"/>
+        <w:spacing w:after="70"/>
+      </w:pPr>
+      <w:r>
+        <w:rPr>
+          <w:b/>
+          <w:color w:val="0B6B70"/>
+        </w:rPr>
+        <w:t xml:space="preserve">• </w:t>
+      </w:r>
+      <w:r>
+        <w:t xml:space="preserve">une réponse </w:t>
+      </w:r>
+      <w:r>
+        <w:rPr>
+          <w:rFonts w:ascii="Consolas" w:hAnsi="Consolas"/>
+          <w:shd w:fill="EEF2F4"/>
+        </w:rPr>
+        <w:t>no</w:t>
+      </w:r>
+      <w:r>
+        <w:t xml:space="preserve"> exige une raison et une réponse </w:t>
+      </w:r>
+      <w:r>
+        <w:rPr>
+          <w:rFonts w:ascii="Consolas" w:hAnsi="Consolas"/>
+          <w:shd w:fill="EEF2F4"/>
+        </w:rPr>
+        <w:t>yes</w:t>
+      </w:r>
+      <w:r>
+        <w:t xml:space="preserve"> interdit cette raison ;</w:t>
+      </w:r>
+    </w:p>
+    <w:p>
+      <w:pPr>
+        <w:pStyle w:val="ListBullet"/>
+        <w:ind w:left="520" w:hanging="280"/>
+        <w:spacing w:after="70"/>
+      </w:pPr>
+      <w:r>
+        <w:rPr>
+          <w:b/>
+          <w:color w:val="0B6B70"/>
+        </w:rPr>
+        <w:t xml:space="preserve">• </w:t>
+      </w:r>
+      <w:r>
+        <w:t xml:space="preserve">les champs structurés legacy restent </w:t>
+      </w:r>
+      <w:r>
+        <w:rPr>
+          <w:rFonts w:ascii="Consolas" w:hAnsi="Consolas"/>
+          <w:shd w:fill="EEF2F4"/>
+        </w:rPr>
+        <w:t>NULL</w:t>
+      </w:r>
+      <w:r>
+        <w:t xml:space="preserve"> dans le schéma 2 ;</w:t>
+      </w:r>
+    </w:p>
+    <w:p>
+      <w:pPr>
+        <w:pStyle w:val="ListBullet"/>
+        <w:ind w:left="520" w:hanging="280"/>
+        <w:spacing w:after="70"/>
+      </w:pPr>
+      <w:r>
+        <w:rPr>
+          <w:b/>
+          <w:color w:val="0B6B70"/>
+        </w:rPr>
+        <w:t xml:space="preserve">• </w:t>
+      </w:r>
+      <w:r>
+        <w:t xml:space="preserve">le nouvel instantané actif complète seulement les traits mesurés manquants, garde les cibles existantes et laisse </w:t>
+      </w:r>
+      <w:r>
+        <w:rPr>
+          <w:rFonts w:ascii="Consolas" w:hAnsi="Consolas"/>
+          <w:shd w:fill="EEF2F4"/>
+        </w:rPr>
+        <w:t>prevention_orientation</w:t>
+      </w:r>
+      <w:r>
+        <w:t xml:space="preserve"> inchangé ;</w:t>
+      </w:r>
+    </w:p>
+    <w:p>
+      <w:pPr>
+        <w:pStyle w:val="ListBullet"/>
+        <w:ind w:left="520" w:hanging="280"/>
+        <w:spacing w:after="70"/>
+      </w:pPr>
+      <w:r>
+        <w:rPr>
+          <w:b/>
+          <w:color w:val="0B6B70"/>
+        </w:rPr>
+        <w:t xml:space="preserve">• </w:t>
+      </w:r>
+      <w:r>
+        <w:t>les exports contiennent les verbatims, la provenance et neutralisent les préfixes de formule CSV ;</w:t>
+      </w:r>
+    </w:p>
+    <w:p>
+      <w:pPr>
+        <w:pStyle w:val="ListBullet"/>
+        <w:ind w:left="520" w:hanging="280"/>
+        <w:spacing w:after="70"/>
+      </w:pPr>
+      <w:r>
+        <w:rPr>
+          <w:b/>
+          <w:color w:val="0B6B70"/>
+        </w:rPr>
+        <w:t xml:space="preserve">• </w:t>
+      </w:r>
+      <w:r>
+        <w:t>la sélection d'une valeur manuelle ne peut plus diminuer le rang d'une spécialité manuelle ;</w:t>
+      </w:r>
+    </w:p>
+    <w:p>
+      <w:pPr>
+        <w:pStyle w:val="ListBullet"/>
+        <w:ind w:left="520" w:hanging="280"/>
+        <w:spacing w:after="70"/>
+      </w:pPr>
+      <w:r>
+        <w:rPr>
+          <w:b/>
+          <w:color w:val="0B6B70"/>
+        </w:rPr>
+        <w:t xml:space="preserve">• </w:t>
+      </w:r>
+      <w:r>
+        <w:t>un sous-score sans trait disponible reste non mesuré plutôt que 0 %.</w:t>
       </w:r>
     </w:p>
     <w:p>
@@ -10681,7 +12313,7 @@
         <w:t xml:space="preserve">6. </w:t>
       </w:r>
       <w:r>
-        <w:t>effectuer une soumission v2 synthétique et vérifier sa provenance ;</w:t>
+        <w:t>effectuer une soumission étudiante v3 et une soumission spécialiste v3 synthétiques, puis vérifier leur schéma, leurs versions, leurs réponses qualitatives et leur provenance ;</w:t>
       </w:r>
     </w:p>
     <w:p>
@@ -10993,7 +12625,12 @@
     </w:p>
     <w:p>
       <w:r>
-        <w:t>Le questionnaire ne crée pas de relation avec un compte participant, mais les journaux techniques de la plateforme peuvent contenir des métadonnées opérationnelles. La durée de conservation, les procédures de purge, les sauvegardes et les obligations réglementaires doivent être définies avec les responsables juridiques et scientifiques du projet.</w:t>
+        <w:t>Le questionnaire ne crée pas de relation avec un compte participant, mais les réponses qualitatives sont du texte libre : un participant pourrait malgré l'avertissement y saisir un nom, une coordonnée ou une information permettant d'identifier un patient. Ces verbatims doivent donc être traités comme des données de recherche potentiellement sensibles, avec accès restreint, exports maîtrisés et revue avant diffusion.</w:t>
+      </w:r>
+    </w:p>
+    <w:p>
+      <w:r>
+        <w:t>Les journaux techniques de la plateforme peuvent aussi contenir des métadonnées opérationnelles. La durée de conservation, les procédures de purge, les sauvegardes, la pseudonymisation des exports et les obligations réglementaires doivent être définies avec les responsables juridiques et scientifiques du projet.</w:t>
       </w:r>
     </w:p>
     <w:p>
@@ -11485,7 +13122,7 @@
         <w:rPr>
           <w:b/>
         </w:rPr>
-        <w:t>Référence de structure :</w:t>
+        <w:t>Références de structure :</w:t>
       </w:r>
       <w:r>
         <w:t xml:space="preserve"> </w:t>
@@ -11498,8 +13135,17 @@
         <w:t>supabase/migrations/20260831120000_specialist_admin_portal.sql</w:t>
       </w:r>
       <w:r>
-        <w:t xml:space="preserve"> </w:t>
-      </w:r>
+        <w:t xml:space="preserve"> et </w:t>
+      </w:r>
+      <w:r>
+        <w:rPr>
+          <w:rFonts w:ascii="Consolas" w:hAnsi="Consolas"/>
+          <w:shd w:fill="EEF2F4"/>
+        </w:rPr>
+        <w:t>supabase/migrations/20260904193000_accuracy_and_qualitative_specialist_v2.sql</w:t>
+      </w:r>
+    </w:p>
+    <w:p>
       <w:r>
         <w:rPr>
           <w:b/>

</xml_diff>

<commit_message>
Require participant role and limit study years
</commit_message>
<xml_diff>
--- a/docs/Q-Project-Structure-Base-de-donnees.docx
+++ b/docs/Q-Project-Structure-Base-de-donnees.docx
@@ -26,7 +26,7 @@
         <w:t>Version documentaire :</w:t>
       </w:r>
       <w:r>
-        <w:t xml:space="preserve"> 5 septembre 2026</w:t>
+        <w:t xml:space="preserve"> 6 septembre 2026</w:t>
       </w:r>
     </w:p>
     <w:p>
@@ -47,6 +47,16 @@
         <w:t>supabase/migrations/20260831120000_specialist_admin_portal.sql</w:t>
       </w:r>
       <w:r>
+        <w:t xml:space="preserve">, </w:t>
+      </w:r>
+      <w:r>
+        <w:rPr>
+          <w:rFonts w:ascii="Consolas" w:hAnsi="Consolas"/>
+          <w:shd w:fill="EEF2F4"/>
+        </w:rPr>
+        <w:t>supabase/migrations/20260904193000_accuracy_and_qualitative_specialist_v2.sql</w:t>
+      </w:r>
+      <w:r>
         <w:t xml:space="preserve"> et </w:t>
       </w:r>
       <w:r>
@@ -54,7 +64,7 @@
           <w:rFonts w:ascii="Consolas" w:hAnsi="Consolas"/>
           <w:shd w:fill="EEF2F4"/>
         </w:rPr>
-        <w:t>supabase/migrations/20260904193000_accuracy_and_qualitative_specialist_v2.sql</w:t>
+        <w:t>supabase/migrations/20260906090000_limit_student_study_year_to_six.sql</w:t>
       </w:r>
     </w:p>
     <w:p>
@@ -583,6 +593,23 @@
         <w:t xml:space="preserve">• </w:t>
       </w:r>
       <w:r>
+        <w:t>toute nouvelle réponse étudiante limite l’année d’études facultative aux années 1 à 6 ;</w:t>
+      </w:r>
+    </w:p>
+    <w:p>
+      <w:pPr>
+        <w:pStyle w:val="ListBullet"/>
+        <w:ind w:left="520" w:hanging="280"/>
+        <w:spacing w:after="70"/>
+      </w:pPr>
+      <w:r>
+        <w:rPr>
+          <w:b/>
+          <w:color w:val="0B6B70"/>
+        </w:rPr>
+        <w:t xml:space="preserve">• </w:t>
+      </w:r>
+      <w:r>
         <w:t>l'entretien spécialiste de schéma 2 collecte cinq réponses qualitatives après les 81 items, au lieu des anciens champs structurés d'expérience, satisfaction, intention de changement et caractère volontaire du choix ;</w:t>
       </w:r>
     </w:p>
@@ -652,7 +679,17 @@
         <w:t>prevention_orientation</w:t>
       </w:r>
       <w:r>
-        <w:t xml:space="preserve"> non mesuré. Les appels v2 restent utilisables pour l'historique ; les nouvelles collectes utilisent v3.</w:t>
+        <w:t xml:space="preserve"> non mesuré. La migration </w:t>
+      </w:r>
+      <w:r>
+        <w:rPr>
+          <w:rFonts w:ascii="Consolas" w:hAnsi="Consolas"/>
+          <w:shd w:fill="EEF2F4"/>
+        </w:rPr>
+        <w:t>20260906090000_limit_student_study_year_to_six.sql</w:t>
+      </w:r>
+      <w:r>
+        <w:t xml:space="preserve"> impose la plage 1–6 à toute nouvelle écriture étudiante, y compris via les anciennes RPC encore exécutables, sans réécrire les données historiques. Les appels v2 restent utilisables pour l'historique ; les nouvelles collectes utilisent v3.</w:t>
       </w:r>
     </w:p>
     <w:p>
@@ -5871,7 +5908,27 @@
               <w:spacing w:after="0"/>
             </w:pPr>
             <w:r>
-              <w:t>Métadonnées facultatives et langue.</w:t>
+              <w:t xml:space="preserve">Métadonnées facultatives et langue. Pour toute nouvelle réponse, </w:t>
+            </w:r>
+            <w:r>
+              <w:rPr>
+                <w:rFonts w:ascii="Consolas" w:hAnsi="Consolas"/>
+                <w:shd w:fill="EEF2F4"/>
+              </w:rPr>
+              <w:t>study_year</w:t>
+            </w:r>
+            <w:r>
+              <w:t xml:space="preserve"> vaut </w:t>
+            </w:r>
+            <w:r>
+              <w:rPr>
+                <w:rFonts w:ascii="Consolas" w:hAnsi="Consolas"/>
+                <w:shd w:fill="EEF2F4"/>
+              </w:rPr>
+              <w:t>NULL</w:t>
+            </w:r>
+            <w:r>
+              <w:t xml:space="preserve"> ou un entier de 1 à 6.</w:t>
             </w:r>
           </w:p>
         </w:tc>
@@ -6166,7 +6223,17 @@
         <w:t>private.specialty_catalog_versions</w:t>
       </w:r>
       <w:r>
-        <w:t>.</w:t>
+        <w:t xml:space="preserve">. La contrainte 1–6 est ajoutée en mode </w:t>
+      </w:r>
+      <w:r>
+        <w:rPr>
+          <w:rFonts w:ascii="Consolas" w:hAnsi="Consolas"/>
+          <w:shd w:fill="EEF2F4"/>
+        </w:rPr>
+        <w:t>NOT VALID</w:t>
+      </w:r>
+      <w:r>
+        <w:t xml:space="preserve"> : elle bloque les nouvelles valeurs hors plage, tandis que les éventuelles lignes historiques 7–12 restent intactes et auditables.</w:t>
       </w:r>
     </w:p>
     <w:p>
@@ -7707,7 +7774,7 @@
     </w:p>
     <w:p>
       <w:r>
-        <w:t xml:space="preserve">Point d'entrée courant des étudiants. Il conserve les 81 items et le catalogue de valeurs, impose </w:t>
+        <w:t xml:space="preserve">Point d'entrée courant des étudiants. Il conserve les 81 items et le catalogue de valeurs, accepte uniquement une année d’études facultative comprise entre 1 et 6, impose </w:t>
       </w:r>
       <w:r>
         <w:rPr>
@@ -10177,6 +10244,23 @@
         <w:t xml:space="preserve">• </w:t>
       </w:r>
       <w:r>
+        <w:t>une année d’études étudiante facultative limitée aux entiers de 1 à 6 pour toute nouvelle écriture ;</w:t>
+      </w:r>
+    </w:p>
+    <w:p>
+      <w:pPr>
+        <w:pStyle w:val="ListBullet"/>
+        <w:ind w:left="520" w:hanging="280"/>
+        <w:spacing w:after="70"/>
+      </w:pPr>
+      <w:r>
+        <w:rPr>
+          <w:b/>
+          <w:color w:val="0B6B70"/>
+        </w:rPr>
+        <w:t xml:space="preserve">• </w:t>
+      </w:r>
+      <w:r>
         <w:t>les versions exactes du questionnaire, des catalogues, du scoring ou du calibrage et du consentement ;</w:t>
       </w:r>
     </w:p>
@@ -13135,6 +13219,16 @@
         <w:t>supabase/migrations/20260831120000_specialist_admin_portal.sql</w:t>
       </w:r>
       <w:r>
+        <w:t xml:space="preserve">, </w:t>
+      </w:r>
+      <w:r>
+        <w:rPr>
+          <w:rFonts w:ascii="Consolas" w:hAnsi="Consolas"/>
+          <w:shd w:fill="EEF2F4"/>
+        </w:rPr>
+        <w:t>supabase/migrations/20260904193000_accuracy_and_qualitative_specialist_v2.sql</w:t>
+      </w:r>
+      <w:r>
         <w:t xml:space="preserve"> et </w:t>
       </w:r>
       <w:r>
@@ -13142,7 +13236,7 @@
           <w:rFonts w:ascii="Consolas" w:hAnsi="Consolas"/>
           <w:shd w:fill="EEF2F4"/>
         </w:rPr>
-        <w:t>supabase/migrations/20260904193000_accuracy_and_qualitative_specialist_v2.sql</w:t>
+        <w:t>supabase/migrations/20260906090000_limit_student_study_year_to_six.sql</w:t>
       </w:r>
     </w:p>
     <w:p>

</xml_diff>

<commit_message>
Add curious participant path
</commit_message>
<xml_diff>
--- a/docs/Q-Project-Structure-Base-de-donnees.docx
+++ b/docs/Q-Project-Structure-Base-de-donnees.docx
@@ -1139,6 +1139,43 @@
       </w:r>
       <w:r>
         <w:t>Pour un spécialiste, la spécialité réelle et les cinq réponses qualitatives ne sont demandées qu'après les 81 notes et le choix des valeurs, afin de réduire le biais d'ancrage pendant le questionnaire principal.</w:t>
+      </w:r>
+    </w:p>
+    <w:p>
+      <w:pPr>
+        <w:pStyle w:val="ListNumber"/>
+        <w:ind w:left="520" w:hanging="280"/>
+        <w:spacing w:after="70"/>
+      </w:pPr>
+      <w:r>
+        <w:rPr>
+          <w:b/>
+          <w:color w:val="0B6B70"/>
+        </w:rPr>
+        <w:t xml:space="preserve">7. </w:t>
+      </w:r>
+      <w:r>
+        <w:t xml:space="preserve">Le profil « découverte de la médecine » calcule son profil et son classement uniquement dans le navigateur, puis accède directement aux résultats. Il ne passe par aucun formulaire de recherche et n'est inséré ni dans </w:t>
+      </w:r>
+      <w:r>
+        <w:rPr>
+          <w:rFonts w:ascii="Consolas" w:hAnsi="Consolas"/>
+          <w:shd w:fill="EEF2F4"/>
+        </w:rPr>
+        <w:t>student_responses</w:t>
+      </w:r>
+      <w:r>
+        <w:t xml:space="preserve"> ni dans </w:t>
+      </w:r>
+      <w:r>
+        <w:rPr>
+          <w:rFonts w:ascii="Consolas" w:hAnsi="Consolas"/>
+          <w:shd w:fill="EEF2F4"/>
+        </w:rPr>
+        <w:t>specialist_responses</w:t>
+      </w:r>
+      <w:r>
+        <w:t>, afin de préserver la séparation des cohortes.</w:t>
       </w:r>
     </w:p>
     <w:p>

</xml_diff>

<commit_message>
Make specialist questionnaire optional
</commit_message>
<xml_diff>
--- a/docs/Q-Project-Structure-Base-de-donnees.docx
+++ b/docs/Q-Project-Structure-Base-de-donnees.docx
@@ -26,7 +26,7 @@
         <w:t>Version documentaire :</w:t>
       </w:r>
       <w:r>
-        <w:t xml:space="preserve"> 6 septembre 2026</w:t>
+        <w:t xml:space="preserve"> 10 septembre 2026</w:t>
       </w:r>
     </w:p>
     <w:p>
@@ -57,6 +57,16 @@
         <w:t>supabase/migrations/20260904193000_accuracy_and_qualitative_specialist_v2.sql</w:t>
       </w:r>
       <w:r>
+        <w:t xml:space="preserve">, </w:t>
+      </w:r>
+      <w:r>
+        <w:rPr>
+          <w:rFonts w:ascii="Consolas" w:hAnsi="Consolas"/>
+          <w:shd w:fill="EEF2F4"/>
+        </w:rPr>
+        <w:t>supabase/migrations/20260906090000_limit_student_study_year_to_six.sql</w:t>
+      </w:r>
+      <w:r>
         <w:t xml:space="preserve"> et </w:t>
       </w:r>
       <w:r>
@@ -64,7 +74,7 @@
           <w:rFonts w:ascii="Consolas" w:hAnsi="Consolas"/>
           <w:shd w:fill="EEF2F4"/>
         </w:rPr>
-        <w:t>supabase/migrations/20260906090000_limit_student_study_year_to_six.sql</w:t>
+        <w:t>supabase/migrations/20260910090000_optional_specialist_questionnaire.sql</w:t>
       </w:r>
     </w:p>
     <w:p>
@@ -576,7 +586,7 @@
         <w:t xml:space="preserve">• </w:t>
       </w:r>
       <w:r>
-        <w:t>chaque nouvelle soumission de schéma 2, envoyée par une RPC v3, enregistre la version exacte du catalogue utilisée ;</w:t>
+        <w:t>chaque nouvelle soumission de schéma 2, envoyée par la RPC étudiante v3 ou spécialiste v4, enregistre la version exacte du catalogue utilisée ;</w:t>
       </w:r>
     </w:p>
     <w:p>
@@ -610,7 +620,7 @@
         <w:t xml:space="preserve">• </w:t>
       </w:r>
       <w:r>
-        <w:t>l'entretien spécialiste de schéma 2 collecte cinq réponses qualitatives après les 81 items, au lieu des anciens champs structurés d'expérience, satisfaction, intention de changement et caractère volontaire du choix ;</w:t>
+        <w:t>l'entretien spécialiste de schéma 2 collecte toujours cinq réponses qualitatives ; les 81 items et les valeurs professionnelles sont facultatifs et leur complétion est enregistrée explicitement ;</w:t>
       </w:r>
     </w:p>
     <w:p>
@@ -689,7 +699,27 @@
         <w:t>20260906090000_limit_student_study_year_to_six.sql</w:t>
       </w:r>
       <w:r>
-        <w:t xml:space="preserve"> impose la plage 1–6 à toute nouvelle écriture étudiante, y compris via les anciennes RPC encore exécutables, sans réécrire les données historiques. Les appels v2 restent utilisables pour l'historique ; les nouvelles collectes utilisent v3.</w:t>
+        <w:t xml:space="preserve"> impose la plage 1–6 à toute nouvelle écriture étudiante, y compris via les anciennes RPC encore exécutables, sans réécrire les données historiques. Enfin, </w:t>
+      </w:r>
+      <w:r>
+        <w:rPr>
+          <w:rFonts w:ascii="Consolas" w:hAnsi="Consolas"/>
+          <w:shd w:fill="EEF2F4"/>
+        </w:rPr>
+        <w:t>20260910090000_optional_specialist_questionnaire.sql</w:t>
+      </w:r>
+      <w:r>
+        <w:t xml:space="preserve"> ajoute l'état explicite </w:t>
+      </w:r>
+      <w:r>
+        <w:rPr>
+          <w:rFonts w:ascii="Consolas" w:hAnsi="Consolas"/>
+          <w:shd w:fill="EEF2F4"/>
+        </w:rPr>
+        <w:t>questionnaire_completed</w:t>
+      </w:r>
+      <w:r>
+        <w:t xml:space="preserve"> et la RPC spécialiste v4. Les appels antérieurs restent disponibles pour la compatibilité ; les nouvelles collectes utilisent v3 pour les étudiants et v4 pour les spécialistes.</w:t>
       </w:r>
     </w:p>
     <w:p>
@@ -780,7 +810,7 @@
           <w:sz w:val="18"/>
           <w:szCs w:val="18"/>
         </w:rPr>
-        <w:t xml:space="preserve">│  - soumissions v3 / schéma 2      - réponses qualitatives            │</w:t>
+        <w:t xml:space="preserve">│  - étudiant v3 / spécialiste v4   - réponses qualitatives            │</w:t>
       </w:r>
       <w:r>
         <w:br/>
@@ -900,7 +930,7 @@
           <w:sz w:val="18"/>
           <w:szCs w:val="18"/>
         </w:rPr>
-        <w:t xml:space="preserve">│ submit_*_response_v1/v2/v3         get/save/publish/list/restore     │</w:t>
+        <w:t xml:space="preserve">│ submit_*_response_v1/v2/v3/v4      get/save/publish/list/restore     │</w:t>
       </w:r>
       <w:r>
         <w:br/>
@@ -1077,7 +1107,7 @@
         <w:t xml:space="preserve">3. </w:t>
       </w:r>
       <w:r>
-        <w:t xml:space="preserve">La soumission v3 transmet l’identifiant UUID de la version publiée utilisée et crée une ligne de </w:t>
+        <w:t xml:space="preserve">La soumission v3 étudiante ou v4 spécialiste transmet l’identifiant UUID de la version publiée utilisée et crée une ligne de </w:t>
       </w:r>
       <w:r>
         <w:rPr>
@@ -1138,7 +1168,7 @@
         <w:t xml:space="preserve">6. </w:t>
       </w:r>
       <w:r>
-        <w:t>Pour un spécialiste, la spécialité réelle et les cinq réponses qualitatives ne sont demandées qu'après les 81 notes et le choix des valeurs, afin de réduire le biais d'ancrage pendant le questionnaire principal.</w:t>
+        <w:t>Le spécialiste choisit soit le profil quantitatif complet (81 notes et 1 à 4 valeurs), soit l'accès direct aux cinq questions qualitatives. Un abandon quantitatif efface les réponses partielles ; aucun profil incomplet n'est enregistré.</w:t>
       </w:r>
     </w:p>
     <w:p>
@@ -1153,6 +1183,23 @@
           <w:color w:val="0B6B70"/>
         </w:rPr>
         <w:t xml:space="preserve">7. </w:t>
+      </w:r>
+      <w:r>
+        <w:t>Pour le parcours quantitatif spécialiste, la spécialité réelle n'est demandée qu'après les 81 notes afin de réduire le biais d'ancrage. Pour le parcours direct, elle est demandée avec l'entretien qualitatif.</w:t>
+      </w:r>
+    </w:p>
+    <w:p>
+      <w:pPr>
+        <w:pStyle w:val="ListNumber"/>
+        <w:ind w:left="520" w:hanging="280"/>
+        <w:spacing w:after="70"/>
+      </w:pPr>
+      <w:r>
+        <w:rPr>
+          <w:b/>
+          <w:color w:val="0B6B70"/>
+        </w:rPr>
+        <w:t xml:space="preserve">8. </w:t>
       </w:r>
       <w:r>
         <w:t xml:space="preserve">Le profil « découverte de la médecine » calcule son profil et son classement uniquement dans le navigateur, puis accède directement aux résultats. Il ne passe par aucun formulaire de recherche et n'est inséré ni dans </w:t>
@@ -6499,59 +6546,66 @@
               <w:spacing w:after="0"/>
             </w:pPr>
             <w:r>
-              <w:t>Données brutes</w:t>
-            </w:r>
-          </w:p>
-        </w:tc>
-        <w:tc>
-          <w:tcPr>
-            <w:shd w:fill="FFFFFF"/>
-          </w:tcPr>
-          <w:p>
-            <w:pPr>
-              <w:pStyle w:val="TableText"/>
-              <w:spacing w:after="0"/>
-            </w:pPr>
-            <w:r>
-              <w:rPr>
-                <w:rFonts w:ascii="Consolas" w:hAnsi="Consolas"/>
-                <w:shd w:fill="EEF2F4"/>
-              </w:rPr>
-              <w:t>ratings</w:t>
-            </w:r>
-            <w:r>
-              <w:t xml:space="preserve">, </w:t>
-            </w:r>
-            <w:r>
-              <w:rPr>
-                <w:rFonts w:ascii="Consolas" w:hAnsi="Consolas"/>
-                <w:shd w:fill="EEF2F4"/>
-              </w:rPr>
-              <w:t>selected_values</w:t>
-            </w:r>
-            <w:r>
-              <w:t xml:space="preserve">, </w:t>
-            </w:r>
-            <w:r>
-              <w:rPr>
-                <w:rFonts w:ascii="Consolas" w:hAnsi="Consolas"/>
-                <w:shd w:fill="EEF2F4"/>
-              </w:rPr>
-              <w:t>language</w:t>
-            </w:r>
-          </w:p>
-        </w:tc>
-        <w:tc>
-          <w:tcPr>
-            <w:shd w:fill="FFFFFF"/>
-          </w:tcPr>
-          <w:p>
-            <w:pPr>
-              <w:pStyle w:val="TableText"/>
-              <w:spacing w:after="0"/>
-            </w:pPr>
-            <w:r>
-              <w:t>81 notes, valeurs choisies et langue.</w:t>
+              <w:t>État du profil quantitatif</w:t>
+            </w:r>
+          </w:p>
+        </w:tc>
+        <w:tc>
+          <w:tcPr>
+            <w:shd w:fill="FFFFFF"/>
+          </w:tcPr>
+          <w:p>
+            <w:pPr>
+              <w:pStyle w:val="TableText"/>
+              <w:spacing w:after="0"/>
+            </w:pPr>
+            <w:r>
+              <w:rPr>
+                <w:rFonts w:ascii="Consolas" w:hAnsi="Consolas"/>
+                <w:shd w:fill="EEF2F4"/>
+              </w:rPr>
+              <w:t>questionnaire_completed</w:t>
+            </w:r>
+          </w:p>
+        </w:tc>
+        <w:tc>
+          <w:tcPr>
+            <w:shd w:fill="FFFFFF"/>
+          </w:tcPr>
+          <w:p>
+            <w:pPr>
+              <w:pStyle w:val="TableText"/>
+              <w:spacing w:after="0"/>
+            </w:pPr>
+            <w:r>
+              <w:rPr>
+                <w:rFonts w:ascii="Consolas" w:hAnsi="Consolas"/>
+                <w:shd w:fill="EEF2F4"/>
+              </w:rPr>
+              <w:t>true</w:t>
+            </w:r>
+            <w:r>
+              <w:t xml:space="preserve"> pour un profil complet ; </w:t>
+            </w:r>
+            <w:r>
+              <w:rPr>
+                <w:rFonts w:ascii="Consolas" w:hAnsi="Consolas"/>
+                <w:shd w:fill="EEF2F4"/>
+              </w:rPr>
+              <w:t>false</w:t>
+            </w:r>
+            <w:r>
+              <w:t xml:space="preserve"> pour un passage volontaire directement à l’entretien qualitatif. Les lignes historiques sont reprises à </w:t>
+            </w:r>
+            <w:r>
+              <w:rPr>
+                <w:rFonts w:ascii="Consolas" w:hAnsi="Consolas"/>
+                <w:shd w:fill="EEF2F4"/>
+              </w:rPr>
+              <w:t>true</w:t>
+            </w:r>
+            <w:r>
+              <w:t>.</w:t>
             </w:r>
           </w:p>
         </w:tc>
@@ -6567,7 +6621,7 @@
               <w:spacing w:after="0"/>
             </w:pPr>
             <w:r>
-              <w:t>Entretien qualitatif courant</w:t>
+              <w:t>Données brutes</w:t>
             </w:r>
           </w:p>
         </w:tc>
@@ -6585,7 +6639,7 @@
                 <w:rFonts w:ascii="Consolas" w:hAnsi="Consolas"/>
                 <w:shd w:fill="EEF2F4"/>
               </w:rPr>
-              <w:t>current_specialty_view</w:t>
+              <w:t>ratings</w:t>
             </w:r>
             <w:r>
               <w:t xml:space="preserve">, </w:t>
@@ -6595,7 +6649,7 @@
                 <w:rFonts w:ascii="Consolas" w:hAnsi="Consolas"/>
                 <w:shd w:fill="EEF2F4"/>
               </w:rPr>
-              <w:t>specialty_changes_over_years</w:t>
+              <w:t>selected_values</w:t>
             </w:r>
             <w:r>
               <w:t xml:space="preserve">, </w:t>
@@ -6605,17 +6659,7 @@
                 <w:rFonts w:ascii="Consolas" w:hAnsi="Consolas"/>
                 <w:shd w:fill="EEF2F4"/>
               </w:rPr>
-              <w:t>most_important_specialty_quality</w:t>
-            </w:r>
-            <w:r>
-              <w:t xml:space="preserve">, </w:t>
-            </w:r>
-            <w:r>
-              <w:rPr>
-                <w:rFonts w:ascii="Consolas" w:hAnsi="Consolas"/>
-                <w:shd w:fill="EEF2F4"/>
-              </w:rPr>
-              <w:t>student_self_question</w:t>
+              <w:t>language</w:t>
             </w:r>
           </w:p>
         </w:tc>
@@ -6629,7 +6673,47 @@
               <w:spacing w:after="0"/>
             </w:pPr>
             <w:r>
-              <w:t>Quatre textes obligatoires du schéma 2, nettoyés des espaces périphériques. Les trois premiers acceptent 3 à 2 000 caractères ; la question destinée à l'étudiant, 3 à 1 000 caractères.</w:t>
+              <w:t xml:space="preserve">Si </w:t>
+            </w:r>
+            <w:r>
+              <w:rPr>
+                <w:rFonts w:ascii="Consolas" w:hAnsi="Consolas"/>
+                <w:shd w:fill="EEF2F4"/>
+              </w:rPr>
+              <w:t>questionnaire_completed = true</w:t>
+            </w:r>
+            <w:r>
+              <w:t xml:space="preserve"> : exactement 81 notes et 1 à 4 valeurs. Si </w:t>
+            </w:r>
+            <w:r>
+              <w:rPr>
+                <w:rFonts w:ascii="Consolas" w:hAnsi="Consolas"/>
+                <w:shd w:fill="EEF2F4"/>
+              </w:rPr>
+              <w:t>false</w:t>
+            </w:r>
+            <w:r>
+              <w:t xml:space="preserve"> : exactement l’objet </w:t>
+            </w:r>
+            <w:r>
+              <w:rPr>
+                <w:rFonts w:ascii="Consolas" w:hAnsi="Consolas"/>
+                <w:shd w:fill="EEF2F4"/>
+              </w:rPr>
+              <w:t>{}</w:t>
+            </w:r>
+            <w:r>
+              <w:t xml:space="preserve"> et le tableau </w:t>
+            </w:r>
+            <w:r>
+              <w:rPr>
+                <w:rFonts w:ascii="Consolas" w:hAnsi="Consolas"/>
+                <w:shd w:fill="EEF2F4"/>
+              </w:rPr>
+              <w:t>[]</w:t>
+            </w:r>
+            <w:r>
+              <w:t>.</w:t>
             </w:r>
           </w:p>
         </w:tc>
@@ -6645,25 +6729,25 @@
               <w:spacing w:after="0"/>
             </w:pPr>
             <w:r>
-              <w:t>Choix à refaire</w:t>
-            </w:r>
-          </w:p>
-        </w:tc>
-        <w:tc>
-          <w:tcPr>
-            <w:shd w:fill="FFFFFF"/>
-          </w:tcPr>
-          <w:p>
-            <w:pPr>
-              <w:pStyle w:val="TableText"/>
-              <w:spacing w:after="0"/>
-            </w:pPr>
-            <w:r>
-              <w:rPr>
-                <w:rFonts w:ascii="Consolas" w:hAnsi="Consolas"/>
-                <w:shd w:fill="EEF2F4"/>
-              </w:rPr>
-              <w:t>would_choose_again_code</w:t>
+              <w:t>Entretien qualitatif courant</w:t>
+            </w:r>
+          </w:p>
+        </w:tc>
+        <w:tc>
+          <w:tcPr>
+            <w:shd w:fill="FFFFFF"/>
+          </w:tcPr>
+          <w:p>
+            <w:pPr>
+              <w:pStyle w:val="TableText"/>
+              <w:spacing w:after="0"/>
+            </w:pPr>
+            <w:r>
+              <w:rPr>
+                <w:rFonts w:ascii="Consolas" w:hAnsi="Consolas"/>
+                <w:shd w:fill="EEF2F4"/>
+              </w:rPr>
+              <w:t>current_specialty_view</w:t>
             </w:r>
             <w:r>
               <w:t xml:space="preserve">, </w:t>
@@ -6673,71 +6757,41 @@
                 <w:rFonts w:ascii="Consolas" w:hAnsi="Consolas"/>
                 <w:shd w:fill="EEF2F4"/>
               </w:rPr>
-              <w:t>would_not_choose_again_reason</w:t>
-            </w:r>
-          </w:p>
-        </w:tc>
-        <w:tc>
-          <w:tcPr>
-            <w:shd w:fill="FFFFFF"/>
-          </w:tcPr>
-          <w:p>
-            <w:pPr>
-              <w:pStyle w:val="TableText"/>
-              <w:spacing w:after="0"/>
-            </w:pPr>
-            <w:r>
-              <w:t xml:space="preserve">Code obligatoire </w:t>
-            </w:r>
-            <w:r>
-              <w:rPr>
-                <w:rFonts w:ascii="Consolas" w:hAnsi="Consolas"/>
-                <w:shd w:fill="EEF2F4"/>
-              </w:rPr>
-              <w:t>yes</w:t>
-            </w:r>
-            <w:r>
-              <w:t xml:space="preserve"> ou </w:t>
-            </w:r>
-            <w:r>
-              <w:rPr>
-                <w:rFonts w:ascii="Consolas" w:hAnsi="Consolas"/>
-                <w:shd w:fill="EEF2F4"/>
-              </w:rPr>
-              <w:t>no</w:t>
-            </w:r>
-            <w:r>
-              <w:t xml:space="preserve">. La raison de 3 à 2 000 caractères est obligatoire si la réponse vaut </w:t>
-            </w:r>
-            <w:r>
-              <w:rPr>
-                <w:rFonts w:ascii="Consolas" w:hAnsi="Consolas"/>
-                <w:shd w:fill="EEF2F4"/>
-              </w:rPr>
-              <w:t>no</w:t>
-            </w:r>
-            <w:r>
-              <w:t xml:space="preserve"> et doit rester </w:t>
-            </w:r>
-            <w:r>
-              <w:rPr>
-                <w:rFonts w:ascii="Consolas" w:hAnsi="Consolas"/>
-                <w:shd w:fill="EEF2F4"/>
-              </w:rPr>
-              <w:t>NULL</w:t>
-            </w:r>
-            <w:r>
-              <w:t xml:space="preserve"> si elle vaut </w:t>
-            </w:r>
-            <w:r>
-              <w:rPr>
-                <w:rFonts w:ascii="Consolas" w:hAnsi="Consolas"/>
-                <w:shd w:fill="EEF2F4"/>
-              </w:rPr>
-              <w:t>yes</w:t>
-            </w:r>
-            <w:r>
-              <w:t>.</w:t>
+              <w:t>specialty_changes_over_years</w:t>
+            </w:r>
+            <w:r>
+              <w:t xml:space="preserve">, </w:t>
+            </w:r>
+            <w:r>
+              <w:rPr>
+                <w:rFonts w:ascii="Consolas" w:hAnsi="Consolas"/>
+                <w:shd w:fill="EEF2F4"/>
+              </w:rPr>
+              <w:t>most_important_specialty_quality</w:t>
+            </w:r>
+            <w:r>
+              <w:t xml:space="preserve">, </w:t>
+            </w:r>
+            <w:r>
+              <w:rPr>
+                <w:rFonts w:ascii="Consolas" w:hAnsi="Consolas"/>
+                <w:shd w:fill="EEF2F4"/>
+              </w:rPr>
+              <w:t>student_self_question</w:t>
+            </w:r>
+          </w:p>
+        </w:tc>
+        <w:tc>
+          <w:tcPr>
+            <w:shd w:fill="FFFFFF"/>
+          </w:tcPr>
+          <w:p>
+            <w:pPr>
+              <w:pStyle w:val="TableText"/>
+              <w:spacing w:after="0"/>
+            </w:pPr>
+            <w:r>
+              <w:t>Quatre textes obligatoires du schéma 2, nettoyés des espaces périphériques. Les trois premiers acceptent 3 à 2 000 caractères ; la question destinée à l'étudiant, 3 à 1 000 caractères.</w:t>
             </w:r>
           </w:p>
         </w:tc>
@@ -6753,7 +6807,7 @@
               <w:spacing w:after="0"/>
             </w:pPr>
             <w:r>
-              <w:t>Champs structurés legacy</w:t>
+              <w:t>Choix à refaire</w:t>
             </w:r>
           </w:p>
         </w:tc>
@@ -6771,7 +6825,7 @@
                 <w:rFonts w:ascii="Consolas" w:hAnsi="Consolas"/>
                 <w:shd w:fill="EEF2F4"/>
               </w:rPr>
-              <w:t>years_of_experience</w:t>
+              <w:t>would_choose_again_code</w:t>
             </w:r>
             <w:r>
               <w:t xml:space="preserve">, </w:t>
@@ -6781,27 +6835,7 @@
                 <w:rFonts w:ascii="Consolas" w:hAnsi="Consolas"/>
                 <w:shd w:fill="EEF2F4"/>
               </w:rPr>
-              <w:t>career_satisfaction</w:t>
-            </w:r>
-            <w:r>
-              <w:t xml:space="preserve">, </w:t>
-            </w:r>
-            <w:r>
-              <w:rPr>
-                <w:rFonts w:ascii="Consolas" w:hAnsi="Consolas"/>
-                <w:shd w:fill="EEF2F4"/>
-              </w:rPr>
-              <w:t>intention_to_change_code</w:t>
-            </w:r>
-            <w:r>
-              <w:t xml:space="preserve">, </w:t>
-            </w:r>
-            <w:r>
-              <w:rPr>
-                <w:rFonts w:ascii="Consolas" w:hAnsi="Consolas"/>
-                <w:shd w:fill="EEF2F4"/>
-              </w:rPr>
-              <w:t>voluntary_choice_code</w:t>
+              <w:t>would_not_choose_again_reason</w:t>
             </w:r>
           </w:p>
         </w:tc>
@@ -6815,7 +6849,37 @@
               <w:spacing w:after="0"/>
             </w:pPr>
             <w:r>
-              <w:t xml:space="preserve">Anciens champs conservés pour relire les lignes historiques. Les nouvelles lignes de schéma 2 les laissent à </w:t>
+              <w:t xml:space="preserve">Code obligatoire </w:t>
+            </w:r>
+            <w:r>
+              <w:rPr>
+                <w:rFonts w:ascii="Consolas" w:hAnsi="Consolas"/>
+                <w:shd w:fill="EEF2F4"/>
+              </w:rPr>
+              <w:t>yes</w:t>
+            </w:r>
+            <w:r>
+              <w:t xml:space="preserve"> ou </w:t>
+            </w:r>
+            <w:r>
+              <w:rPr>
+                <w:rFonts w:ascii="Consolas" w:hAnsi="Consolas"/>
+                <w:shd w:fill="EEF2F4"/>
+              </w:rPr>
+              <w:t>no</w:t>
+            </w:r>
+            <w:r>
+              <w:t xml:space="preserve">. La raison de 3 à 2 000 caractères est obligatoire si la réponse vaut </w:t>
+            </w:r>
+            <w:r>
+              <w:rPr>
+                <w:rFonts w:ascii="Consolas" w:hAnsi="Consolas"/>
+                <w:shd w:fill="EEF2F4"/>
+              </w:rPr>
+              <w:t>no</w:t>
+            </w:r>
+            <w:r>
+              <w:t xml:space="preserve"> et doit rester </w:t>
             </w:r>
             <w:r>
               <w:rPr>
@@ -6823,6 +6887,16 @@
                 <w:shd w:fill="EEF2F4"/>
               </w:rPr>
               <w:t>NULL</w:t>
+            </w:r>
+            <w:r>
+              <w:t xml:space="preserve"> si elle vaut </w:t>
+            </w:r>
+            <w:r>
+              <w:rPr>
+                <w:rFonts w:ascii="Consolas" w:hAnsi="Consolas"/>
+                <w:shd w:fill="EEF2F4"/>
+              </w:rPr>
+              <w:t>yes</w:t>
             </w:r>
             <w:r>
               <w:t>.</w:t>
@@ -6841,25 +6915,25 @@
               <w:spacing w:after="0"/>
             </w:pPr>
             <w:r>
-              <w:t>Libellés legacy</w:t>
-            </w:r>
-          </w:p>
-        </w:tc>
-        <w:tc>
-          <w:tcPr>
-            <w:shd w:fill="FFFFFF"/>
-          </w:tcPr>
-          <w:p>
-            <w:pPr>
-              <w:pStyle w:val="TableText"/>
-              <w:spacing w:after="0"/>
-            </w:pPr>
-            <w:r>
-              <w:rPr>
-                <w:rFonts w:ascii="Consolas" w:hAnsi="Consolas"/>
-                <w:shd w:fill="EEF2F4"/>
-              </w:rPr>
-              <w:t>would_choose_again</w:t>
+              <w:t>Champs structurés legacy</w:t>
+            </w:r>
+          </w:p>
+        </w:tc>
+        <w:tc>
+          <w:tcPr>
+            <w:shd w:fill="FFFFFF"/>
+          </w:tcPr>
+          <w:p>
+            <w:pPr>
+              <w:pStyle w:val="TableText"/>
+              <w:spacing w:after="0"/>
+            </w:pPr>
+            <w:r>
+              <w:rPr>
+                <w:rFonts w:ascii="Consolas" w:hAnsi="Consolas"/>
+                <w:shd w:fill="EEF2F4"/>
+              </w:rPr>
+              <w:t>years_of_experience</w:t>
             </w:r>
             <w:r>
               <w:t xml:space="preserve">, </w:t>
@@ -6869,7 +6943,7 @@
                 <w:rFonts w:ascii="Consolas" w:hAnsi="Consolas"/>
                 <w:shd w:fill="EEF2F4"/>
               </w:rPr>
-              <w:t>intention_to_change</w:t>
+              <w:t>career_satisfaction</w:t>
             </w:r>
             <w:r>
               <w:t xml:space="preserve">, </w:t>
@@ -6879,21 +6953,31 @@
                 <w:rFonts w:ascii="Consolas" w:hAnsi="Consolas"/>
                 <w:shd w:fill="EEF2F4"/>
               </w:rPr>
-              <w:t>voluntary_choice</w:t>
-            </w:r>
-          </w:p>
-        </w:tc>
-        <w:tc>
-          <w:tcPr>
-            <w:shd w:fill="FFFFFF"/>
-          </w:tcPr>
-          <w:p>
-            <w:pPr>
-              <w:pStyle w:val="TableText"/>
-              <w:spacing w:after="0"/>
-            </w:pPr>
-            <w:r>
-              <w:t xml:space="preserve">Anciennes étiquettes localisées conservées pour l'historique ; elles restent </w:t>
+              <w:t>intention_to_change_code</w:t>
+            </w:r>
+            <w:r>
+              <w:t xml:space="preserve">, </w:t>
+            </w:r>
+            <w:r>
+              <w:rPr>
+                <w:rFonts w:ascii="Consolas" w:hAnsi="Consolas"/>
+                <w:shd w:fill="EEF2F4"/>
+              </w:rPr>
+              <w:t>voluntary_choice_code</w:t>
+            </w:r>
+          </w:p>
+        </w:tc>
+        <w:tc>
+          <w:tcPr>
+            <w:shd w:fill="FFFFFF"/>
+          </w:tcPr>
+          <w:p>
+            <w:pPr>
+              <w:pStyle w:val="TableText"/>
+              <w:spacing w:after="0"/>
+            </w:pPr>
+            <w:r>
+              <w:t xml:space="preserve">Anciens champs conservés pour relire les lignes historiques. Les nouvelles lignes de schéma 2 les laissent à </w:t>
             </w:r>
             <w:r>
               <w:rPr>
@@ -6903,7 +6987,7 @@
               <w:t>NULL</w:t>
             </w:r>
             <w:r>
-              <w:t xml:space="preserve"> pour le schéma 2.</w:t>
+              <w:t>.</w:t>
             </w:r>
           </w:p>
         </w:tc>
@@ -6919,7 +7003,7 @@
               <w:spacing w:after="0"/>
             </w:pPr>
             <w:r>
-              <w:t>Versions scientifiques</w:t>
+              <w:t>Libellés legacy</w:t>
             </w:r>
           </w:p>
         </w:tc>
@@ -6937,7 +7021,7 @@
                 <w:rFonts w:ascii="Consolas" w:hAnsi="Consolas"/>
                 <w:shd w:fill="EEF2F4"/>
               </w:rPr>
-              <w:t>submission_schema_version</w:t>
+              <w:t>would_choose_again</w:t>
             </w:r>
             <w:r>
               <w:t xml:space="preserve">, </w:t>
@@ -6947,7 +7031,7 @@
                 <w:rFonts w:ascii="Consolas" w:hAnsi="Consolas"/>
                 <w:shd w:fill="EEF2F4"/>
               </w:rPr>
-              <w:t>questionnaire_version</w:t>
+              <w:t>intention_to_change</w:t>
             </w:r>
             <w:r>
               <w:t xml:space="preserve">, </w:t>
@@ -6957,37 +7041,7 @@
                 <w:rFonts w:ascii="Consolas" w:hAnsi="Consolas"/>
                 <w:shd w:fill="EEF2F4"/>
               </w:rPr>
-              <w:t>value_catalog_version</w:t>
-            </w:r>
-            <w:r>
-              <w:t xml:space="preserve">, </w:t>
-            </w:r>
-            <w:r>
-              <w:rPr>
-                <w:rFonts w:ascii="Consolas" w:hAnsi="Consolas"/>
-                <w:shd w:fill="EEF2F4"/>
-              </w:rPr>
-              <w:t>specialty_catalog_version</w:t>
-            </w:r>
-            <w:r>
-              <w:t xml:space="preserve">, </w:t>
-            </w:r>
-            <w:r>
-              <w:rPr>
-                <w:rFonts w:ascii="Consolas" w:hAnsi="Consolas"/>
-                <w:shd w:fill="EEF2F4"/>
-              </w:rPr>
-              <w:t>calibration_version</w:t>
-            </w:r>
-            <w:r>
-              <w:t xml:space="preserve">, </w:t>
-            </w:r>
-            <w:r>
-              <w:rPr>
-                <w:rFonts w:ascii="Consolas" w:hAnsi="Consolas"/>
-                <w:shd w:fill="EEF2F4"/>
-              </w:rPr>
-              <w:t>consent_version</w:t>
+              <w:t>voluntary_choice</w:t>
             </w:r>
           </w:p>
         </w:tc>
@@ -7001,7 +7055,17 @@
               <w:spacing w:after="0"/>
             </w:pPr>
             <w:r>
-              <w:t>Versions nécessaires à l’analyse.</w:t>
+              <w:t xml:space="preserve">Anciennes étiquettes localisées conservées pour l'historique ; elles restent </w:t>
+            </w:r>
+            <w:r>
+              <w:rPr>
+                <w:rFonts w:ascii="Consolas" w:hAnsi="Consolas"/>
+                <w:shd w:fill="EEF2F4"/>
+              </w:rPr>
+              <w:t>NULL</w:t>
+            </w:r>
+            <w:r>
+              <w:t xml:space="preserve"> pour le schéma 2.</w:t>
             </w:r>
           </w:p>
         </w:tc>
@@ -7017,13 +7081,111 @@
               <w:spacing w:after="0"/>
             </w:pPr>
             <w:r>
+              <w:t>Versions scientifiques</w:t>
+            </w:r>
+          </w:p>
+        </w:tc>
+        <w:tc>
+          <w:tcPr>
+            <w:shd w:fill="FFFFFF"/>
+          </w:tcPr>
+          <w:p>
+            <w:pPr>
+              <w:pStyle w:val="TableText"/>
+              <w:spacing w:after="0"/>
+            </w:pPr>
+            <w:r>
+              <w:rPr>
+                <w:rFonts w:ascii="Consolas" w:hAnsi="Consolas"/>
+                <w:shd w:fill="EEF2F4"/>
+              </w:rPr>
+              <w:t>submission_schema_version</w:t>
+            </w:r>
+            <w:r>
+              <w:t xml:space="preserve">, </w:t>
+            </w:r>
+            <w:r>
+              <w:rPr>
+                <w:rFonts w:ascii="Consolas" w:hAnsi="Consolas"/>
+                <w:shd w:fill="EEF2F4"/>
+              </w:rPr>
+              <w:t>questionnaire_version</w:t>
+            </w:r>
+            <w:r>
+              <w:t xml:space="preserve">, </w:t>
+            </w:r>
+            <w:r>
+              <w:rPr>
+                <w:rFonts w:ascii="Consolas" w:hAnsi="Consolas"/>
+                <w:shd w:fill="EEF2F4"/>
+              </w:rPr>
+              <w:t>value_catalog_version</w:t>
+            </w:r>
+            <w:r>
+              <w:t xml:space="preserve">, </w:t>
+            </w:r>
+            <w:r>
+              <w:rPr>
+                <w:rFonts w:ascii="Consolas" w:hAnsi="Consolas"/>
+                <w:shd w:fill="EEF2F4"/>
+              </w:rPr>
+              <w:t>specialty_catalog_version</w:t>
+            </w:r>
+            <w:r>
+              <w:t xml:space="preserve">, </w:t>
+            </w:r>
+            <w:r>
+              <w:rPr>
+                <w:rFonts w:ascii="Consolas" w:hAnsi="Consolas"/>
+                <w:shd w:fill="EEF2F4"/>
+              </w:rPr>
+              <w:t>calibration_version</w:t>
+            </w:r>
+            <w:r>
+              <w:t xml:space="preserve">, </w:t>
+            </w:r>
+            <w:r>
+              <w:rPr>
+                <w:rFonts w:ascii="Consolas" w:hAnsi="Consolas"/>
+                <w:shd w:fill="EEF2F4"/>
+              </w:rPr>
+              <w:t>consent_version</w:t>
+            </w:r>
+          </w:p>
+        </w:tc>
+        <w:tc>
+          <w:tcPr>
+            <w:shd w:fill="FFFFFF"/>
+          </w:tcPr>
+          <w:p>
+            <w:pPr>
+              <w:pStyle w:val="TableText"/>
+              <w:spacing w:after="0"/>
+            </w:pPr>
+            <w:r>
+              <w:t>Versions nécessaires à l’analyse.</w:t>
+            </w:r>
+          </w:p>
+        </w:tc>
+      </w:tr>
+      <w:tr>
+        <w:tc>
+          <w:tcPr>
+            <w:shd w:fill="F5F8F8"/>
+          </w:tcPr>
+          <w:p>
+            <w:pPr>
+              <w:pStyle w:val="TableText"/>
+              <w:spacing w:after="0"/>
+            </w:pPr>
+            <w:r>
               <w:t>Provenance du catalogue</w:t>
             </w:r>
           </w:p>
         </w:tc>
         <w:tc>
           <w:tcPr>
-            <w:shd w:fill="FFFFFF"/>
+            <w:shd w:fill="F5F8F8"/>
           </w:tcPr>
           <w:p>
             <w:pPr>
@@ -7051,15 +7213,15 @@
         </w:tc>
         <w:tc>
           <w:tcPr>
-            <w:shd w:fill="FFFFFF"/>
-          </w:tcPr>
-          <w:p>
-            <w:pPr>
-              <w:pStyle w:val="TableText"/>
-              <w:spacing w:after="0"/>
-            </w:pPr>
-            <w:r>
-              <w:t>Instantané publié exact utilisé par les soumissions v2 et v3 ; obligatoire pour le schéma 2.</w:t>
+            <w:shd w:fill="F5F8F8"/>
+          </w:tcPr>
+          <w:p>
+            <w:pPr>
+              <w:pStyle w:val="TableText"/>
+              <w:spacing w:after="0"/>
+            </w:pPr>
+            <w:r>
+              <w:t>Instantané publié exact utilisé par les soumissions v2, v3 et v4 ; obligatoire pour le schéma 2.</w:t>
             </w:r>
           </w:p>
         </w:tc>
@@ -7858,7 +8020,44 @@
     </w:p>
     <w:p>
       <w:r>
-        <w:t>Point d'entrée courant des spécialistes. Après les 81 notes et les valeurs, il reçoit :</w:t>
+        <w:t xml:space="preserve">Point d'entrée spécialiste antérieur conservé pour compatibilité. Il exige encore les 81 notes et les valeurs, et enregistre implicitement </w:t>
+      </w:r>
+      <w:r>
+        <w:rPr>
+          <w:rFonts w:ascii="Consolas" w:hAnsi="Consolas"/>
+          <w:shd w:fill="EEF2F4"/>
+        </w:rPr>
+        <w:t>questionnaire_completed = true</w:t>
+      </w:r>
+      <w:r>
+        <w:t xml:space="preserve"> grâce à la valeur par défaut.</w:t>
+      </w:r>
+    </w:p>
+    <w:p>
+      <w:pPr>
+        <w:pStyle w:val="Heading3"/>
+      </w:pPr>
+      <w:r>
+        <w:rPr>
+          <w:rFonts w:ascii="Consolas" w:hAnsi="Consolas"/>
+          <w:shd w:fill="EEF2F4"/>
+        </w:rPr>
+        <w:t>submit_specialist_response_v4(...)</w:t>
+      </w:r>
+    </w:p>
+    <w:p>
+      <w:r>
+        <w:t xml:space="preserve">Point d'entrée courant des spécialistes. Il reçoit le booléen </w:t>
+      </w:r>
+      <w:r>
+        <w:rPr>
+          <w:rFonts w:ascii="Consolas" w:hAnsi="Consolas"/>
+          <w:shd w:fill="EEF2F4"/>
+        </w:rPr>
+        <w:t>p_questionnaire_completed</w:t>
+      </w:r>
+      <w:r>
+        <w:t>, puis :</w:t>
       </w:r>
     </w:p>
     <w:p>
@@ -7995,7 +8194,47 @@
     </w:p>
     <w:p>
       <w:r>
-        <w:t xml:space="preserve">La fonction normalise les espaces périphériques, vérifie les longueurs et le caractère conditionnel de la justification, exige </w:t>
+        <w:t xml:space="preserve">La fonction impose un invariant tout-ou-rien : </w:t>
+      </w:r>
+      <w:r>
+        <w:rPr>
+          <w:rFonts w:ascii="Consolas" w:hAnsi="Consolas"/>
+          <w:shd w:fill="EEF2F4"/>
+        </w:rPr>
+        <w:t>true</w:t>
+      </w:r>
+      <w:r>
+        <w:t xml:space="preserve"> exige les 81 notes et 1 à 4 valeurs valides ; </w:t>
+      </w:r>
+      <w:r>
+        <w:rPr>
+          <w:rFonts w:ascii="Consolas" w:hAnsi="Consolas"/>
+          <w:shd w:fill="EEF2F4"/>
+        </w:rPr>
+        <w:t>false</w:t>
+      </w:r>
+      <w:r>
+        <w:t xml:space="preserve"> exige exactement </w:t>
+      </w:r>
+      <w:r>
+        <w:rPr>
+          <w:rFonts w:ascii="Consolas" w:hAnsi="Consolas"/>
+          <w:shd w:fill="EEF2F4"/>
+        </w:rPr>
+        <w:t>{}</w:t>
+      </w:r>
+      <w:r>
+        <w:t xml:space="preserve"> et </w:t>
+      </w:r>
+      <w:r>
+        <w:rPr>
+          <w:rFonts w:ascii="Consolas" w:hAnsi="Consolas"/>
+          <w:shd w:fill="EEF2F4"/>
+        </w:rPr>
+        <w:t>[]</w:t>
+      </w:r>
+      <w:r>
+        <w:t xml:space="preserve">. Elle normalise les espaces périphériques, vérifie les longueurs et le caractère conditionnel de la justification, exige </w:t>
       </w:r>
       <w:r>
         <w:rPr>
@@ -8030,17 +8269,7 @@
     </w:p>
     <w:p>
       <w:r>
-        <w:t xml:space="preserve">Les façades </w:t>
-      </w:r>
-      <w:r>
-        <w:rPr>
-          <w:rFonts w:ascii="Consolas" w:hAnsi="Consolas"/>
-          <w:shd w:fill="EEF2F4"/>
-        </w:rPr>
-        <w:t>public.*_v3</w:t>
-      </w:r>
-      <w:r>
-        <w:t xml:space="preserve"> sont exécutables par </w:t>
+        <w:t xml:space="preserve">Les façades publiques v3 et v4 nécessaires sont exécutables par </w:t>
       </w:r>
       <w:r>
         <w:rPr>
@@ -8060,17 +8289,7 @@
         <w:t>authenticated</w:t>
       </w:r>
       <w:r>
-        <w:t xml:space="preserve">. Elles délèguent aux implémentations </w:t>
-      </w:r>
-      <w:r>
-        <w:rPr>
-          <w:rFonts w:ascii="Consolas" w:hAnsi="Consolas"/>
-          <w:shd w:fill="EEF2F4"/>
-        </w:rPr>
-        <w:t>private.*_v3</w:t>
-      </w:r>
-      <w:r>
-        <w:t>, auxquelles ces rôles n'ont aucun droit direct.</w:t>
+        <w:t>. Elles délèguent aux implémentations privées correspondantes, auxquelles ces rôles n'ont aucun droit direct.</w:t>
       </w:r>
     </w:p>
     <w:p>
@@ -8117,6 +8336,23 @@
         <w:t xml:space="preserve">• </w:t>
       </w:r>
       <w:r>
+        <w:t>filtrer selon la complétion ou le passage volontaire du questionnaire de 81 items ;</w:t>
+      </w:r>
+    </w:p>
+    <w:p>
+      <w:pPr>
+        <w:pStyle w:val="ListBullet"/>
+        <w:ind w:left="520" w:hanging="280"/>
+        <w:spacing w:after="70"/>
+      </w:pPr>
+      <w:r>
+        <w:rPr>
+          <w:b/>
+          <w:color w:val="0B6B70"/>
+        </w:rPr>
+        <w:t xml:space="preserve">• </w:t>
+      </w:r>
+      <w:r>
         <w:t>prévisualiser la réponse sur la perception actuelle dans la liste ;</w:t>
       </w:r>
     </w:p>
@@ -8152,6 +8388,23 @@
       </w:r>
       <w:r>
         <w:t>exporter les colonnes qualitatives en JSON ou dans les CSV large, long et analytique ;</w:t>
+      </w:r>
+    </w:p>
+    <w:p>
+      <w:pPr>
+        <w:pStyle w:val="ListBullet"/>
+        <w:ind w:left="520" w:hanging="280"/>
+        <w:spacing w:after="70"/>
+      </w:pPr>
+      <w:r>
+        <w:rPr>
+          <w:b/>
+          <w:color w:val="0B6B70"/>
+        </w:rPr>
+        <w:t xml:space="preserve">• </w:t>
+      </w:r>
+      <w:r>
+        <w:t>conserver les questionnaires passés dans les exports brut, analytique et JSON avec leur statut explicite, sans créer de lignes d'items fictives dans le CSV long ;</w:t>
       </w:r>
     </w:p>
     <w:p>
@@ -8433,7 +8686,7 @@
               <w:spacing w:after="0"/>
             </w:pPr>
             <w:r>
-              <w:t>Soumettre une réponse v1/v2/v3</w:t>
+              <w:t>Soumettre une réponse v1/v2/v3/v4</w:t>
             </w:r>
           </w:p>
         </w:tc>
@@ -10166,41 +10419,54 @@
         <w:t xml:space="preserve">• </w:t>
       </w:r>
       <w:r>
-        <w:t>exactement 81 identifiants de questions attendus ;</w:t>
-      </w:r>
-    </w:p>
-    <w:p>
-      <w:pPr>
-        <w:pStyle w:val="ListBullet"/>
-        <w:ind w:left="520" w:hanging="280"/>
-        <w:spacing w:after="70"/>
-      </w:pPr>
-      <w:r>
-        <w:rPr>
-          <w:b/>
-          <w:color w:val="0B6B70"/>
-        </w:rPr>
-        <w:t xml:space="preserve">• </w:t>
-      </w:r>
-      <w:r>
-        <w:t>des notes entières de 1 à 10 ;</w:t>
-      </w:r>
-    </w:p>
-    <w:p>
-      <w:pPr>
-        <w:pStyle w:val="ListBullet"/>
-        <w:ind w:left="520" w:hanging="280"/>
-        <w:spacing w:after="70"/>
-      </w:pPr>
-      <w:r>
-        <w:rPr>
-          <w:b/>
-          <w:color w:val="0B6B70"/>
-        </w:rPr>
-        <w:t xml:space="preserve">• </w:t>
-      </w:r>
-      <w:r>
-        <w:t>une à quatre valeurs canoniques, distinctes ;</w:t>
+        <w:t>pour les étudiants et les spécialistes ayant choisi le profil quantitatif : exactement 81 identifiants, des notes entières de 1 à 10 et une à quatre valeurs canoniques distinctes ;</w:t>
+      </w:r>
+    </w:p>
+    <w:p>
+      <w:pPr>
+        <w:pStyle w:val="ListBullet"/>
+        <w:ind w:left="520" w:hanging="280"/>
+        <w:spacing w:after="70"/>
+      </w:pPr>
+      <w:r>
+        <w:rPr>
+          <w:b/>
+          <w:color w:val="0B6B70"/>
+        </w:rPr>
+        <w:t xml:space="preserve">• </w:t>
+      </w:r>
+      <w:r>
+        <w:t xml:space="preserve">pour un spécialiste ayant passé ce profil : </w:t>
+      </w:r>
+      <w:r>
+        <w:rPr>
+          <w:rFonts w:ascii="Consolas" w:hAnsi="Consolas"/>
+          <w:shd w:fill="EEF2F4"/>
+        </w:rPr>
+        <w:t>questionnaire_completed = false</w:t>
+      </w:r>
+      <w:r>
+        <w:t xml:space="preserve">, </w:t>
+      </w:r>
+      <w:r>
+        <w:rPr>
+          <w:rFonts w:ascii="Consolas" w:hAnsi="Consolas"/>
+          <w:shd w:fill="EEF2F4"/>
+        </w:rPr>
+        <w:t>ratings = {}</w:t>
+      </w:r>
+      <w:r>
+        <w:t xml:space="preserve"> et </w:t>
+      </w:r>
+      <w:r>
+        <w:rPr>
+          <w:rFonts w:ascii="Consolas" w:hAnsi="Consolas"/>
+          <w:shd w:fill="EEF2F4"/>
+        </w:rPr>
+        <w:t>selected_values = []</w:t>
+      </w:r>
+      <w:r>
+        <w:t>, sans état partiel possible ;</w:t>
       </w:r>
     </w:p>
     <w:p>
@@ -10482,24 +10748,24 @@
         <w:t xml:space="preserve">• </w:t>
       </w:r>
       <w:r>
-        <w:t>les 81 réponses brutes ;</w:t>
-      </w:r>
-    </w:p>
-    <w:p>
-      <w:pPr>
-        <w:pStyle w:val="ListBullet"/>
-        <w:ind w:left="520" w:hanging="280"/>
-        <w:spacing w:after="70"/>
-      </w:pPr>
-      <w:r>
-        <w:rPr>
-          <w:b/>
-          <w:color w:val="0B6B70"/>
-        </w:rPr>
-        <w:t xml:space="preserve">• </w:t>
-      </w:r>
-      <w:r>
-        <w:t>les valeurs sélectionnées ;</w:t>
+        <w:t>l'état explicite de complétion du questionnaire spécialiste ;</w:t>
+      </w:r>
+    </w:p>
+    <w:p>
+      <w:pPr>
+        <w:pStyle w:val="ListBullet"/>
+        <w:ind w:left="520" w:hanging="280"/>
+        <w:spacing w:after="70"/>
+      </w:pPr>
+      <w:r>
+        <w:rPr>
+          <w:b/>
+          <w:color w:val="0B6B70"/>
+        </w:rPr>
+        <w:t xml:space="preserve">• </w:t>
+      </w:r>
+      <w:r>
+        <w:t>les 81 réponses brutes et les valeurs sélectionnées lorsqu'elles ont été réellement fournies ;</w:t>
       </w:r>
     </w:p>
     <w:p>
@@ -10606,7 +10872,7 @@
     </w:p>
     <w:p>
       <w:r>
-        <w:t>Les RPC v2 et v3 enregistrent les deux derniers champs de provenance dans la ligne de réponse. Les RPC v3 les rendent obligatoires pour le schéma 2. Cela permet de retrouver l'instantané exact même après plusieurs publications et d'éviter d'analyser une réponse avec un catalogue différent de celui réellement utilisé.</w:t>
+        <w:t>Les RPC v2, v3 et v4 enregistrent les deux derniers champs de provenance dans la ligne de réponse. Les RPC courantes v3 étudiante et v4 spécialiste les rendent obligatoires pour le schéma 2. Cela permet de retrouver l'instantané exact même après plusieurs publications et d'éviter d'analyser une réponse avec un catalogue différent de celui réellement utilisé.</w:t>
       </w:r>
     </w:p>
     <w:p>
@@ -11973,7 +12239,7 @@
         <w:t xml:space="preserve">• </w:t>
       </w:r>
       <w:r>
-        <w:t>les appels v2 et v3 refusent une version non publiée ;</w:t>
+        <w:t>les appels v2, v3 et v4 refusent une version non publiée ;</w:t>
       </w:r>
     </w:p>
     <w:p>
@@ -12024,7 +12290,44 @@
         <w:t xml:space="preserve">• </w:t>
       </w:r>
       <w:r>
-        <w:t>les soumissions v3 écrivent le schéma 2 et les versions scientifiques exactes ;</w:t>
+        <w:t>les soumissions courantes v3 étudiantes et v4 spécialistes écrivent le schéma 2 et les versions scientifiques exactes ;</w:t>
+      </w:r>
+    </w:p>
+    <w:p>
+      <w:pPr>
+        <w:pStyle w:val="ListBullet"/>
+        <w:ind w:left="520" w:hanging="280"/>
+        <w:spacing w:after="70"/>
+      </w:pPr>
+      <w:r>
+        <w:rPr>
+          <w:b/>
+          <w:color w:val="0B6B70"/>
+        </w:rPr>
+        <w:t xml:space="preserve">• </w:t>
+      </w:r>
+      <w:r>
+        <w:t xml:space="preserve">le RPC spécialiste v4 accepte soit un profil quantitatif complet, soit un passage explicite avec </w:t>
+      </w:r>
+      <w:r>
+        <w:rPr>
+          <w:rFonts w:ascii="Consolas" w:hAnsi="Consolas"/>
+          <w:shd w:fill="EEF2F4"/>
+        </w:rPr>
+        <w:t>{}</w:t>
+      </w:r>
+      <w:r>
+        <w:t xml:space="preserve"> et </w:t>
+      </w:r>
+      <w:r>
+        <w:rPr>
+          <w:rFonts w:ascii="Consolas" w:hAnsi="Consolas"/>
+          <w:shd w:fill="EEF2F4"/>
+        </w:rPr>
+        <w:t>[]</w:t>
+      </w:r>
+      <w:r>
+        <w:t>, et rejette tout état intermédiaire ou incohérent ;</w:t>
       </w:r>
     </w:p>
     <w:p>
@@ -12434,7 +12737,7 @@
         <w:t xml:space="preserve">6. </w:t>
       </w:r>
       <w:r>
-        <w:t>effectuer une soumission étudiante v3 et une soumission spécialiste v3 synthétiques, puis vérifier leur schéma, leurs versions, leurs réponses qualitatives et leur provenance ;</w:t>
+        <w:t>effectuer une soumission étudiante v3 et deux soumissions spécialistes v4 synthétiques (profil complet et questionnaire passé), puis vérifier leur schéma, leur statut, leurs versions, leurs réponses qualitatives et leur provenance ;</w:t>
       </w:r>
     </w:p>
     <w:p>

</xml_diff>

<commit_message>
Add participant reflections and global back navigation
</commit_message>
<xml_diff>
--- a/docs/Q-Project-Structure-Base-de-donnees.docx
+++ b/docs/Q-Project-Structure-Base-de-donnees.docx
@@ -26,7 +26,7 @@
         <w:t>Version documentaire :</w:t>
       </w:r>
       <w:r>
-        <w:t xml:space="preserve"> 10 septembre 2026</w:t>
+        <w:t xml:space="preserve"> 11 septembre 2026</w:t>
       </w:r>
     </w:p>
     <w:p>
@@ -67,6 +67,16 @@
         <w:t>supabase/migrations/20260906090000_limit_student_study_year_to_six.sql</w:t>
       </w:r>
       <w:r>
+        <w:t xml:space="preserve">, </w:t>
+      </w:r>
+      <w:r>
+        <w:rPr>
+          <w:rFonts w:ascii="Consolas" w:hAnsi="Consolas"/>
+          <w:shd w:fill="EEF2F4"/>
+        </w:rPr>
+        <w:t>supabase/migrations/20260910090000_optional_specialist_questionnaire.sql</w:t>
+      </w:r>
+      <w:r>
         <w:t xml:space="preserve"> et </w:t>
       </w:r>
       <w:r>
@@ -74,7 +84,7 @@
           <w:rFonts w:ascii="Consolas" w:hAnsi="Consolas"/>
           <w:shd w:fill="EEF2F4"/>
         </w:rPr>
-        <w:t>supabase/migrations/20260910090000_optional_specialist_questionnaire.sql</w:t>
+        <w:t>supabase/migrations/20260911090000_participant_medicine_reflection.sql</w:t>
       </w:r>
     </w:p>
     <w:p>
@@ -397,7 +407,7 @@
         <w:t>réponses anonymes de recherche</w:t>
       </w:r>
       <w:r>
-        <w:t xml:space="preserve"> des étudiants et des spécialistes ;</w:t>
+        <w:t xml:space="preserve"> des étudiants, des personnes qui explorent la médecine et des spécialistes ;</w:t>
       </w:r>
     </w:p>
     <w:p>
@@ -586,7 +596,7 @@
         <w:t xml:space="preserve">• </w:t>
       </w:r>
       <w:r>
-        <w:t>chaque nouvelle soumission de schéma 2, envoyée par la RPC étudiante v3 ou spécialiste v4, enregistre la version exacte du catalogue utilisée ;</w:t>
+        <w:t>chaque nouvelle soumission, envoyée par la RPC participant v4 ou spécialiste v4, enregistre la version exacte du catalogue utilisée ;</w:t>
       </w:r>
     </w:p>
     <w:p>
@@ -620,6 +630,43 @@
         <w:t xml:space="preserve">• </w:t>
       </w:r>
       <w:r>
+        <w:t xml:space="preserve">le rôle </w:t>
+      </w:r>
+      <w:r>
+        <w:rPr>
+          <w:rFonts w:ascii="Consolas" w:hAnsi="Consolas"/>
+          <w:shd w:fill="EEF2F4"/>
+        </w:rPr>
+        <w:t>student</w:t>
+      </w:r>
+      <w:r>
+        <w:t xml:space="preserve"> ou </w:t>
+      </w:r>
+      <w:r>
+        <w:rPr>
+          <w:rFonts w:ascii="Consolas" w:hAnsi="Consolas"/>
+          <w:shd w:fill="EEF2F4"/>
+        </w:rPr>
+        <w:t>curious</w:t>
+      </w:r>
+      <w:r>
+        <w:t xml:space="preserve"> est enregistré explicitement, avec un verbatim obligatoire sur la perception de la médecine lorsque le participant consent à sauvegarder sa contribution ;</w:t>
+      </w:r>
+    </w:p>
+    <w:p>
+      <w:pPr>
+        <w:pStyle w:val="ListBullet"/>
+        <w:ind w:left="520" w:hanging="280"/>
+        <w:spacing w:after="70"/>
+      </w:pPr>
+      <w:r>
+        <w:rPr>
+          <w:b/>
+          <w:color w:val="0B6B70"/>
+        </w:rPr>
+        <w:t xml:space="preserve">• </w:t>
+      </w:r>
+      <w:r>
         <w:t>l'entretien spécialiste de schéma 2 collecte toujours cinq réponses qualitatives ; les 81 items et les valeurs professionnelles sont facultatifs et leur complétion est enregistrée explicitement ;</w:t>
       </w:r>
     </w:p>
@@ -699,7 +746,7 @@
         <w:t>20260906090000_limit_student_study_year_to_six.sql</w:t>
       </w:r>
       <w:r>
-        <w:t xml:space="preserve"> impose la plage 1–6 à toute nouvelle écriture étudiante, y compris via les anciennes RPC encore exécutables, sans réécrire les données historiques. Enfin, </w:t>
+        <w:t xml:space="preserve"> impose la plage 1–6 à toute nouvelle écriture étudiante, y compris via les anciennes RPC encore exécutables, sans réécrire les données historiques. </w:t>
       </w:r>
       <w:r>
         <w:rPr>
@@ -719,7 +766,17 @@
         <w:t>questionnaire_completed</w:t>
       </w:r>
       <w:r>
-        <w:t xml:space="preserve"> et la RPC spécialiste v4. Les appels antérieurs restent disponibles pour la compatibilité ; les nouvelles collectes utilisent v3 pour les étudiants et v4 pour les spécialistes.</w:t>
+        <w:t xml:space="preserve"> et la RPC spécialiste v4. Enfin, </w:t>
+      </w:r>
+      <w:r>
+        <w:rPr>
+          <w:rFonts w:ascii="Consolas" w:hAnsi="Consolas"/>
+          <w:shd w:fill="EEF2F4"/>
+        </w:rPr>
+        <w:t>20260911090000_participant_medicine_reflection.sql</w:t>
+      </w:r>
+      <w:r>
+        <w:t xml:space="preserve"> distingue étudiants et explorateurs, ajoute leur verbatim sur la médecine et introduit la RPC participant v4 de schéma 3. Les appels antérieurs restent disponibles pour la compatibilité.</w:t>
       </w:r>
     </w:p>
     <w:p>
@@ -810,7 +867,7 @@
           <w:sz w:val="18"/>
           <w:szCs w:val="18"/>
         </w:rPr>
-        <w:t xml:space="preserve">│  - étudiant v3 / spécialiste v4   - réponses qualitatives            │</w:t>
+        <w:t xml:space="preserve">│  - participant v4 / spécialiste v4- réponses qualitatives            │</w:t>
       </w:r>
       <w:r>
         <w:br/>
@@ -1107,17 +1164,17 @@
         <w:t xml:space="preserve">3. </w:t>
       </w:r>
       <w:r>
-        <w:t xml:space="preserve">La soumission v3 étudiante ou v4 spécialiste transmet l’identifiant UUID de la version publiée utilisée et crée une ligne de </w:t>
-      </w:r>
-      <w:r>
-        <w:rPr>
-          <w:rFonts w:ascii="Consolas" w:hAnsi="Consolas"/>
-          <w:shd w:fill="EEF2F4"/>
-        </w:rPr>
-        <w:t>submission_schema_version = 2</w:t>
-      </w:r>
-      <w:r>
-        <w:t>.</w:t>
+        <w:t xml:space="preserve">La soumission v4 étudiant/explorateur transmet l’identifiant UUID de la version publiée utilisée et crée une ligne de </w:t>
+      </w:r>
+      <w:r>
+        <w:rPr>
+          <w:rFonts w:ascii="Consolas" w:hAnsi="Consolas"/>
+          <w:shd w:fill="EEF2F4"/>
+        </w:rPr>
+        <w:t>submission_schema_version = 3</w:t>
+      </w:r>
+      <w:r>
+        <w:t>; la soumission spécialiste v4 conserve le schéma 2.</w:t>
       </w:r>
     </w:p>
     <w:p>
@@ -1168,7 +1225,7 @@
         <w:t xml:space="preserve">6. </w:t>
       </w:r>
       <w:r>
-        <w:t>Le spécialiste choisit soit le profil quantitatif complet (81 notes et 1 à 4 valeurs), soit l'accès direct aux cinq questions qualitatives. Un abandon quantitatif efface les réponses partielles ; aucun profil incomplet n'est enregistré.</w:t>
+        <w:t>Le spécialiste choisit soit le profil quantitatif complet (81 notes et 1 à 4 valeurs), soit l'accès direct aux cinq questions qualitatives. En cas de passage direct, les éventuelles réponses partielles ne sont pas envoyées à la base ; aucun profil incomplet n'est enregistré.</w:t>
       </w:r>
     </w:p>
     <w:p>
@@ -1202,7 +1259,24 @@
         <w:t xml:space="preserve">8. </w:t>
       </w:r>
       <w:r>
-        <w:t xml:space="preserve">Le profil « découverte de la médecine » calcule son profil et son classement uniquement dans le navigateur, puis accède directement aux résultats. Il ne passe par aucun formulaire de recherche et n'est inséré ni dans </w:t>
+        <w:t>Après le profil de traits, l’étudiant et la personne qui explore la médecine peuvent répondre à « Que pensez-vous de la médecine ? ». Le texte d'information précise les données enregistrées et l'action d'enregistrement vaut consentement ; le bouton permettant de passer cette collecte reste disponible.</w:t>
+      </w:r>
+    </w:p>
+    <w:p>
+      <w:pPr>
+        <w:pStyle w:val="ListNumber"/>
+        <w:ind w:left="520" w:hanging="280"/>
+        <w:spacing w:after="70"/>
+      </w:pPr>
+      <w:r>
+        <w:rPr>
+          <w:b/>
+          <w:color w:val="0B6B70"/>
+        </w:rPr>
+        <w:t xml:space="preserve">9. </w:t>
+      </w:r>
+      <w:r>
+        <w:t xml:space="preserve">Les deux publics sont stockés dans </w:t>
       </w:r>
       <w:r>
         <w:rPr>
@@ -1212,17 +1286,27 @@
         <w:t>student_responses</w:t>
       </w:r>
       <w:r>
-        <w:t xml:space="preserve"> ni dans </w:t>
-      </w:r>
-      <w:r>
-        <w:rPr>
-          <w:rFonts w:ascii="Consolas" w:hAnsi="Consolas"/>
-          <w:shd w:fill="EEF2F4"/>
-        </w:rPr>
-        <w:t>specialist_responses</w:t>
-      </w:r>
-      <w:r>
-        <w:t>, afin de préserver la séparation des cohortes.</w:t>
+        <w:t xml:space="preserve"> avec un discriminant canonique </w:t>
+      </w:r>
+      <w:r>
+        <w:rPr>
+          <w:rFonts w:ascii="Consolas" w:hAnsi="Consolas"/>
+          <w:shd w:fill="EEF2F4"/>
+        </w:rPr>
+        <w:t>participant_role</w:t>
+      </w:r>
+      <w:r>
+        <w:t xml:space="preserve">. Le rôle </w:t>
+      </w:r>
+      <w:r>
+        <w:rPr>
+          <w:rFonts w:ascii="Consolas" w:hAnsi="Consolas"/>
+          <w:shd w:fill="EEF2F4"/>
+        </w:rPr>
+        <w:t>curious</w:t>
+      </w:r>
+      <w:r>
+        <w:t xml:space="preserve"> interdit toute année d’études afin de ne pas présenter ces personnes comme étudiantes et les analyses du dashboard peuvent filtrer les cohortes séparément.</w:t>
       </w:r>
     </w:p>
     <w:p>
@@ -1288,7 +1372,7 @@
         <w:t xml:space="preserve">3. </w:t>
       </w:r>
       <w:r>
-        <w:t>Les données de recherche, y compris le verbatim qualitatif des spécialistes et les exports, restent accessibles uniquement aux chercheurs allowlistés.</w:t>
+        <w:t>Les données de recherche, y compris les verbatims qualitatifs des participants et des spécialistes ainsi que les exports, restent accessibles uniquement aux chercheurs allowlistés.</w:t>
       </w:r>
     </w:p>
     <w:p>
@@ -5779,7 +5863,7 @@
     </w:p>
     <w:p>
       <w:r>
-        <w:t>Réponses anonymes des étudiants.</w:t>
+        <w:t>Réponses anonymes des étudiants et des personnes qui explorent la médecine. Le nom historique de la table est conservé pour éviter une migration destructive.</w:t>
       </w:r>
     </w:p>
     <w:tbl>
@@ -5940,7 +6024,7 @@
               <w:spacing w:after="0"/>
             </w:pPr>
             <w:r>
-              <w:t>Contexte</w:t>
+              <w:t>Population</w:t>
             </w:r>
           </w:p>
         </w:tc>
@@ -5958,27 +6042,7 @@
                 <w:rFonts w:ascii="Consolas" w:hAnsi="Consolas"/>
                 <w:shd w:fill="EEF2F4"/>
               </w:rPr>
-              <w:t>study_year</w:t>
-            </w:r>
-            <w:r>
-              <w:t xml:space="preserve">, </w:t>
-            </w:r>
-            <w:r>
-              <w:rPr>
-                <w:rFonts w:ascii="Consolas" w:hAnsi="Consolas"/>
-                <w:shd w:fill="EEF2F4"/>
-              </w:rPr>
-              <w:t>preferred_specialty</w:t>
-            </w:r>
-            <w:r>
-              <w:t xml:space="preserve">, </w:t>
-            </w:r>
-            <w:r>
-              <w:rPr>
-                <w:rFonts w:ascii="Consolas" w:hAnsi="Consolas"/>
-                <w:shd w:fill="EEF2F4"/>
-              </w:rPr>
-              <w:t>language</w:t>
+              <w:t>participant_role</w:t>
             </w:r>
           </w:p>
         </w:tc>
@@ -5992,27 +6056,37 @@
               <w:spacing w:after="0"/>
             </w:pPr>
             <w:r>
-              <w:t xml:space="preserve">Métadonnées facultatives et langue. Pour toute nouvelle réponse, </w:t>
-            </w:r>
-            <w:r>
-              <w:rPr>
-                <w:rFonts w:ascii="Consolas" w:hAnsi="Consolas"/>
-                <w:shd w:fill="EEF2F4"/>
-              </w:rPr>
-              <w:t>study_year</w:t>
-            </w:r>
-            <w:r>
-              <w:t xml:space="preserve"> vaut </w:t>
-            </w:r>
-            <w:r>
-              <w:rPr>
-                <w:rFonts w:ascii="Consolas" w:hAnsi="Consolas"/>
-                <w:shd w:fill="EEF2F4"/>
-              </w:rPr>
-              <w:t>NULL</w:t>
-            </w:r>
-            <w:r>
-              <w:t xml:space="preserve"> ou un entier de 1 à 6.</w:t>
+              <w:t xml:space="preserve">Discriminant obligatoire </w:t>
+            </w:r>
+            <w:r>
+              <w:rPr>
+                <w:rFonts w:ascii="Consolas" w:hAnsi="Consolas"/>
+                <w:shd w:fill="EEF2F4"/>
+              </w:rPr>
+              <w:t>student</w:t>
+            </w:r>
+            <w:r>
+              <w:t xml:space="preserve"> ou </w:t>
+            </w:r>
+            <w:r>
+              <w:rPr>
+                <w:rFonts w:ascii="Consolas" w:hAnsi="Consolas"/>
+                <w:shd w:fill="EEF2F4"/>
+              </w:rPr>
+              <w:t>curious</w:t>
+            </w:r>
+            <w:r>
+              <w:t xml:space="preserve">. Les lignes historiques sont reprises comme </w:t>
+            </w:r>
+            <w:r>
+              <w:rPr>
+                <w:rFonts w:ascii="Consolas" w:hAnsi="Consolas"/>
+                <w:shd w:fill="EEF2F4"/>
+              </w:rPr>
+              <w:t>student</w:t>
+            </w:r>
+            <w:r>
+              <w:t>, puisque l’ancien parcours ne stockait que cette population.</w:t>
             </w:r>
           </w:p>
         </w:tc>
@@ -6028,25 +6102,25 @@
               <w:spacing w:after="0"/>
             </w:pPr>
             <w:r>
-              <w:t>Données brutes</w:t>
-            </w:r>
-          </w:p>
-        </w:tc>
-        <w:tc>
-          <w:tcPr>
-            <w:shd w:fill="FFFFFF"/>
-          </w:tcPr>
-          <w:p>
-            <w:pPr>
-              <w:pStyle w:val="TableText"/>
-              <w:spacing w:after="0"/>
-            </w:pPr>
-            <w:r>
-              <w:rPr>
-                <w:rFonts w:ascii="Consolas" w:hAnsi="Consolas"/>
-                <w:shd w:fill="EEF2F4"/>
-              </w:rPr>
-              <w:t>ratings</w:t>
+              <w:t>Contexte</w:t>
+            </w:r>
+          </w:p>
+        </w:tc>
+        <w:tc>
+          <w:tcPr>
+            <w:shd w:fill="FFFFFF"/>
+          </w:tcPr>
+          <w:p>
+            <w:pPr>
+              <w:pStyle w:val="TableText"/>
+              <w:spacing w:after="0"/>
+            </w:pPr>
+            <w:r>
+              <w:rPr>
+                <w:rFonts w:ascii="Consolas" w:hAnsi="Consolas"/>
+                <w:shd w:fill="EEF2F4"/>
+              </w:rPr>
+              <w:t>study_year</w:t>
             </w:r>
             <w:r>
               <w:t xml:space="preserve">, </w:t>
@@ -6056,21 +6130,81 @@
                 <w:rFonts w:ascii="Consolas" w:hAnsi="Consolas"/>
                 <w:shd w:fill="EEF2F4"/>
               </w:rPr>
-              <w:t>selected_values</w:t>
-            </w:r>
-          </w:p>
-        </w:tc>
-        <w:tc>
-          <w:tcPr>
-            <w:shd w:fill="FFFFFF"/>
-          </w:tcPr>
-          <w:p>
-            <w:pPr>
-              <w:pStyle w:val="TableText"/>
-              <w:spacing w:after="0"/>
-            </w:pPr>
-            <w:r>
-              <w:t>81 notes et 1 à 4 valeurs professionnelles.</w:t>
+              <w:t>preferred_specialty</w:t>
+            </w:r>
+            <w:r>
+              <w:t xml:space="preserve">, </w:t>
+            </w:r>
+            <w:r>
+              <w:rPr>
+                <w:rFonts w:ascii="Consolas" w:hAnsi="Consolas"/>
+                <w:shd w:fill="EEF2F4"/>
+              </w:rPr>
+              <w:t>language</w:t>
+            </w:r>
+          </w:p>
+        </w:tc>
+        <w:tc>
+          <w:tcPr>
+            <w:shd w:fill="FFFFFF"/>
+          </w:tcPr>
+          <w:p>
+            <w:pPr>
+              <w:pStyle w:val="TableText"/>
+              <w:spacing w:after="0"/>
+            </w:pPr>
+            <w:r>
+              <w:t xml:space="preserve">Métadonnées facultatives et langue. Pour une réponse </w:t>
+            </w:r>
+            <w:r>
+              <w:rPr>
+                <w:rFonts w:ascii="Consolas" w:hAnsi="Consolas"/>
+                <w:shd w:fill="EEF2F4"/>
+              </w:rPr>
+              <w:t>student</w:t>
+            </w:r>
+            <w:r>
+              <w:t xml:space="preserve">, </w:t>
+            </w:r>
+            <w:r>
+              <w:rPr>
+                <w:rFonts w:ascii="Consolas" w:hAnsi="Consolas"/>
+                <w:shd w:fill="EEF2F4"/>
+              </w:rPr>
+              <w:t>study_year</w:t>
+            </w:r>
+            <w:r>
+              <w:t xml:space="preserve"> vaut </w:t>
+            </w:r>
+            <w:r>
+              <w:rPr>
+                <w:rFonts w:ascii="Consolas" w:hAnsi="Consolas"/>
+                <w:shd w:fill="EEF2F4"/>
+              </w:rPr>
+              <w:t>NULL</w:t>
+            </w:r>
+            <w:r>
+              <w:t xml:space="preserve"> ou un entier de 1 à 6 ; pour </w:t>
+            </w:r>
+            <w:r>
+              <w:rPr>
+                <w:rFonts w:ascii="Consolas" w:hAnsi="Consolas"/>
+                <w:shd w:fill="EEF2F4"/>
+              </w:rPr>
+              <w:t>curious</w:t>
+            </w:r>
+            <w:r>
+              <w:t xml:space="preserve">, il doit être </w:t>
+            </w:r>
+            <w:r>
+              <w:rPr>
+                <w:rFonts w:ascii="Consolas" w:hAnsi="Consolas"/>
+                <w:shd w:fill="EEF2F4"/>
+              </w:rPr>
+              <w:t>NULL</w:t>
+            </w:r>
+            <w:r>
+              <w:t>.</w:t>
             </w:r>
           </w:p>
         </w:tc>
@@ -6086,7 +6220,7 @@
               <w:spacing w:after="0"/>
             </w:pPr>
             <w:r>
-              <w:t>Résultat client</w:t>
+              <w:t>Regard sur la médecine</w:t>
             </w:r>
           </w:p>
         </w:tc>
@@ -6104,7 +6238,7 @@
                 <w:rFonts w:ascii="Consolas" w:hAnsi="Consolas"/>
                 <w:shd w:fill="EEF2F4"/>
               </w:rPr>
-              <w:t>client_scores</w:t>
+              <w:t>medicine_view</w:t>
             </w:r>
           </w:p>
         </w:tc>
@@ -6118,7 +6252,7 @@
               <w:spacing w:after="0"/>
             </w:pPr>
             <w:r>
-              <w:t>Classement calculé dans le navigateur, non vérifié.</w:t>
+              <w:t>Verbatim de 3 à 2 000 caractères, normalisé uniquement aux extrémités et conservé fidèlement. Il est obligatoire pour toute nouvelle soumission v4 consentie.</w:t>
             </w:r>
           </w:p>
         </w:tc>
@@ -6134,25 +6268,25 @@
               <w:spacing w:after="0"/>
             </w:pPr>
             <w:r>
-              <w:t>Versions scientifiques</w:t>
-            </w:r>
-          </w:p>
-        </w:tc>
-        <w:tc>
-          <w:tcPr>
-            <w:shd w:fill="FFFFFF"/>
-          </w:tcPr>
-          <w:p>
-            <w:pPr>
-              <w:pStyle w:val="TableText"/>
-              <w:spacing w:after="0"/>
-            </w:pPr>
-            <w:r>
-              <w:rPr>
-                <w:rFonts w:ascii="Consolas" w:hAnsi="Consolas"/>
-                <w:shd w:fill="EEF2F4"/>
-              </w:rPr>
-              <w:t>submission_schema_version</w:t>
+              <w:t>Données brutes</w:t>
+            </w:r>
+          </w:p>
+        </w:tc>
+        <w:tc>
+          <w:tcPr>
+            <w:shd w:fill="FFFFFF"/>
+          </w:tcPr>
+          <w:p>
+            <w:pPr>
+              <w:pStyle w:val="TableText"/>
+              <w:spacing w:after="0"/>
+            </w:pPr>
+            <w:r>
+              <w:rPr>
+                <w:rFonts w:ascii="Consolas" w:hAnsi="Consolas"/>
+                <w:shd w:fill="EEF2F4"/>
+              </w:rPr>
+              <w:t>ratings</w:t>
             </w:r>
             <w:r>
               <w:t xml:space="preserve">, </w:t>
@@ -6162,61 +6296,21 @@
                 <w:rFonts w:ascii="Consolas" w:hAnsi="Consolas"/>
                 <w:shd w:fill="EEF2F4"/>
               </w:rPr>
-              <w:t>questionnaire_version</w:t>
-            </w:r>
-            <w:r>
-              <w:t xml:space="preserve">, </w:t>
-            </w:r>
-            <w:r>
-              <w:rPr>
-                <w:rFonts w:ascii="Consolas" w:hAnsi="Consolas"/>
-                <w:shd w:fill="EEF2F4"/>
-              </w:rPr>
-              <w:t>value_catalog_version</w:t>
-            </w:r>
-            <w:r>
-              <w:t xml:space="preserve">, </w:t>
-            </w:r>
-            <w:r>
-              <w:rPr>
-                <w:rFonts w:ascii="Consolas" w:hAnsi="Consolas"/>
-                <w:shd w:fill="EEF2F4"/>
-              </w:rPr>
-              <w:t>specialty_catalog_version</w:t>
-            </w:r>
-            <w:r>
-              <w:t xml:space="preserve">, </w:t>
-            </w:r>
-            <w:r>
-              <w:rPr>
-                <w:rFonts w:ascii="Consolas" w:hAnsi="Consolas"/>
-                <w:shd w:fill="EEF2F4"/>
-              </w:rPr>
-              <w:t>scoring_version</w:t>
-            </w:r>
-            <w:r>
-              <w:t xml:space="preserve">, </w:t>
-            </w:r>
-            <w:r>
-              <w:rPr>
-                <w:rFonts w:ascii="Consolas" w:hAnsi="Consolas"/>
-                <w:shd w:fill="EEF2F4"/>
-              </w:rPr>
-              <w:t>consent_version</w:t>
-            </w:r>
-          </w:p>
-        </w:tc>
-        <w:tc>
-          <w:tcPr>
-            <w:shd w:fill="FFFFFF"/>
-          </w:tcPr>
-          <w:p>
-            <w:pPr>
-              <w:pStyle w:val="TableText"/>
-              <w:spacing w:after="0"/>
-            </w:pPr>
-            <w:r>
-              <w:t>Versions nécessaires à l’interprétation.</w:t>
+              <w:t>selected_values</w:t>
+            </w:r>
+          </w:p>
+        </w:tc>
+        <w:tc>
+          <w:tcPr>
+            <w:shd w:fill="FFFFFF"/>
+          </w:tcPr>
+          <w:p>
+            <w:pPr>
+              <w:pStyle w:val="TableText"/>
+              <w:spacing w:after="0"/>
+            </w:pPr>
+            <w:r>
+              <w:t>81 notes et 1 à 4 valeurs professionnelles.</w:t>
             </w:r>
           </w:p>
         </w:tc>
@@ -6232,6 +6326,162 @@
               <w:spacing w:after="0"/>
             </w:pPr>
             <w:r>
+              <w:t>Résultat client</w:t>
+            </w:r>
+          </w:p>
+        </w:tc>
+        <w:tc>
+          <w:tcPr>
+            <w:shd w:fill="F5F8F8"/>
+          </w:tcPr>
+          <w:p>
+            <w:pPr>
+              <w:pStyle w:val="TableText"/>
+              <w:spacing w:after="0"/>
+            </w:pPr>
+            <w:r>
+              <w:rPr>
+                <w:rFonts w:ascii="Consolas" w:hAnsi="Consolas"/>
+                <w:shd w:fill="EEF2F4"/>
+              </w:rPr>
+              <w:t>client_scores</w:t>
+            </w:r>
+          </w:p>
+        </w:tc>
+        <w:tc>
+          <w:tcPr>
+            <w:shd w:fill="F5F8F8"/>
+          </w:tcPr>
+          <w:p>
+            <w:pPr>
+              <w:pStyle w:val="TableText"/>
+              <w:spacing w:after="0"/>
+            </w:pPr>
+            <w:r>
+              <w:t>Classement calculé dans le navigateur, non vérifié.</w:t>
+            </w:r>
+          </w:p>
+        </w:tc>
+      </w:tr>
+      <w:tr>
+        <w:tc>
+          <w:tcPr>
+            <w:shd w:fill="FFFFFF"/>
+          </w:tcPr>
+          <w:p>
+            <w:pPr>
+              <w:pStyle w:val="TableText"/>
+              <w:spacing w:after="0"/>
+            </w:pPr>
+            <w:r>
+              <w:t>Versions scientifiques</w:t>
+            </w:r>
+          </w:p>
+        </w:tc>
+        <w:tc>
+          <w:tcPr>
+            <w:shd w:fill="FFFFFF"/>
+          </w:tcPr>
+          <w:p>
+            <w:pPr>
+              <w:pStyle w:val="TableText"/>
+              <w:spacing w:after="0"/>
+            </w:pPr>
+            <w:r>
+              <w:rPr>
+                <w:rFonts w:ascii="Consolas" w:hAnsi="Consolas"/>
+                <w:shd w:fill="EEF2F4"/>
+              </w:rPr>
+              <w:t>submission_schema_version</w:t>
+            </w:r>
+            <w:r>
+              <w:t xml:space="preserve">, </w:t>
+            </w:r>
+            <w:r>
+              <w:rPr>
+                <w:rFonts w:ascii="Consolas" w:hAnsi="Consolas"/>
+                <w:shd w:fill="EEF2F4"/>
+              </w:rPr>
+              <w:t>questionnaire_version</w:t>
+            </w:r>
+            <w:r>
+              <w:t xml:space="preserve">, </w:t>
+            </w:r>
+            <w:r>
+              <w:rPr>
+                <w:rFonts w:ascii="Consolas" w:hAnsi="Consolas"/>
+                <w:shd w:fill="EEF2F4"/>
+              </w:rPr>
+              <w:t>value_catalog_version</w:t>
+            </w:r>
+            <w:r>
+              <w:t xml:space="preserve">, </w:t>
+            </w:r>
+            <w:r>
+              <w:rPr>
+                <w:rFonts w:ascii="Consolas" w:hAnsi="Consolas"/>
+                <w:shd w:fill="EEF2F4"/>
+              </w:rPr>
+              <w:t>specialty_catalog_version</w:t>
+            </w:r>
+            <w:r>
+              <w:t xml:space="preserve">, </w:t>
+            </w:r>
+            <w:r>
+              <w:rPr>
+                <w:rFonts w:ascii="Consolas" w:hAnsi="Consolas"/>
+                <w:shd w:fill="EEF2F4"/>
+              </w:rPr>
+              <w:t>scoring_version</w:t>
+            </w:r>
+            <w:r>
+              <w:t xml:space="preserve">, </w:t>
+            </w:r>
+            <w:r>
+              <w:rPr>
+                <w:rFonts w:ascii="Consolas" w:hAnsi="Consolas"/>
+                <w:shd w:fill="EEF2F4"/>
+              </w:rPr>
+              <w:t>consent_version</w:t>
+            </w:r>
+            <w:r>
+              <w:t xml:space="preserve">, </w:t>
+            </w:r>
+            <w:r>
+              <w:rPr>
+                <w:rFonts w:ascii="Consolas" w:hAnsi="Consolas"/>
+                <w:shd w:fill="EEF2F4"/>
+              </w:rPr>
+              <w:t>participant_reflection_version</w:t>
+            </w:r>
+          </w:p>
+        </w:tc>
+        <w:tc>
+          <w:tcPr>
+            <w:shd w:fill="FFFFFF"/>
+          </w:tcPr>
+          <w:p>
+            <w:pPr>
+              <w:pStyle w:val="TableText"/>
+              <w:spacing w:after="0"/>
+            </w:pPr>
+            <w:r>
+              <w:t>Versions nécessaires à l’interprétation du questionnaire et de la question libre.</w:t>
+            </w:r>
+          </w:p>
+        </w:tc>
+      </w:tr>
+      <w:tr>
+        <w:tc>
+          <w:tcPr>
+            <w:shd w:fill="F5F8F8"/>
+          </w:tcPr>
+          <w:p>
+            <w:pPr>
+              <w:pStyle w:val="TableText"/>
+              <w:spacing w:after="0"/>
+            </w:pPr>
+            <w:r>
               <w:t>Provenance du catalogue</w:t>
             </w:r>
           </w:p>
@@ -6274,7 +6524,7 @@
               <w:spacing w:after="0"/>
             </w:pPr>
             <w:r>
-              <w:t>Instantané publié exact utilisé par les soumissions v2 et v3 ; obligatoire pour le schéma 2.</w:t>
+              <w:t>Instantané publié exact utilisé par les soumissions v2, v3 et v4 ; obligatoire pour les schémas 2 et 3.</w:t>
             </w:r>
           </w:p>
         </w:tc>
@@ -6317,7 +6567,7 @@
         <w:t>NOT VALID</w:t>
       </w:r>
       <w:r>
-        <w:t xml:space="preserve"> : elle bloque les nouvelles valeurs hors plage, tandis que les éventuelles lignes historiques 7–12 restent intactes et auditables.</w:t>
+        <w:t xml:space="preserve"> : elle bloque les nouvelles valeurs hors plage, tandis que les éventuelles lignes historiques 7–12 restent intactes et auditables. Les deux rôles peuvent être analysés quantitativement, mais doivent rester filtrables et ne doivent pas être décrits comme une cohorte étudiante unique.</w:t>
       </w:r>
     </w:p>
     <w:p>
@@ -7259,28 +7509,62 @@
     </w:p>
     <w:p>
       <w:r>
-        <w:t>Pour le protocole courant, les versions enregistrées sont :</w:t>
-      </w:r>
-    </w:p>
-    <w:p>
-      <w:pPr>
-        <w:pStyle w:val="ListBullet"/>
-        <w:ind w:left="520" w:hanging="280"/>
-        <w:spacing w:after="70"/>
-      </w:pPr>
-      <w:r>
-        <w:rPr>
-          <w:b/>
-          <w:color w:val="0B6B70"/>
-        </w:rPr>
-        <w:t xml:space="preserve">• </w:t>
-      </w:r>
-      <w:r>
-        <w:rPr>
-          <w:rFonts w:ascii="Consolas" w:hAnsi="Consolas"/>
-          <w:shd w:fill="EEF2F4"/>
-        </w:rPr>
-        <w:t>submission_schema_version = 2</w:t>
+        <w:t>Pour les protocoles courants, les versions enregistrées sont :</w:t>
+      </w:r>
+    </w:p>
+    <w:p>
+      <w:pPr>
+        <w:pStyle w:val="ListBullet"/>
+        <w:ind w:left="520" w:hanging="280"/>
+        <w:spacing w:after="70"/>
+      </w:pPr>
+      <w:r>
+        <w:rPr>
+          <w:b/>
+          <w:color w:val="0B6B70"/>
+        </w:rPr>
+        <w:t xml:space="preserve">• </w:t>
+      </w:r>
+      <w:r>
+        <w:rPr>
+          <w:rFonts w:ascii="Consolas" w:hAnsi="Consolas"/>
+          <w:shd w:fill="EEF2F4"/>
+        </w:rPr>
+        <w:t>submission_schema_version = 3</w:t>
+      </w:r>
+      <w:r>
+        <w:t xml:space="preserve"> pour les étudiants et explorateurs, </w:t>
+      </w:r>
+      <w:r>
+        <w:rPr>
+          <w:rFonts w:ascii="Consolas" w:hAnsi="Consolas"/>
+          <w:shd w:fill="EEF2F4"/>
+        </w:rPr>
+        <w:t>2</w:t>
+      </w:r>
+      <w:r>
+        <w:t xml:space="preserve"> pour les spécialistes ;</w:t>
+      </w:r>
+    </w:p>
+    <w:p>
+      <w:pPr>
+        <w:pStyle w:val="ListBullet"/>
+        <w:ind w:left="520" w:hanging="280"/>
+        <w:spacing w:after="70"/>
+      </w:pPr>
+      <w:r>
+        <w:rPr>
+          <w:b/>
+          <w:color w:val="0B6B70"/>
+        </w:rPr>
+        <w:t xml:space="preserve">• </w:t>
+      </w:r>
+      <w:r>
+        <w:rPr>
+          <w:rFonts w:ascii="Consolas" w:hAnsi="Consolas"/>
+          <w:shd w:fill="EEF2F4"/>
+        </w:rPr>
+        <w:t>questionnaire_version = q81-v1</w:t>
       </w:r>
       <w:r>
         <w:t xml:space="preserve"> ;</w:t>
@@ -7304,7 +7588,7 @@
           <w:rFonts w:ascii="Consolas" w:hAnsi="Consolas"/>
           <w:shd w:fill="EEF2F4"/>
         </w:rPr>
-        <w:t>questionnaire_version = q81-v1</w:t>
+        <w:t>value_catalog_version = career-values-v1</w:t>
       </w:r>
       <w:r>
         <w:t xml:space="preserve"> ;</w:t>
@@ -7328,7 +7612,7 @@
           <w:rFonts w:ascii="Consolas" w:hAnsi="Consolas"/>
           <w:shd w:fill="EEF2F4"/>
         </w:rPr>
-        <w:t>value_catalog_version = career-values-v1</w:t>
+        <w:t>specialty_catalog_version = medical-specialties-v1</w:t>
       </w:r>
       <w:r>
         <w:t xml:space="preserve"> ;</w:t>
@@ -7352,7 +7636,380 @@
           <w:rFonts w:ascii="Consolas" w:hAnsi="Consolas"/>
           <w:shd w:fill="EEF2F4"/>
         </w:rPr>
-        <w:t>specialty_catalog_version = medical-specialties-v1</w:t>
+        <w:t>scoring_version = client-scoring-v2</w:t>
+      </w:r>
+      <w:r>
+        <w:t xml:space="preserve"> pour les étudiants et explorateurs ;</w:t>
+      </w:r>
+    </w:p>
+    <w:p>
+      <w:pPr>
+        <w:pStyle w:val="ListBullet"/>
+        <w:ind w:left="520" w:hanging="280"/>
+        <w:spacing w:after="70"/>
+      </w:pPr>
+      <w:r>
+        <w:rPr>
+          <w:b/>
+          <w:color w:val="0B6B70"/>
+        </w:rPr>
+        <w:t xml:space="preserve">• </w:t>
+      </w:r>
+      <w:r>
+        <w:rPr>
+          <w:rFonts w:ascii="Consolas" w:hAnsi="Consolas"/>
+          <w:shd w:fill="EEF2F4"/>
+        </w:rPr>
+        <w:t>calibration_version = calibration-v2-qualitative</w:t>
+      </w:r>
+      <w:r>
+        <w:t xml:space="preserve"> pour les spécialistes ;</w:t>
+      </w:r>
+    </w:p>
+    <w:p>
+      <w:pPr>
+        <w:pStyle w:val="ListBullet"/>
+        <w:ind w:left="520" w:hanging="280"/>
+        <w:spacing w:after="70"/>
+      </w:pPr>
+      <w:r>
+        <w:rPr>
+          <w:b/>
+          <w:color w:val="0B6B70"/>
+        </w:rPr>
+        <w:t xml:space="preserve">• </w:t>
+      </w:r>
+      <w:r>
+        <w:rPr>
+          <w:rFonts w:ascii="Consolas" w:hAnsi="Consolas"/>
+          <w:shd w:fill="EEF2F4"/>
+        </w:rPr>
+        <w:t>participant_reflection_version = medicine-view-v1</w:t>
+      </w:r>
+      <w:r>
+        <w:t xml:space="preserve"> et </w:t>
+      </w:r>
+      <w:r>
+        <w:rPr>
+          <w:rFonts w:ascii="Consolas" w:hAnsi="Consolas"/>
+          <w:shd w:fill="EEF2F4"/>
+        </w:rPr>
+        <w:t>consent_version = research-consent-2026-09-11</w:t>
+      </w:r>
+      <w:r>
+        <w:t xml:space="preserve"> pour les étudiants et explorateurs ;</w:t>
+      </w:r>
+    </w:p>
+    <w:p>
+      <w:pPr>
+        <w:pStyle w:val="ListBullet"/>
+        <w:ind w:left="520" w:hanging="280"/>
+        <w:spacing w:after="70"/>
+      </w:pPr>
+      <w:r>
+        <w:rPr>
+          <w:b/>
+          <w:color w:val="0B6B70"/>
+        </w:rPr>
+        <w:t xml:space="preserve">• </w:t>
+      </w:r>
+      <w:r>
+        <w:rPr>
+          <w:rFonts w:ascii="Consolas" w:hAnsi="Consolas"/>
+          <w:shd w:fill="EEF2F4"/>
+        </w:rPr>
+        <w:t>consent_version = research-consent-2026-09-04</w:t>
+      </w:r>
+      <w:r>
+        <w:t xml:space="preserve"> pour les spécialistes.</w:t>
+      </w:r>
+    </w:p>
+    <w:p>
+      <w:r>
+        <w:t xml:space="preserve">Le libellé stable </w:t>
+      </w:r>
+      <w:r>
+        <w:rPr>
+          <w:rFonts w:ascii="Consolas" w:hAnsi="Consolas"/>
+          <w:shd w:fill="EEF2F4"/>
+        </w:rPr>
+        <w:t>medical-specialties-v1</w:t>
+      </w:r>
+      <w:r>
+        <w:t xml:space="preserve"> désigne le format canonique du catalogue. La provenance de son contenu effectif est donnée séparément par l'UUID et la révision de l'instantané publié.</w:t>
+      </w:r>
+    </w:p>
+    <w:p>
+      <w:pPr>
+        <w:pStyle w:val="Heading1"/>
+      </w:pPr>
+      <w:r>
+        <w:t>6. Fonctions RPC et points d’entrée</w:t>
+      </w:r>
+    </w:p>
+    <w:p>
+      <w:pPr>
+        <w:pStyle w:val="Heading2"/>
+      </w:pPr>
+      <w:r>
+        <w:t>6.1 Accès et identité du portail</w:t>
+      </w:r>
+    </w:p>
+    <w:p>
+      <w:pPr>
+        <w:pStyle w:val="Heading3"/>
+      </w:pPr>
+      <w:r>
+        <w:rPr>
+          <w:rFonts w:ascii="Consolas" w:hAnsi="Consolas"/>
+          <w:shd w:fill="EEF2F4"/>
+        </w:rPr>
+        <w:t>current_user_is_researcher()</w:t>
+      </w:r>
+    </w:p>
+    <w:p>
+      <w:r>
+        <w:t xml:space="preserve">Retourne un booléen indiquant si </w:t>
+      </w:r>
+      <w:r>
+        <w:rPr>
+          <w:rFonts w:ascii="Consolas" w:hAnsi="Consolas"/>
+          <w:shd w:fill="EEF2F4"/>
+        </w:rPr>
+        <w:t>auth.uid()</w:t>
+      </w:r>
+      <w:r>
+        <w:t xml:space="preserve"> correspond à un chercheur actif. Cette fonction maintient la compatibilité avec le dashboard de recherche existant.</w:t>
+      </w:r>
+    </w:p>
+    <w:p>
+      <w:pPr>
+        <w:pStyle w:val="Heading3"/>
+      </w:pPr>
+      <w:r>
+        <w:rPr>
+          <w:rFonts w:ascii="Consolas" w:hAnsi="Consolas"/>
+          <w:shd w:fill="EEF2F4"/>
+        </w:rPr>
+        <w:t>current_user_portal_profile()</w:t>
+      </w:r>
+    </w:p>
+    <w:p>
+      <w:r>
+        <w:t>Retourne un objet JSON minimal : autorisation, nom affiché, rôle, droit de consulter la recherche, droit d’éditer le catalogue et droit de publier. Elle ne renvoie ni e-mail ni donnée Auth sensible.</w:t>
+      </w:r>
+    </w:p>
+    <w:p>
+      <w:pPr>
+        <w:pStyle w:val="Heading2"/>
+      </w:pPr>
+      <w:r>
+        <w:t>6.2 Lecture du catalogue</w:t>
+      </w:r>
+    </w:p>
+    <w:p>
+      <w:pPr>
+        <w:pStyle w:val="Heading3"/>
+      </w:pPr>
+      <w:r>
+        <w:rPr>
+          <w:rFonts w:ascii="Consolas" w:hAnsi="Consolas"/>
+          <w:shd w:fill="EEF2F4"/>
+        </w:rPr>
+        <w:t>get_active_specialty_catalog()</w:t>
+      </w:r>
+    </w:p>
+    <w:p>
+      <w:r>
+        <w:t xml:space="preserve">Accessible publiquement. Retourne uniquement l’instantané </w:t>
+      </w:r>
+      <w:r>
+        <w:rPr>
+          <w:rFonts w:ascii="Consolas" w:hAnsi="Consolas"/>
+          <w:shd w:fill="EEF2F4"/>
+        </w:rPr>
+        <w:t>active</w:t>
+      </w:r>
+      <w:r>
+        <w:t xml:space="preserve"> : métadonnées de version, 58 spécialités, textes localisés et profils de matching. Aucun brouillon, acteur interne ou journal d’audit n’est exposé.</w:t>
+      </w:r>
+    </w:p>
+    <w:p>
+      <w:pPr>
+        <w:pStyle w:val="Heading3"/>
+      </w:pPr>
+      <w:r>
+        <w:rPr>
+          <w:rFonts w:ascii="Consolas" w:hAnsi="Consolas"/>
+          <w:shd w:fill="EEF2F4"/>
+        </w:rPr>
+        <w:t>get_specialty_catalog_draft()</w:t>
+      </w:r>
+    </w:p>
+    <w:p>
+      <w:r>
+        <w:t xml:space="preserve">Réservée à Doctor et Professor. Retourne le brouillon courant avec son </w:t>
+      </w:r>
+      <w:r>
+        <w:rPr>
+          <w:rFonts w:ascii="Consolas" w:hAnsi="Consolas"/>
+          <w:shd w:fill="EEF2F4"/>
+        </w:rPr>
+        <w:t>lock_version</w:t>
+      </w:r>
+      <w:r>
+        <w:t>. En l’absence de brouillon, elle retourne l’actif comme base de travail.</w:t>
+      </w:r>
+    </w:p>
+    <w:p>
+      <w:pPr>
+        <w:pStyle w:val="Heading3"/>
+      </w:pPr>
+      <w:r>
+        <w:rPr>
+          <w:rFonts w:ascii="Consolas" w:hAnsi="Consolas"/>
+          <w:shd w:fill="EEF2F4"/>
+        </w:rPr>
+        <w:t>list_specialty_catalog_versions()</w:t>
+      </w:r>
+    </w:p>
+    <w:p>
+      <w:r>
+        <w:t>Réservée à Doctor et Professor. Retourne l’historique des versions, leur statut, leur parent, leur justification, leur acteur, leur date et leur checksum.</w:t>
+      </w:r>
+    </w:p>
+    <w:p>
+      <w:pPr>
+        <w:pStyle w:val="Heading2"/>
+      </w:pPr>
+      <w:r>
+        <w:t>6.3 Édition et publication</w:t>
+      </w:r>
+    </w:p>
+    <w:p>
+      <w:pPr>
+        <w:pStyle w:val="Heading3"/>
+      </w:pPr>
+      <w:r>
+        <w:rPr>
+          <w:rFonts w:ascii="Consolas" w:hAnsi="Consolas"/>
+          <w:shd w:fill="EEF2F4"/>
+        </w:rPr>
+        <w:t>save_specialty_catalog_entry_draft(...)</w:t>
+      </w:r>
+    </w:p>
+    <w:p>
+      <w:r>
+        <w:t>Réservée à Doctor et Professor. Elle :</w:t>
+      </w:r>
+    </w:p>
+    <w:p>
+      <w:pPr>
+        <w:pStyle w:val="ListNumber"/>
+        <w:ind w:left="520" w:hanging="280"/>
+        <w:spacing w:after="70"/>
+      </w:pPr>
+      <w:r>
+        <w:rPr>
+          <w:b/>
+          <w:color w:val="0B6B70"/>
+        </w:rPr>
+        <w:t xml:space="preserve">1. </w:t>
+      </w:r>
+      <w:r>
+        <w:t>vérifie le rôle ;</w:t>
+      </w:r>
+    </w:p>
+    <w:p>
+      <w:pPr>
+        <w:pStyle w:val="ListNumber"/>
+        <w:ind w:left="520" w:hanging="280"/>
+        <w:spacing w:after="70"/>
+      </w:pPr>
+      <w:r>
+        <w:rPr>
+          <w:b/>
+          <w:color w:val="0B6B70"/>
+        </w:rPr>
+        <w:t xml:space="preserve">2. </w:t>
+      </w:r>
+      <w:r>
+        <w:t>exige une note de changement ;</w:t>
+      </w:r>
+    </w:p>
+    <w:p>
+      <w:pPr>
+        <w:pStyle w:val="ListNumber"/>
+        <w:ind w:left="520" w:hanging="280"/>
+        <w:spacing w:after="70"/>
+      </w:pPr>
+      <w:r>
+        <w:rPr>
+          <w:b/>
+          <w:color w:val="0B6B70"/>
+        </w:rPr>
+        <w:t xml:space="preserve">3. </w:t>
+      </w:r>
+      <w:r>
+        <w:t>contrôle le verrou optimiste ;</w:t>
+      </w:r>
+    </w:p>
+    <w:p>
+      <w:pPr>
+        <w:pStyle w:val="ListNumber"/>
+        <w:ind w:left="520" w:hanging="280"/>
+        <w:spacing w:after="70"/>
+      </w:pPr>
+      <w:r>
+        <w:rPr>
+          <w:b/>
+          <w:color w:val="0B6B70"/>
+        </w:rPr>
+        <w:t xml:space="preserve">4. </w:t>
+      </w:r>
+      <w:r>
+        <w:t>crée le brouillon depuis l’actif si nécessaire ;</w:t>
+      </w:r>
+    </w:p>
+    <w:p>
+      <w:pPr>
+        <w:pStyle w:val="ListNumber"/>
+        <w:ind w:left="520" w:hanging="280"/>
+        <w:spacing w:after="70"/>
+      </w:pPr>
+      <w:r>
+        <w:rPr>
+          <w:b/>
+          <w:color w:val="0B6B70"/>
+        </w:rPr>
+        <w:t xml:space="preserve">5. </w:t>
+      </w:r>
+      <w:r>
+        <w:t>valide les trois langues et le profil ;</w:t>
+      </w:r>
+    </w:p>
+    <w:p>
+      <w:pPr>
+        <w:pStyle w:val="ListNumber"/>
+        <w:ind w:left="520" w:hanging="280"/>
+        <w:spacing w:after="70"/>
+      </w:pPr>
+      <w:r>
+        <w:rPr>
+          <w:b/>
+          <w:color w:val="0B6B70"/>
+        </w:rPr>
+        <w:t xml:space="preserve">6. </w:t>
+      </w:r>
+      <w:r>
+        <w:t xml:space="preserve">interdit toute modification de </w:t>
+      </w:r>
+      <w:r>
+        <w:rPr>
+          <w:rFonts w:ascii="Consolas" w:hAnsi="Consolas"/>
+          <w:shd w:fill="EEF2F4"/>
+        </w:rPr>
+        <w:t>prevention_orientation</w:t>
       </w:r>
       <w:r>
         <w:t xml:space="preserve"> ;</w:t>
@@ -7360,71 +8017,138 @@
     </w:p>
     <w:p>
       <w:pPr>
-        <w:pStyle w:val="ListBullet"/>
-        <w:ind w:left="520" w:hanging="280"/>
-        <w:spacing w:after="70"/>
-      </w:pPr>
-      <w:r>
-        <w:rPr>
-          <w:b/>
-          <w:color w:val="0B6B70"/>
-        </w:rPr>
-        <w:t xml:space="preserve">• </w:t>
-      </w:r>
-      <w:r>
-        <w:rPr>
-          <w:rFonts w:ascii="Consolas" w:hAnsi="Consolas"/>
-          <w:shd w:fill="EEF2F4"/>
-        </w:rPr>
-        <w:t>scoring_version = client-scoring-v2</w:t>
-      </w:r>
-      <w:r>
-        <w:t xml:space="preserve"> pour les étudiants ;</w:t>
-      </w:r>
-    </w:p>
-    <w:p>
-      <w:pPr>
-        <w:pStyle w:val="ListBullet"/>
-        <w:ind w:left="520" w:hanging="280"/>
-        <w:spacing w:after="70"/>
-      </w:pPr>
-      <w:r>
-        <w:rPr>
-          <w:b/>
-          <w:color w:val="0B6B70"/>
-        </w:rPr>
-        <w:t xml:space="preserve">• </w:t>
-      </w:r>
-      <w:r>
-        <w:rPr>
-          <w:rFonts w:ascii="Consolas" w:hAnsi="Consolas"/>
-          <w:shd w:fill="EEF2F4"/>
-        </w:rPr>
-        <w:t>calibration_version = calibration-v2-qualitative</w:t>
-      </w:r>
-      <w:r>
-        <w:t xml:space="preserve"> pour les spécialistes ;</w:t>
-      </w:r>
-    </w:p>
-    <w:p>
-      <w:pPr>
-        <w:pStyle w:val="ListBullet"/>
-        <w:ind w:left="520" w:hanging="280"/>
-        <w:spacing w:after="70"/>
-      </w:pPr>
-      <w:r>
-        <w:rPr>
-          <w:b/>
-          <w:color w:val="0B6B70"/>
-        </w:rPr>
-        <w:t xml:space="preserve">• </w:t>
-      </w:r>
-      <w:r>
-        <w:rPr>
-          <w:rFonts w:ascii="Consolas" w:hAnsi="Consolas"/>
-          <w:shd w:fill="EEF2F4"/>
-        </w:rPr>
-        <w:t>consent_version = research-consent-2026-09-04</w:t>
+        <w:pStyle w:val="ListNumber"/>
+        <w:ind w:left="520" w:hanging="280"/>
+        <w:spacing w:after="70"/>
+      </w:pPr>
+      <w:r>
+        <w:rPr>
+          <w:b/>
+          <w:color w:val="0B6B70"/>
+        </w:rPr>
+        <w:t xml:space="preserve">7. </w:t>
+      </w:r>
+      <w:r>
+        <w:t xml:space="preserve">incrémente </w:t>
+      </w:r>
+      <w:r>
+        <w:rPr>
+          <w:rFonts w:ascii="Consolas" w:hAnsi="Consolas"/>
+          <w:shd w:fill="EEF2F4"/>
+        </w:rPr>
+        <w:t>lock_version</w:t>
+      </w:r>
+      <w:r>
+        <w:t xml:space="preserve"> ;</w:t>
+      </w:r>
+    </w:p>
+    <w:p>
+      <w:pPr>
+        <w:pStyle w:val="ListNumber"/>
+        <w:ind w:left="520" w:hanging="280"/>
+        <w:spacing w:after="70"/>
+      </w:pPr>
+      <w:r>
+        <w:rPr>
+          <w:b/>
+          <w:color w:val="0B6B70"/>
+        </w:rPr>
+        <w:t xml:space="preserve">8. </w:t>
+      </w:r>
+      <w:r>
+        <w:t>écrit l’avant/après dans le journal d’audit.</w:t>
+      </w:r>
+    </w:p>
+    <w:p>
+      <w:pPr>
+        <w:pStyle w:val="Heading3"/>
+      </w:pPr>
+      <w:r>
+        <w:rPr>
+          <w:rFonts w:ascii="Consolas" w:hAnsi="Consolas"/>
+          <w:shd w:fill="EEF2F4"/>
+        </w:rPr>
+        <w:t>publish_specialty_catalog_draft(...)</w:t>
+      </w:r>
+    </w:p>
+    <w:p>
+      <w:r>
+        <w:t>Réservée à Professor. La publication vérifie dans une transaction :</w:t>
+      </w:r>
+    </w:p>
+    <w:p>
+      <w:pPr>
+        <w:pStyle w:val="ListBullet"/>
+        <w:ind w:left="520" w:hanging="280"/>
+        <w:spacing w:after="70"/>
+      </w:pPr>
+      <w:r>
+        <w:rPr>
+          <w:b/>
+          <w:color w:val="0B6B70"/>
+        </w:rPr>
+        <w:t xml:space="preserve">• </w:t>
+      </w:r>
+      <w:r>
+        <w:t>le verrou du brouillon ;</w:t>
+      </w:r>
+    </w:p>
+    <w:p>
+      <w:pPr>
+        <w:pStyle w:val="ListBullet"/>
+        <w:ind w:left="520" w:hanging="280"/>
+        <w:spacing w:after="70"/>
+      </w:pPr>
+      <w:r>
+        <w:rPr>
+          <w:b/>
+          <w:color w:val="0B6B70"/>
+        </w:rPr>
+        <w:t xml:space="preserve">• </w:t>
+      </w:r>
+      <w:r>
+        <w:t>la présence exacte des 58 spécialités ;</w:t>
+      </w:r>
+    </w:p>
+    <w:p>
+      <w:pPr>
+        <w:pStyle w:val="ListBullet"/>
+        <w:ind w:left="520" w:hanging="280"/>
+        <w:spacing w:after="70"/>
+      </w:pPr>
+      <w:r>
+        <w:rPr>
+          <w:b/>
+          <w:color w:val="0B6B70"/>
+        </w:rPr>
+        <w:t xml:space="preserve">• </w:t>
+      </w:r>
+      <w:r>
+        <w:t>la validité de chaque entrée ;</w:t>
+      </w:r>
+    </w:p>
+    <w:p>
+      <w:pPr>
+        <w:pStyle w:val="ListBullet"/>
+        <w:ind w:left="520" w:hanging="280"/>
+        <w:spacing w:after="70"/>
+      </w:pPr>
+      <w:r>
+        <w:rPr>
+          <w:b/>
+          <w:color w:val="0B6B70"/>
+        </w:rPr>
+        <w:t xml:space="preserve">• </w:t>
+      </w:r>
+      <w:r>
+        <w:t xml:space="preserve">l’absence de changement interdit sur </w:t>
+      </w:r>
+      <w:r>
+        <w:rPr>
+          <w:rFonts w:ascii="Consolas" w:hAnsi="Consolas"/>
+          <w:shd w:fill="EEF2F4"/>
+        </w:rPr>
+        <w:t>prevention_orientation</w:t>
       </w:r>
       <w:r>
         <w:t>.</w:t>
@@ -7432,25 +8156,24 @@
     </w:p>
     <w:p>
       <w:r>
-        <w:t xml:space="preserve">Le libellé stable </w:t>
-      </w:r>
-      <w:r>
-        <w:rPr>
-          <w:rFonts w:ascii="Consolas" w:hAnsi="Consolas"/>
-          <w:shd w:fill="EEF2F4"/>
-        </w:rPr>
-        <w:t>medical-specialties-v1</w:t>
-      </w:r>
-      <w:r>
-        <w:t xml:space="preserve"> désigne le format canonique du catalogue. La provenance de son contenu effectif est donnée séparément par l'UUID et la révision de l'instantané publié.</w:t>
-      </w:r>
-    </w:p>
-    <w:p>
-      <w:pPr>
-        <w:pStyle w:val="Heading1"/>
-      </w:pPr>
-      <w:r>
-        <w:t>6. Fonctions RPC et points d’entrée</w:t>
+        <w:t>Elle calcule ensuite le checksum, archive l’ancienne version active et active le brouillon. L’opération est atomique : il ne doit jamais exister un catalogue à moitié publié.</w:t>
+      </w:r>
+    </w:p>
+    <w:p>
+      <w:pPr>
+        <w:pStyle w:val="Heading3"/>
+      </w:pPr>
+      <w:r>
+        <w:rPr>
+          <w:rFonts w:ascii="Consolas" w:hAnsi="Consolas"/>
+          <w:shd w:fill="EEF2F4"/>
+        </w:rPr>
+        <w:t>restore_specialty_catalog_version(...)</w:t>
+      </w:r>
+    </w:p>
+    <w:p>
+      <w:r>
+        <w:t>Réservée à Professor. La restauration ne réécrit pas l’historique. Elle copie un instantané publié antérieur dans une nouvelle révision, archive l’actif courant et publie la copie de façon atomique. Elle ne réactive jamais directement l’ancienne ligne historique.</w:t>
       </w:r>
     </w:p>
     <w:p>
@@ -7458,7 +8181,7 @@
         <w:pStyle w:val="Heading2"/>
       </w:pPr>
       <w:r>
-        <w:t>6.1 Accès et identité du portail</w:t>
+        <w:t>6.4 Soumissions de recherche</w:t>
       </w:r>
     </w:p>
     <w:p>
@@ -7470,22 +8193,22 @@
           <w:rFonts w:ascii="Consolas" w:hAnsi="Consolas"/>
           <w:shd w:fill="EEF2F4"/>
         </w:rPr>
-        <w:t>current_user_is_researcher()</w:t>
-      </w:r>
-    </w:p>
-    <w:p>
-      <w:r>
-        <w:t xml:space="preserve">Retourne un booléen indiquant si </w:t>
-      </w:r>
-      <w:r>
-        <w:rPr>
-          <w:rFonts w:ascii="Consolas" w:hAnsi="Consolas"/>
-          <w:shd w:fill="EEF2F4"/>
-        </w:rPr>
-        <w:t>auth.uid()</w:t>
-      </w:r>
-      <w:r>
-        <w:t xml:space="preserve"> correspond à un chercheur actif. Cette fonction maintient la compatibilité avec le dashboard de recherche existant.</w:t>
+        <w:t>submit_student_response_v1(...)</w:t>
+      </w:r>
+      <w:r>
+        <w:t xml:space="preserve"> et </w:t>
+      </w:r>
+      <w:r>
+        <w:rPr>
+          <w:rFonts w:ascii="Consolas" w:hAnsi="Consolas"/>
+          <w:shd w:fill="EEF2F4"/>
+        </w:rPr>
+        <w:t>submit_specialist_response_v1(...)</w:t>
+      </w:r>
+    </w:p>
+    <w:p>
+      <w:r>
+        <w:t>Fonctions historiques conservées pour compatibilité. Elles valident strictement le payload mais ne demandaient pas initialement l’identifiant de la configuration dynamique.</w:t>
       </w:r>
     </w:p>
     <w:p>
@@ -7497,12 +8220,500 @@
           <w:rFonts w:ascii="Consolas" w:hAnsi="Consolas"/>
           <w:shd w:fill="EEF2F4"/>
         </w:rPr>
-        <w:t>current_user_portal_profile()</w:t>
-      </w:r>
-    </w:p>
-    <w:p>
-      <w:r>
-        <w:t>Retourne un objet JSON minimal : autorisation, nom affiché, rôle, droit de consulter la recherche, droit d’éditer le catalogue et droit de publier. Elle ne renvoie ni e-mail ni donnée Auth sensible.</w:t>
+        <w:t>submit_student_response_v2(...)</w:t>
+      </w:r>
+      <w:r>
+        <w:t xml:space="preserve"> et </w:t>
+      </w:r>
+      <w:r>
+        <w:rPr>
+          <w:rFonts w:ascii="Consolas" w:hAnsi="Consolas"/>
+          <w:shd w:fill="EEF2F4"/>
+        </w:rPr>
+        <w:t>submit_specialist_response_v2(...)</w:t>
+      </w:r>
+    </w:p>
+    <w:p>
+      <w:r>
+        <w:t xml:space="preserve">Ajoutent </w:t>
+      </w:r>
+      <w:r>
+        <w:rPr>
+          <w:rFonts w:ascii="Consolas" w:hAnsi="Consolas"/>
+          <w:shd w:fill="EEF2F4"/>
+        </w:rPr>
+        <w:t>p_specialty_config_version_id</w:t>
+      </w:r>
+      <w:r>
+        <w:t>. La base refuse un identifiant absent ou un instantané qui n’a jamais été publié. La révision correspondante est résolue côté serveur puis enregistrée avec la réponse.</w:t>
+      </w:r>
+    </w:p>
+    <w:p>
+      <w:r>
+        <w:t>Les fonctions restent idempotentes sur l’UUID de soumission. Un rejeu avec une provenance différente est refusé.</w:t>
+      </w:r>
+    </w:p>
+    <w:p>
+      <w:pPr>
+        <w:pStyle w:val="Heading3"/>
+      </w:pPr>
+      <w:r>
+        <w:rPr>
+          <w:rFonts w:ascii="Consolas" w:hAnsi="Consolas"/>
+          <w:shd w:fill="EEF2F4"/>
+        </w:rPr>
+        <w:t>submit_student_response_v3(...)</w:t>
+      </w:r>
+    </w:p>
+    <w:p>
+      <w:r>
+        <w:t>Point d'entrée étudiant antérieur conservé pour compatibilité. Il conserve les 81 items, le catalogue de valeurs et le schéma 2, mais ne distingue pas encore les explorateurs et ne recueille pas leur perception libre de la médecine.</w:t>
+      </w:r>
+    </w:p>
+    <w:p>
+      <w:pPr>
+        <w:pStyle w:val="Heading3"/>
+      </w:pPr>
+      <w:r>
+        <w:rPr>
+          <w:rFonts w:ascii="Consolas" w:hAnsi="Consolas"/>
+          <w:shd w:fill="EEF2F4"/>
+        </w:rPr>
+        <w:t>submit_student_response_v4(...)</w:t>
+      </w:r>
+    </w:p>
+    <w:p>
+      <w:r>
+        <w:t>Point d'entrée courant des étudiants et des personnes qui explorent la médecine. Il conserve les 81 items et le catalogue de valeurs, puis ajoute deux données obligatoires au moment d'enregistrer volontairement une réponse :</w:t>
+      </w:r>
+    </w:p>
+    <w:p>
+      <w:pPr>
+        <w:pStyle w:val="ListNumber"/>
+        <w:ind w:left="520" w:hanging="280"/>
+        <w:spacing w:after="70"/>
+      </w:pPr>
+      <w:r>
+        <w:rPr>
+          <w:b/>
+          <w:color w:val="0B6B70"/>
+        </w:rPr>
+        <w:t xml:space="preserve">1. </w:t>
+      </w:r>
+      <w:r>
+        <w:rPr>
+          <w:rFonts w:ascii="Consolas" w:hAnsi="Consolas"/>
+          <w:shd w:fill="EEF2F4"/>
+        </w:rPr>
+        <w:t>participant_role</w:t>
+      </w:r>
+      <w:r>
+        <w:t xml:space="preserve">, limité à </w:t>
+      </w:r>
+      <w:r>
+        <w:rPr>
+          <w:rFonts w:ascii="Consolas" w:hAnsi="Consolas"/>
+          <w:shd w:fill="EEF2F4"/>
+        </w:rPr>
+        <w:t>student</w:t>
+      </w:r>
+      <w:r>
+        <w:t xml:space="preserve"> ou </w:t>
+      </w:r>
+      <w:r>
+        <w:rPr>
+          <w:rFonts w:ascii="Consolas" w:hAnsi="Consolas"/>
+          <w:shd w:fill="EEF2F4"/>
+        </w:rPr>
+        <w:t>curious</w:t>
+      </w:r>
+      <w:r>
+        <w:t xml:space="preserve"> ;</w:t>
+      </w:r>
+    </w:p>
+    <w:p>
+      <w:pPr>
+        <w:pStyle w:val="ListNumber"/>
+        <w:ind w:left="520" w:hanging="280"/>
+        <w:spacing w:after="70"/>
+      </w:pPr>
+      <w:r>
+        <w:rPr>
+          <w:b/>
+          <w:color w:val="0B6B70"/>
+        </w:rPr>
+        <w:t xml:space="preserve">2. </w:t>
+      </w:r>
+      <w:r>
+        <w:rPr>
+          <w:rFonts w:ascii="Consolas" w:hAnsi="Consolas"/>
+          <w:shd w:fill="EEF2F4"/>
+        </w:rPr>
+        <w:t>medicine_view</w:t>
+      </w:r>
+      <w:r>
+        <w:t>, un texte normalisé de 3 à 2 000 caractères répondant à la question « Que pensez-vous de la médecine ? ».</w:t>
+      </w:r>
+    </w:p>
+    <w:p>
+      <w:r>
+        <w:t xml:space="preserve">Une année d'études facultative comprise entre 1 et 6 est admise uniquement pour </w:t>
+      </w:r>
+      <w:r>
+        <w:rPr>
+          <w:rFonts w:ascii="Consolas" w:hAnsi="Consolas"/>
+          <w:shd w:fill="EEF2F4"/>
+        </w:rPr>
+        <w:t>student</w:t>
+      </w:r>
+      <w:r>
+        <w:t xml:space="preserve"> ; elle doit être </w:t>
+      </w:r>
+      <w:r>
+        <w:rPr>
+          <w:rFonts w:ascii="Consolas" w:hAnsi="Consolas"/>
+          <w:shd w:fill="EEF2F4"/>
+        </w:rPr>
+        <w:t>NULL</w:t>
+      </w:r>
+      <w:r>
+        <w:t xml:space="preserve"> pour </w:t>
+      </w:r>
+      <w:r>
+        <w:rPr>
+          <w:rFonts w:ascii="Consolas" w:hAnsi="Consolas"/>
+          <w:shd w:fill="EEF2F4"/>
+        </w:rPr>
+        <w:t>curious</w:t>
+      </w:r>
+      <w:r>
+        <w:t xml:space="preserve">. La fonction impose </w:t>
+      </w:r>
+      <w:r>
+        <w:rPr>
+          <w:rFonts w:ascii="Consolas" w:hAnsi="Consolas"/>
+          <w:shd w:fill="EEF2F4"/>
+        </w:rPr>
+        <w:t>client-scoring-v2</w:t>
+      </w:r>
+      <w:r>
+        <w:t xml:space="preserve">, </w:t>
+      </w:r>
+      <w:r>
+        <w:rPr>
+          <w:rFonts w:ascii="Consolas" w:hAnsi="Consolas"/>
+          <w:shd w:fill="EEF2F4"/>
+        </w:rPr>
+        <w:t>research-consent-2026-09-11</w:t>
+      </w:r>
+      <w:r>
+        <w:t xml:space="preserve">, </w:t>
+      </w:r>
+      <w:r>
+        <w:rPr>
+          <w:rFonts w:ascii="Consolas" w:hAnsi="Consolas"/>
+          <w:shd w:fill="EEF2F4"/>
+        </w:rPr>
+        <w:t>medicine-view-v1</w:t>
+      </w:r>
+      <w:r>
+        <w:t xml:space="preserve"> et la provenance exacte d'un catalogue publié, puis écrit </w:t>
+      </w:r>
+      <w:r>
+        <w:rPr>
+          <w:rFonts w:ascii="Consolas" w:hAnsi="Consolas"/>
+          <w:shd w:fill="EEF2F4"/>
+        </w:rPr>
+        <w:t>submission_schema_version = 3</w:t>
+      </w:r>
+      <w:r>
+        <w:t>. Dans l'interface, l'enregistrement reste facultatif : la personne peut passer cette étape et afficher ses résultats sans créer de ligne. L'UUID fourni par le client reste idempotent : un rejeu strictement identique renvoie le même identifiant, tandis qu'un rôle, un texte ou tout autre payload différent avec le même UUID est refusé.</w:t>
+      </w:r>
+    </w:p>
+    <w:p>
+      <w:pPr>
+        <w:pStyle w:val="Heading3"/>
+      </w:pPr>
+      <w:r>
+        <w:rPr>
+          <w:rFonts w:ascii="Consolas" w:hAnsi="Consolas"/>
+          <w:shd w:fill="EEF2F4"/>
+        </w:rPr>
+        <w:t>submit_specialist_response_v3(...)</w:t>
+      </w:r>
+    </w:p>
+    <w:p>
+      <w:r>
+        <w:t xml:space="preserve">Point d'entrée spécialiste antérieur conservé pour compatibilité. Il exige encore les 81 notes et les valeurs, et enregistre implicitement </w:t>
+      </w:r>
+      <w:r>
+        <w:rPr>
+          <w:rFonts w:ascii="Consolas" w:hAnsi="Consolas"/>
+          <w:shd w:fill="EEF2F4"/>
+        </w:rPr>
+        <w:t>questionnaire_completed = true</w:t>
+      </w:r>
+      <w:r>
+        <w:t xml:space="preserve"> grâce à la valeur par défaut.</w:t>
+      </w:r>
+    </w:p>
+    <w:p>
+      <w:pPr>
+        <w:pStyle w:val="Heading3"/>
+      </w:pPr>
+      <w:r>
+        <w:rPr>
+          <w:rFonts w:ascii="Consolas" w:hAnsi="Consolas"/>
+          <w:shd w:fill="EEF2F4"/>
+        </w:rPr>
+        <w:t>submit_specialist_response_v4(...)</w:t>
+      </w:r>
+    </w:p>
+    <w:p>
+      <w:r>
+        <w:t xml:space="preserve">Point d'entrée courant des spécialistes. Il reçoit le booléen </w:t>
+      </w:r>
+      <w:r>
+        <w:rPr>
+          <w:rFonts w:ascii="Consolas" w:hAnsi="Consolas"/>
+          <w:shd w:fill="EEF2F4"/>
+        </w:rPr>
+        <w:t>p_questionnaire_completed</w:t>
+      </w:r>
+      <w:r>
+        <w:t>, puis :</w:t>
+      </w:r>
+    </w:p>
+    <w:p>
+      <w:pPr>
+        <w:pStyle w:val="ListNumber"/>
+        <w:ind w:left="520" w:hanging="280"/>
+        <w:spacing w:after="70"/>
+      </w:pPr>
+      <w:r>
+        <w:rPr>
+          <w:b/>
+          <w:color w:val="0B6B70"/>
+        </w:rPr>
+        <w:t xml:space="preserve">1. </w:t>
+      </w:r>
+      <w:r>
+        <w:t>la spécialité actuelle ;</w:t>
+      </w:r>
+    </w:p>
+    <w:p>
+      <w:pPr>
+        <w:pStyle w:val="ListNumber"/>
+        <w:ind w:left="520" w:hanging="280"/>
+        <w:spacing w:after="70"/>
+      </w:pPr>
+      <w:r>
+        <w:rPr>
+          <w:b/>
+          <w:color w:val="0B6B70"/>
+        </w:rPr>
+        <w:t xml:space="preserve">2. </w:t>
+      </w:r>
+      <w:r>
+        <w:t>la manière dont le spécialiste voit aujourd'hui sa spécialité ;</w:t>
+      </w:r>
+    </w:p>
+    <w:p>
+      <w:pPr>
+        <w:pStyle w:val="ListNumber"/>
+        <w:ind w:left="520" w:hanging="280"/>
+        <w:spacing w:after="70"/>
+      </w:pPr>
+      <w:r>
+        <w:rPr>
+          <w:b/>
+          <w:color w:val="0B6B70"/>
+        </w:rPr>
+        <w:t xml:space="preserve">3. </w:t>
+      </w:r>
+      <w:r>
+        <w:t>ce qui a changé au fil des années ;</w:t>
+      </w:r>
+    </w:p>
+    <w:p>
+      <w:pPr>
+        <w:pStyle w:val="ListNumber"/>
+        <w:ind w:left="520" w:hanging="280"/>
+        <w:spacing w:after="70"/>
+      </w:pPr>
+      <w:r>
+        <w:rPr>
+          <w:b/>
+          <w:color w:val="0B6B70"/>
+        </w:rPr>
+        <w:t xml:space="preserve">4. </w:t>
+      </w:r>
+      <w:r>
+        <w:t>la qualité la plus importante pour cette spécialité ;</w:t>
+      </w:r>
+    </w:p>
+    <w:p>
+      <w:pPr>
+        <w:pStyle w:val="ListNumber"/>
+        <w:ind w:left="520" w:hanging="280"/>
+        <w:spacing w:after="70"/>
+      </w:pPr>
+      <w:r>
+        <w:rPr>
+          <w:b/>
+          <w:color w:val="0B6B70"/>
+        </w:rPr>
+        <w:t xml:space="preserve">5. </w:t>
+      </w:r>
+      <w:r>
+        <w:t xml:space="preserve">le choix </w:t>
+      </w:r>
+      <w:r>
+        <w:rPr>
+          <w:rFonts w:ascii="Consolas" w:hAnsi="Consolas"/>
+          <w:shd w:fill="EEF2F4"/>
+        </w:rPr>
+        <w:t>yes</w:t>
+      </w:r>
+      <w:r>
+        <w:t xml:space="preserve"> ou </w:t>
+      </w:r>
+      <w:r>
+        <w:rPr>
+          <w:rFonts w:ascii="Consolas" w:hAnsi="Consolas"/>
+          <w:shd w:fill="EEF2F4"/>
+        </w:rPr>
+        <w:t>no</w:t>
+      </w:r>
+      <w:r>
+        <w:t xml:space="preserve"> de refaire la même spécialité, avec une justification obligatoire seulement pour </w:t>
+      </w:r>
+      <w:r>
+        <w:rPr>
+          <w:rFonts w:ascii="Consolas" w:hAnsi="Consolas"/>
+          <w:shd w:fill="EEF2F4"/>
+        </w:rPr>
+        <w:t>no</w:t>
+      </w:r>
+      <w:r>
+        <w:t xml:space="preserve"> ;</w:t>
+      </w:r>
+    </w:p>
+    <w:p>
+      <w:pPr>
+        <w:pStyle w:val="ListNumber"/>
+        <w:ind w:left="520" w:hanging="280"/>
+        <w:spacing w:after="70"/>
+      </w:pPr>
+      <w:r>
+        <w:rPr>
+          <w:b/>
+          <w:color w:val="0B6B70"/>
+        </w:rPr>
+        <w:t xml:space="preserve">6. </w:t>
+      </w:r>
+      <w:r>
+        <w:t>la question qu'un étudiant devrait se poser avant de choisir cette spécialité.</w:t>
+      </w:r>
+    </w:p>
+    <w:p>
+      <w:r>
+        <w:t xml:space="preserve">La fonction impose un invariant tout-ou-rien : </w:t>
+      </w:r>
+      <w:r>
+        <w:rPr>
+          <w:rFonts w:ascii="Consolas" w:hAnsi="Consolas"/>
+          <w:shd w:fill="EEF2F4"/>
+        </w:rPr>
+        <w:t>true</w:t>
+      </w:r>
+      <w:r>
+        <w:t xml:space="preserve"> exige les 81 notes et 1 à 4 valeurs valides ; </w:t>
+      </w:r>
+      <w:r>
+        <w:rPr>
+          <w:rFonts w:ascii="Consolas" w:hAnsi="Consolas"/>
+          <w:shd w:fill="EEF2F4"/>
+        </w:rPr>
+        <w:t>false</w:t>
+      </w:r>
+      <w:r>
+        <w:t xml:space="preserve"> exige exactement </w:t>
+      </w:r>
+      <w:r>
+        <w:rPr>
+          <w:rFonts w:ascii="Consolas" w:hAnsi="Consolas"/>
+          <w:shd w:fill="EEF2F4"/>
+        </w:rPr>
+        <w:t>{}</w:t>
+      </w:r>
+      <w:r>
+        <w:t xml:space="preserve"> et </w:t>
+      </w:r>
+      <w:r>
+        <w:rPr>
+          <w:rFonts w:ascii="Consolas" w:hAnsi="Consolas"/>
+          <w:shd w:fill="EEF2F4"/>
+        </w:rPr>
+        <w:t>[]</w:t>
+      </w:r>
+      <w:r>
+        <w:t xml:space="preserve">. Elle normalise les espaces périphériques, vérifie les longueurs et le caractère conditionnel de la justification, exige </w:t>
+      </w:r>
+      <w:r>
+        <w:rPr>
+          <w:rFonts w:ascii="Consolas" w:hAnsi="Consolas"/>
+          <w:shd w:fill="EEF2F4"/>
+        </w:rPr>
+        <w:t>calibration-v2-qualitative</w:t>
+      </w:r>
+      <w:r>
+        <w:t xml:space="preserve">, </w:t>
+      </w:r>
+      <w:r>
+        <w:rPr>
+          <w:rFonts w:ascii="Consolas" w:hAnsi="Consolas"/>
+          <w:shd w:fill="EEF2F4"/>
+        </w:rPr>
+        <w:t>research-consent-2026-09-04</w:t>
+      </w:r>
+      <w:r>
+        <w:t xml:space="preserve"> et une provenance publiée, puis écrit une ligne de schéma 2. Les anciens champs d'expérience, satisfaction, intention de changement et caractère volontaire sont volontairement écrits à </w:t>
+      </w:r>
+      <w:r>
+        <w:rPr>
+          <w:rFonts w:ascii="Consolas" w:hAnsi="Consolas"/>
+          <w:shd w:fill="EEF2F4"/>
+        </w:rPr>
+        <w:t>NULL</w:t>
+      </w:r>
+      <w:r>
+        <w:t>.</w:t>
+      </w:r>
+    </w:p>
+    <w:p>
+      <w:r>
+        <w:t xml:space="preserve">Les façades publiques v3 et v4 nécessaires sont exécutables par </w:t>
+      </w:r>
+      <w:r>
+        <w:rPr>
+          <w:rFonts w:ascii="Consolas" w:hAnsi="Consolas"/>
+          <w:shd w:fill="EEF2F4"/>
+        </w:rPr>
+        <w:t>anon</w:t>
+      </w:r>
+      <w:r>
+        <w:t xml:space="preserve"> et </w:t>
+      </w:r>
+      <w:r>
+        <w:rPr>
+          <w:rFonts w:ascii="Consolas" w:hAnsi="Consolas"/>
+          <w:shd w:fill="EEF2F4"/>
+        </w:rPr>
+        <w:t>authenticated</w:t>
+      </w:r>
+      <w:r>
+        <w:t>. Elles délèguent aux implémentations privées correspondantes, auxquelles ces rôles n'ont aucun droit direct.</w:t>
       </w:r>
     </w:p>
     <w:p>
@@ -7510,396 +8721,36 @@
         <w:pStyle w:val="Heading2"/>
       </w:pPr>
       <w:r>
-        <w:t>6.2 Lecture du catalogue</w:t>
-      </w:r>
-    </w:p>
-    <w:p>
-      <w:pPr>
-        <w:pStyle w:val="Heading3"/>
-      </w:pPr>
-      <w:r>
-        <w:rPr>
-          <w:rFonts w:ascii="Consolas" w:hAnsi="Consolas"/>
-          <w:shd w:fill="EEF2F4"/>
-        </w:rPr>
-        <w:t>get_active_specialty_catalog()</w:t>
-      </w:r>
-    </w:p>
-    <w:p>
-      <w:r>
-        <w:t xml:space="preserve">Accessible publiquement. Retourne uniquement l’instantané </w:t>
-      </w:r>
-      <w:r>
-        <w:rPr>
-          <w:rFonts w:ascii="Consolas" w:hAnsi="Consolas"/>
-          <w:shd w:fill="EEF2F4"/>
-        </w:rPr>
-        <w:t>active</w:t>
-      </w:r>
-      <w:r>
-        <w:t xml:space="preserve"> : métadonnées de version, 58 spécialités, textes localisés et profils de matching. Aucun brouillon, acteur interne ou journal d’audit n’est exposé.</w:t>
-      </w:r>
-    </w:p>
-    <w:p>
-      <w:pPr>
-        <w:pStyle w:val="Heading3"/>
-      </w:pPr>
-      <w:r>
-        <w:rPr>
-          <w:rFonts w:ascii="Consolas" w:hAnsi="Consolas"/>
-          <w:shd w:fill="EEF2F4"/>
-        </w:rPr>
-        <w:t>get_specialty_catalog_draft()</w:t>
-      </w:r>
-    </w:p>
-    <w:p>
-      <w:r>
-        <w:t xml:space="preserve">Réservée à Doctor et Professor. Retourne le brouillon courant avec son </w:t>
-      </w:r>
-      <w:r>
-        <w:rPr>
-          <w:rFonts w:ascii="Consolas" w:hAnsi="Consolas"/>
-          <w:shd w:fill="EEF2F4"/>
-        </w:rPr>
-        <w:t>lock_version</w:t>
-      </w:r>
-      <w:r>
-        <w:t>. En l’absence de brouillon, elle retourne l’actif comme base de travail.</w:t>
-      </w:r>
-    </w:p>
-    <w:p>
-      <w:pPr>
-        <w:pStyle w:val="Heading3"/>
-      </w:pPr>
-      <w:r>
-        <w:rPr>
-          <w:rFonts w:ascii="Consolas" w:hAnsi="Consolas"/>
-          <w:shd w:fill="EEF2F4"/>
-        </w:rPr>
-        <w:t>list_specialty_catalog_versions()</w:t>
-      </w:r>
-    </w:p>
-    <w:p>
-      <w:r>
-        <w:t>Réservée à Doctor et Professor. Retourne l’historique des versions, leur statut, leur parent, leur justification, leur acteur, leur date et leur checksum.</w:t>
-      </w:r>
-    </w:p>
-    <w:p>
-      <w:pPr>
-        <w:pStyle w:val="Heading2"/>
-      </w:pPr>
-      <w:r>
-        <w:t>6.3 Édition et publication</w:t>
-      </w:r>
-    </w:p>
-    <w:p>
-      <w:pPr>
-        <w:pStyle w:val="Heading3"/>
-      </w:pPr>
-      <w:r>
-        <w:rPr>
-          <w:rFonts w:ascii="Consolas" w:hAnsi="Consolas"/>
-          <w:shd w:fill="EEF2F4"/>
-        </w:rPr>
-        <w:t>save_specialty_catalog_entry_draft(...)</w:t>
-      </w:r>
-    </w:p>
-    <w:p>
-      <w:r>
-        <w:t>Réservée à Doctor et Professor. Elle :</w:t>
-      </w:r>
-    </w:p>
-    <w:p>
-      <w:pPr>
-        <w:pStyle w:val="ListNumber"/>
-        <w:ind w:left="520" w:hanging="280"/>
-        <w:spacing w:after="70"/>
-      </w:pPr>
-      <w:r>
-        <w:rPr>
-          <w:b/>
-          <w:color w:val="0B6B70"/>
-        </w:rPr>
-        <w:t xml:space="preserve">1. </w:t>
-      </w:r>
-      <w:r>
-        <w:t>vérifie le rôle ;</w:t>
-      </w:r>
-    </w:p>
-    <w:p>
-      <w:pPr>
-        <w:pStyle w:val="ListNumber"/>
-        <w:ind w:left="520" w:hanging="280"/>
-        <w:spacing w:after="70"/>
-      </w:pPr>
-      <w:r>
-        <w:rPr>
-          <w:b/>
-          <w:color w:val="0B6B70"/>
-        </w:rPr>
-        <w:t xml:space="preserve">2. </w:t>
-      </w:r>
-      <w:r>
-        <w:t>exige une note de changement ;</w:t>
-      </w:r>
-    </w:p>
-    <w:p>
-      <w:pPr>
-        <w:pStyle w:val="ListNumber"/>
-        <w:ind w:left="520" w:hanging="280"/>
-        <w:spacing w:after="70"/>
-      </w:pPr>
-      <w:r>
-        <w:rPr>
-          <w:b/>
-          <w:color w:val="0B6B70"/>
-        </w:rPr>
-        <w:t xml:space="preserve">3. </w:t>
-      </w:r>
-      <w:r>
-        <w:t>contrôle le verrou optimiste ;</w:t>
-      </w:r>
-    </w:p>
-    <w:p>
-      <w:pPr>
-        <w:pStyle w:val="ListNumber"/>
-        <w:ind w:left="520" w:hanging="280"/>
-        <w:spacing w:after="70"/>
-      </w:pPr>
-      <w:r>
-        <w:rPr>
-          <w:b/>
-          <w:color w:val="0B6B70"/>
-        </w:rPr>
-        <w:t xml:space="preserve">4. </w:t>
-      </w:r>
-      <w:r>
-        <w:t>crée le brouillon depuis l’actif si nécessaire ;</w:t>
-      </w:r>
-    </w:p>
-    <w:p>
-      <w:pPr>
-        <w:pStyle w:val="ListNumber"/>
-        <w:ind w:left="520" w:hanging="280"/>
-        <w:spacing w:after="70"/>
-      </w:pPr>
-      <w:r>
-        <w:rPr>
-          <w:b/>
-          <w:color w:val="0B6B70"/>
-        </w:rPr>
-        <w:t xml:space="preserve">5. </w:t>
-      </w:r>
-      <w:r>
-        <w:t>valide les trois langues et le profil ;</w:t>
-      </w:r>
-    </w:p>
-    <w:p>
-      <w:pPr>
-        <w:pStyle w:val="ListNumber"/>
-        <w:ind w:left="520" w:hanging="280"/>
-        <w:spacing w:after="70"/>
-      </w:pPr>
-      <w:r>
-        <w:rPr>
-          <w:b/>
-          <w:color w:val="0B6B70"/>
-        </w:rPr>
-        <w:t xml:space="preserve">6. </w:t>
-      </w:r>
-      <w:r>
-        <w:t xml:space="preserve">interdit toute modification de </w:t>
-      </w:r>
-      <w:r>
-        <w:rPr>
-          <w:rFonts w:ascii="Consolas" w:hAnsi="Consolas"/>
-          <w:shd w:fill="EEF2F4"/>
-        </w:rPr>
-        <w:t>prevention_orientation</w:t>
-      </w:r>
-      <w:r>
-        <w:t xml:space="preserve"> ;</w:t>
-      </w:r>
-    </w:p>
-    <w:p>
-      <w:pPr>
-        <w:pStyle w:val="ListNumber"/>
-        <w:ind w:left="520" w:hanging="280"/>
-        <w:spacing w:after="70"/>
-      </w:pPr>
-      <w:r>
-        <w:rPr>
-          <w:b/>
-          <w:color w:val="0B6B70"/>
-        </w:rPr>
-        <w:t xml:space="preserve">7. </w:t>
-      </w:r>
-      <w:r>
-        <w:t xml:space="preserve">incrémente </w:t>
-      </w:r>
-      <w:r>
-        <w:rPr>
-          <w:rFonts w:ascii="Consolas" w:hAnsi="Consolas"/>
-          <w:shd w:fill="EEF2F4"/>
-        </w:rPr>
-        <w:t>lock_version</w:t>
-      </w:r>
-      <w:r>
-        <w:t xml:space="preserve"> ;</w:t>
-      </w:r>
-    </w:p>
-    <w:p>
-      <w:pPr>
-        <w:pStyle w:val="ListNumber"/>
-        <w:ind w:left="520" w:hanging="280"/>
-        <w:spacing w:after="70"/>
-      </w:pPr>
-      <w:r>
-        <w:rPr>
-          <w:b/>
-          <w:color w:val="0B6B70"/>
-        </w:rPr>
-        <w:t xml:space="preserve">8. </w:t>
-      </w:r>
-      <w:r>
-        <w:t>écrit l’avant/après dans le journal d’audit.</w:t>
-      </w:r>
-    </w:p>
-    <w:p>
-      <w:pPr>
-        <w:pStyle w:val="Heading3"/>
-      </w:pPr>
-      <w:r>
-        <w:rPr>
-          <w:rFonts w:ascii="Consolas" w:hAnsi="Consolas"/>
-          <w:shd w:fill="EEF2F4"/>
-        </w:rPr>
-        <w:t>publish_specialty_catalog_draft(...)</w:t>
-      </w:r>
-    </w:p>
-    <w:p>
-      <w:r>
-        <w:t>Réservée à Professor. La publication vérifie dans une transaction :</w:t>
-      </w:r>
-    </w:p>
-    <w:p>
-      <w:pPr>
-        <w:pStyle w:val="ListBullet"/>
-        <w:ind w:left="520" w:hanging="280"/>
-        <w:spacing w:after="70"/>
-      </w:pPr>
-      <w:r>
-        <w:rPr>
-          <w:b/>
-          <w:color w:val="0B6B70"/>
-        </w:rPr>
-        <w:t xml:space="preserve">• </w:t>
-      </w:r>
-      <w:r>
-        <w:t>le verrou du brouillon ;</w:t>
-      </w:r>
-    </w:p>
-    <w:p>
-      <w:pPr>
-        <w:pStyle w:val="ListBullet"/>
-        <w:ind w:left="520" w:hanging="280"/>
-        <w:spacing w:after="70"/>
-      </w:pPr>
-      <w:r>
-        <w:rPr>
-          <w:b/>
-          <w:color w:val="0B6B70"/>
-        </w:rPr>
-        <w:t xml:space="preserve">• </w:t>
-      </w:r>
-      <w:r>
-        <w:t>la présence exacte des 58 spécialités ;</w:t>
-      </w:r>
-    </w:p>
-    <w:p>
-      <w:pPr>
-        <w:pStyle w:val="ListBullet"/>
-        <w:ind w:left="520" w:hanging="280"/>
-        <w:spacing w:after="70"/>
-      </w:pPr>
-      <w:r>
-        <w:rPr>
-          <w:b/>
-          <w:color w:val="0B6B70"/>
-        </w:rPr>
-        <w:t xml:space="preserve">• </w:t>
-      </w:r>
-      <w:r>
-        <w:t>la validité de chaque entrée ;</w:t>
-      </w:r>
-    </w:p>
-    <w:p>
-      <w:pPr>
-        <w:pStyle w:val="ListBullet"/>
-        <w:ind w:left="520" w:hanging="280"/>
-        <w:spacing w:after="70"/>
-      </w:pPr>
-      <w:r>
-        <w:rPr>
-          <w:b/>
-          <w:color w:val="0B6B70"/>
-        </w:rPr>
-        <w:t xml:space="preserve">• </w:t>
-      </w:r>
-      <w:r>
-        <w:t xml:space="preserve">l’absence de changement interdit sur </w:t>
-      </w:r>
-      <w:r>
-        <w:rPr>
-          <w:rFonts w:ascii="Consolas" w:hAnsi="Consolas"/>
-          <w:shd w:fill="EEF2F4"/>
-        </w:rPr>
-        <w:t>prevention_orientation</w:t>
-      </w:r>
-      <w:r>
-        <w:t>.</w:t>
-      </w:r>
-    </w:p>
-    <w:p>
-      <w:r>
-        <w:t>Elle calcule ensuite le checksum, archive l’ancienne version active et active le brouillon. L’opération est atomique : il ne doit jamais exister un catalogue à moitié publié.</w:t>
-      </w:r>
-    </w:p>
-    <w:p>
-      <w:pPr>
-        <w:pStyle w:val="Heading3"/>
-      </w:pPr>
-      <w:r>
-        <w:rPr>
-          <w:rFonts w:ascii="Consolas" w:hAnsi="Consolas"/>
-          <w:shd w:fill="EEF2F4"/>
-        </w:rPr>
-        <w:t>restore_specialty_catalog_version(...)</w:t>
-      </w:r>
-    </w:p>
-    <w:p>
-      <w:r>
-        <w:t>Réservée à Professor. La restauration ne réécrit pas l’historique. Elle copie un instantané publié antérieur dans une nouvelle révision, archive l’actif courant et publie la copie de façon atomique. Elle ne réactive jamais directement l’ancienne ligne historique.</w:t>
-      </w:r>
-    </w:p>
-    <w:p>
-      <w:pPr>
-        <w:pStyle w:val="Heading2"/>
-      </w:pPr>
-      <w:r>
-        <w:t>6.4 Soumissions de recherche</w:t>
-      </w:r>
-    </w:p>
-    <w:p>
-      <w:pPr>
-        <w:pStyle w:val="Heading3"/>
-      </w:pPr>
-      <w:r>
-        <w:rPr>
-          <w:rFonts w:ascii="Consolas" w:hAnsi="Consolas"/>
-          <w:shd w:fill="EEF2F4"/>
-        </w:rPr>
-        <w:t>submit_student_response_v1(...)</w:t>
+        <w:t>6.5 Consultation et export des réponses qualitatives</w:t>
+      </w:r>
+    </w:p>
+    <w:p>
+      <w:r>
+        <w:t>Les comptes allowlistés disposant du droit de recherche peuvent :</w:t>
+      </w:r>
+    </w:p>
+    <w:p>
+      <w:pPr>
+        <w:pStyle w:val="ListBullet"/>
+        <w:ind w:left="520" w:hanging="280"/>
+        <w:spacing w:after="70"/>
+      </w:pPr>
+      <w:r>
+        <w:rPr>
+          <w:b/>
+          <w:color w:val="0B6B70"/>
+        </w:rPr>
+        <w:t xml:space="preserve">• </w:t>
+      </w:r>
+      <w:r>
+        <w:t xml:space="preserve">distinguer et filtrer les cohortes </w:t>
+      </w:r>
+      <w:r>
+        <w:rPr>
+          <w:rFonts w:ascii="Consolas" w:hAnsi="Consolas"/>
+          <w:shd w:fill="EEF2F4"/>
+        </w:rPr>
+        <w:t>student</w:t>
       </w:r>
       <w:r>
         <w:t xml:space="preserve"> et </w:t>
@@ -7909,400 +8760,27 @@
           <w:rFonts w:ascii="Consolas" w:hAnsi="Consolas"/>
           <w:shd w:fill="EEF2F4"/>
         </w:rPr>
-        <w:t>submit_specialist_response_v1(...)</w:t>
-      </w:r>
-    </w:p>
-    <w:p>
-      <w:r>
-        <w:t>Fonctions historiques conservées pour compatibilité. Elles valident strictement le payload mais ne demandaient pas initialement l’identifiant de la configuration dynamique.</w:t>
-      </w:r>
-    </w:p>
-    <w:p>
-      <w:pPr>
-        <w:pStyle w:val="Heading3"/>
-      </w:pPr>
-      <w:r>
-        <w:rPr>
-          <w:rFonts w:ascii="Consolas" w:hAnsi="Consolas"/>
-          <w:shd w:fill="EEF2F4"/>
-        </w:rPr>
-        <w:t>submit_student_response_v2(...)</w:t>
-      </w:r>
-      <w:r>
-        <w:t xml:space="preserve"> et </w:t>
-      </w:r>
-      <w:r>
-        <w:rPr>
-          <w:rFonts w:ascii="Consolas" w:hAnsi="Consolas"/>
-          <w:shd w:fill="EEF2F4"/>
-        </w:rPr>
-        <w:t>submit_specialist_response_v2(...)</w:t>
-      </w:r>
-    </w:p>
-    <w:p>
-      <w:r>
-        <w:t xml:space="preserve">Ajoutent </w:t>
-      </w:r>
-      <w:r>
-        <w:rPr>
-          <w:rFonts w:ascii="Consolas" w:hAnsi="Consolas"/>
-          <w:shd w:fill="EEF2F4"/>
-        </w:rPr>
-        <w:t>p_specialty_config_version_id</w:t>
-      </w:r>
-      <w:r>
-        <w:t>. La base refuse un identifiant absent ou un instantané qui n’a jamais été publié. La révision correspondante est résolue côté serveur puis enregistrée avec la réponse.</w:t>
-      </w:r>
-    </w:p>
-    <w:p>
-      <w:r>
-        <w:t>Les fonctions restent idempotentes sur l’UUID de soumission. Un rejeu avec une provenance différente est refusé.</w:t>
-      </w:r>
-    </w:p>
-    <w:p>
-      <w:pPr>
-        <w:pStyle w:val="Heading3"/>
-      </w:pPr>
-      <w:r>
-        <w:rPr>
-          <w:rFonts w:ascii="Consolas" w:hAnsi="Consolas"/>
-          <w:shd w:fill="EEF2F4"/>
-        </w:rPr>
-        <w:t>submit_student_response_v3(...)</w:t>
-      </w:r>
-    </w:p>
-    <w:p>
-      <w:r>
-        <w:t xml:space="preserve">Point d'entrée courant des étudiants. Il conserve les 81 items et le catalogue de valeurs, accepte uniquement une année d’études facultative comprise entre 1 et 6, impose </w:t>
-      </w:r>
-      <w:r>
-        <w:rPr>
-          <w:rFonts w:ascii="Consolas" w:hAnsi="Consolas"/>
-          <w:shd w:fill="EEF2F4"/>
-        </w:rPr>
-        <w:t>client-scoring-v2</w:t>
-      </w:r>
-      <w:r>
-        <w:t xml:space="preserve">, </w:t>
-      </w:r>
-      <w:r>
-        <w:rPr>
-          <w:rFonts w:ascii="Consolas" w:hAnsi="Consolas"/>
-          <w:shd w:fill="EEF2F4"/>
-        </w:rPr>
-        <w:t>research-consent-2026-09-04</w:t>
-      </w:r>
-      <w:r>
-        <w:t xml:space="preserve"> et la provenance exacte d'un catalogue publié, puis écrit </w:t>
-      </w:r>
-      <w:r>
-        <w:rPr>
-          <w:rFonts w:ascii="Consolas" w:hAnsi="Consolas"/>
-          <w:shd w:fill="EEF2F4"/>
-        </w:rPr>
-        <w:t>submission_schema_version = 2</w:t>
-      </w:r>
-      <w:r>
-        <w:t>. L'UUID fourni par le client reste idempotent : un rejeu strictement identique renvoie le même identifiant, tandis qu'un payload différent avec le même UUID est refusé.</w:t>
-      </w:r>
-    </w:p>
-    <w:p>
-      <w:pPr>
-        <w:pStyle w:val="Heading3"/>
-      </w:pPr>
-      <w:r>
-        <w:rPr>
-          <w:rFonts w:ascii="Consolas" w:hAnsi="Consolas"/>
-          <w:shd w:fill="EEF2F4"/>
-        </w:rPr>
-        <w:t>submit_specialist_response_v3(...)</w:t>
-      </w:r>
-    </w:p>
-    <w:p>
-      <w:r>
-        <w:t xml:space="preserve">Point d'entrée spécialiste antérieur conservé pour compatibilité. Il exige encore les 81 notes et les valeurs, et enregistre implicitement </w:t>
-      </w:r>
-      <w:r>
-        <w:rPr>
-          <w:rFonts w:ascii="Consolas" w:hAnsi="Consolas"/>
-          <w:shd w:fill="EEF2F4"/>
-        </w:rPr>
-        <w:t>questionnaire_completed = true</w:t>
-      </w:r>
-      <w:r>
-        <w:t xml:space="preserve"> grâce à la valeur par défaut.</w:t>
-      </w:r>
-    </w:p>
-    <w:p>
-      <w:pPr>
-        <w:pStyle w:val="Heading3"/>
-      </w:pPr>
-      <w:r>
-        <w:rPr>
-          <w:rFonts w:ascii="Consolas" w:hAnsi="Consolas"/>
-          <w:shd w:fill="EEF2F4"/>
-        </w:rPr>
-        <w:t>submit_specialist_response_v4(...)</w:t>
-      </w:r>
-    </w:p>
-    <w:p>
-      <w:r>
-        <w:t xml:space="preserve">Point d'entrée courant des spécialistes. Il reçoit le booléen </w:t>
-      </w:r>
-      <w:r>
-        <w:rPr>
-          <w:rFonts w:ascii="Consolas" w:hAnsi="Consolas"/>
-          <w:shd w:fill="EEF2F4"/>
-        </w:rPr>
-        <w:t>p_questionnaire_completed</w:t>
-      </w:r>
-      <w:r>
-        <w:t>, puis :</w:t>
-      </w:r>
-    </w:p>
-    <w:p>
-      <w:pPr>
-        <w:pStyle w:val="ListNumber"/>
-        <w:ind w:left="520" w:hanging="280"/>
-        <w:spacing w:after="70"/>
-      </w:pPr>
-      <w:r>
-        <w:rPr>
-          <w:b/>
-          <w:color w:val="0B6B70"/>
-        </w:rPr>
-        <w:t xml:space="preserve">1. </w:t>
-      </w:r>
-      <w:r>
-        <w:t>la spécialité actuelle ;</w:t>
-      </w:r>
-    </w:p>
-    <w:p>
-      <w:pPr>
-        <w:pStyle w:val="ListNumber"/>
-        <w:ind w:left="520" w:hanging="280"/>
-        <w:spacing w:after="70"/>
-      </w:pPr>
-      <w:r>
-        <w:rPr>
-          <w:b/>
-          <w:color w:val="0B6B70"/>
-        </w:rPr>
-        <w:t xml:space="preserve">2. </w:t>
-      </w:r>
-      <w:r>
-        <w:t>la manière dont le spécialiste voit aujourd'hui sa spécialité ;</w:t>
-      </w:r>
-    </w:p>
-    <w:p>
-      <w:pPr>
-        <w:pStyle w:val="ListNumber"/>
-        <w:ind w:left="520" w:hanging="280"/>
-        <w:spacing w:after="70"/>
-      </w:pPr>
-      <w:r>
-        <w:rPr>
-          <w:b/>
-          <w:color w:val="0B6B70"/>
-        </w:rPr>
-        <w:t xml:space="preserve">3. </w:t>
-      </w:r>
-      <w:r>
-        <w:t>ce qui a changé au fil des années ;</w:t>
-      </w:r>
-    </w:p>
-    <w:p>
-      <w:pPr>
-        <w:pStyle w:val="ListNumber"/>
-        <w:ind w:left="520" w:hanging="280"/>
-        <w:spacing w:after="70"/>
-      </w:pPr>
-      <w:r>
-        <w:rPr>
-          <w:b/>
-          <w:color w:val="0B6B70"/>
-        </w:rPr>
-        <w:t xml:space="preserve">4. </w:t>
-      </w:r>
-      <w:r>
-        <w:t>la qualité la plus importante pour cette spécialité ;</w:t>
-      </w:r>
-    </w:p>
-    <w:p>
-      <w:pPr>
-        <w:pStyle w:val="ListNumber"/>
-        <w:ind w:left="520" w:hanging="280"/>
-        <w:spacing w:after="70"/>
-      </w:pPr>
-      <w:r>
-        <w:rPr>
-          <w:b/>
-          <w:color w:val="0B6B70"/>
-        </w:rPr>
-        <w:t xml:space="preserve">5. </w:t>
-      </w:r>
-      <w:r>
-        <w:t xml:space="preserve">le choix </w:t>
-      </w:r>
-      <w:r>
-        <w:rPr>
-          <w:rFonts w:ascii="Consolas" w:hAnsi="Consolas"/>
-          <w:shd w:fill="EEF2F4"/>
-        </w:rPr>
-        <w:t>yes</w:t>
-      </w:r>
-      <w:r>
-        <w:t xml:space="preserve"> ou </w:t>
-      </w:r>
-      <w:r>
-        <w:rPr>
-          <w:rFonts w:ascii="Consolas" w:hAnsi="Consolas"/>
-          <w:shd w:fill="EEF2F4"/>
-        </w:rPr>
-        <w:t>no</w:t>
-      </w:r>
-      <w:r>
-        <w:t xml:space="preserve"> de refaire la même spécialité, avec une justification obligatoire seulement pour </w:t>
-      </w:r>
-      <w:r>
-        <w:rPr>
-          <w:rFonts w:ascii="Consolas" w:hAnsi="Consolas"/>
-          <w:shd w:fill="EEF2F4"/>
-        </w:rPr>
-        <w:t>no</w:t>
-      </w:r>
-      <w:r>
-        <w:t xml:space="preserve"> ;</w:t>
-      </w:r>
-    </w:p>
-    <w:p>
-      <w:pPr>
-        <w:pStyle w:val="ListNumber"/>
-        <w:ind w:left="520" w:hanging="280"/>
-        <w:spacing w:after="70"/>
-      </w:pPr>
-      <w:r>
-        <w:rPr>
-          <w:b/>
-          <w:color w:val="0B6B70"/>
-        </w:rPr>
-        <w:t xml:space="preserve">6. </w:t>
-      </w:r>
-      <w:r>
-        <w:t>la question qu'un étudiant devrait se poser avant de choisir cette spécialité.</w:t>
-      </w:r>
-    </w:p>
-    <w:p>
-      <w:r>
-        <w:t xml:space="preserve">La fonction impose un invariant tout-ou-rien : </w:t>
-      </w:r>
-      <w:r>
-        <w:rPr>
-          <w:rFonts w:ascii="Consolas" w:hAnsi="Consolas"/>
-          <w:shd w:fill="EEF2F4"/>
-        </w:rPr>
-        <w:t>true</w:t>
-      </w:r>
-      <w:r>
-        <w:t xml:space="preserve"> exige les 81 notes et 1 à 4 valeurs valides ; </w:t>
-      </w:r>
-      <w:r>
-        <w:rPr>
-          <w:rFonts w:ascii="Consolas" w:hAnsi="Consolas"/>
-          <w:shd w:fill="EEF2F4"/>
-        </w:rPr>
-        <w:t>false</w:t>
-      </w:r>
-      <w:r>
-        <w:t xml:space="preserve"> exige exactement </w:t>
-      </w:r>
-      <w:r>
-        <w:rPr>
-          <w:rFonts w:ascii="Consolas" w:hAnsi="Consolas"/>
-          <w:shd w:fill="EEF2F4"/>
-        </w:rPr>
-        <w:t>{}</w:t>
-      </w:r>
-      <w:r>
-        <w:t xml:space="preserve"> et </w:t>
-      </w:r>
-      <w:r>
-        <w:rPr>
-          <w:rFonts w:ascii="Consolas" w:hAnsi="Consolas"/>
-          <w:shd w:fill="EEF2F4"/>
-        </w:rPr>
-        <w:t>[]</w:t>
-      </w:r>
-      <w:r>
-        <w:t xml:space="preserve">. Elle normalise les espaces périphériques, vérifie les longueurs et le caractère conditionnel de la justification, exige </w:t>
-      </w:r>
-      <w:r>
-        <w:rPr>
-          <w:rFonts w:ascii="Consolas" w:hAnsi="Consolas"/>
-          <w:shd w:fill="EEF2F4"/>
-        </w:rPr>
-        <w:t>calibration-v2-qualitative</w:t>
-      </w:r>
-      <w:r>
-        <w:t xml:space="preserve">, </w:t>
-      </w:r>
-      <w:r>
-        <w:rPr>
-          <w:rFonts w:ascii="Consolas" w:hAnsi="Consolas"/>
-          <w:shd w:fill="EEF2F4"/>
-        </w:rPr>
-        <w:t>research-consent-2026-09-04</w:t>
-      </w:r>
-      <w:r>
-        <w:t xml:space="preserve"> et une provenance publiée, puis écrit une ligne de schéma 2. Les anciens champs d'expérience, satisfaction, intention de changement et caractère volontaire sont volontairement écrits à </w:t>
-      </w:r>
-      <w:r>
-        <w:rPr>
-          <w:rFonts w:ascii="Consolas" w:hAnsi="Consolas"/>
-          <w:shd w:fill="EEF2F4"/>
-        </w:rPr>
-        <w:t>NULL</w:t>
-      </w:r>
-      <w:r>
-        <w:t>.</w:t>
-      </w:r>
-    </w:p>
-    <w:p>
-      <w:r>
-        <w:t xml:space="preserve">Les façades publiques v3 et v4 nécessaires sont exécutables par </w:t>
-      </w:r>
-      <w:r>
-        <w:rPr>
-          <w:rFonts w:ascii="Consolas" w:hAnsi="Consolas"/>
-          <w:shd w:fill="EEF2F4"/>
-        </w:rPr>
-        <w:t>anon</w:t>
-      </w:r>
-      <w:r>
-        <w:t xml:space="preserve"> et </w:t>
-      </w:r>
-      <w:r>
-        <w:rPr>
-          <w:rFonts w:ascii="Consolas" w:hAnsi="Consolas"/>
-          <w:shd w:fill="EEF2F4"/>
-        </w:rPr>
-        <w:t>authenticated</w:t>
-      </w:r>
-      <w:r>
-        <w:t>. Elles délèguent aux implémentations privées correspondantes, auxquelles ces rôles n'ont aucun droit direct.</w:t>
-      </w:r>
-    </w:p>
-    <w:p>
-      <w:pPr>
-        <w:pStyle w:val="Heading2"/>
-      </w:pPr>
-      <w:r>
-        <w:t>6.5 Consultation et export des réponses qualitatives</w:t>
-      </w:r>
-    </w:p>
-    <w:p>
-      <w:r>
-        <w:t>Les comptes allowlistés disposant du droit de recherche peuvent :</w:t>
+        <w:t>curious</w:t>
+      </w:r>
+      <w:r>
+        <w:t xml:space="preserve"> sans les agréger implicitement ;</w:t>
+      </w:r>
+    </w:p>
+    <w:p>
+      <w:pPr>
+        <w:pStyle w:val="ListBullet"/>
+        <w:ind w:left="520" w:hanging="280"/>
+        <w:spacing w:after="70"/>
+      </w:pPr>
+      <w:r>
+        <w:rPr>
+          <w:b/>
+          <w:color w:val="0B6B70"/>
+        </w:rPr>
+        <w:t xml:space="preserve">• </w:t>
+      </w:r>
+      <w:r>
+        <w:t>prévisualiser, lire et exporter le verbatim des participants sur leur perception de la médecine avec son rôle et sa version de protocole ;</w:t>
       </w:r>
     </w:p>
     <w:p>
@@ -8858,7 +9336,7 @@
               <w:spacing w:after="0"/>
             </w:pPr>
             <w:r>
-              <w:t>Lire/exporter les verbatims spécialistes</w:t>
+              <w:t>Lire/exporter les verbatims participants et spécialistes</w:t>
             </w:r>
           </w:p>
         </w:tc>
@@ -10326,7 +10804,7 @@
     </w:p>
     <w:p>
       <w:r>
-        <w:t>Les contraintes de table distinguent trois générations sans réinterpréter les anciennes lignes :</w:t>
+        <w:t>Les contraintes de table distinguent quatre générations sans réinterpréter les anciennes lignes :</w:t>
       </w:r>
     </w:p>
     <w:p>
@@ -10397,46 +10875,63 @@
         <w:t xml:space="preserve">• </w:t>
       </w:r>
       <w:r>
-        <w:t>le schéma 2 exige les versions courantes, les deux colonnes de provenance et les nouvelles règles qualitatives.</w:t>
-      </w:r>
-    </w:p>
-    <w:p>
-      <w:r>
-        <w:t>Pour le schéma 2, la base contrôle notamment :</w:t>
-      </w:r>
-    </w:p>
-    <w:p>
-      <w:pPr>
-        <w:pStyle w:val="ListBullet"/>
-        <w:ind w:left="520" w:hanging="280"/>
-        <w:spacing w:after="70"/>
-      </w:pPr>
-      <w:r>
-        <w:rPr>
-          <w:b/>
-          <w:color w:val="0B6B70"/>
-        </w:rPr>
-        <w:t xml:space="preserve">• </w:t>
-      </w:r>
-      <w:r>
-        <w:t>pour les étudiants et les spécialistes ayant choisi le profil quantitatif : exactement 81 identifiants, des notes entières de 1 à 10 et une à quatre valeurs canoniques distinctes ;</w:t>
-      </w:r>
-    </w:p>
-    <w:p>
-      <w:pPr>
-        <w:pStyle w:val="ListBullet"/>
-        <w:ind w:left="520" w:hanging="280"/>
-        <w:spacing w:after="70"/>
-      </w:pPr>
-      <w:r>
-        <w:rPr>
-          <w:b/>
-          <w:color w:val="0B6B70"/>
-        </w:rPr>
-        <w:t xml:space="preserve">• </w:t>
-      </w:r>
-      <w:r>
-        <w:t xml:space="preserve">pour un spécialiste ayant passé ce profil : </w:t>
+        <w:t>le schéma 2 exige les versions courantes, les deux colonnes de provenance et les nouvelles règles qualitatives spécialistes ;</w:t>
+      </w:r>
+    </w:p>
+    <w:p>
+      <w:pPr>
+        <w:pStyle w:val="ListBullet"/>
+        <w:ind w:left="520" w:hanging="280"/>
+        <w:spacing w:after="70"/>
+      </w:pPr>
+      <w:r>
+        <w:rPr>
+          <w:b/>
+          <w:color w:val="0B6B70"/>
+        </w:rPr>
+        <w:t xml:space="preserve">• </w:t>
+      </w:r>
+      <w:r>
+        <w:t>le schéma 3 étend les réponses participantes avec un rôle explicite, le verbatim sur la médecine et la version de cette question.</w:t>
+      </w:r>
+    </w:p>
+    <w:p>
+      <w:r>
+        <w:t>Pour les schémas 2 et 3, la base contrôle notamment :</w:t>
+      </w:r>
+    </w:p>
+    <w:p>
+      <w:pPr>
+        <w:pStyle w:val="ListBullet"/>
+        <w:ind w:left="520" w:hanging="280"/>
+        <w:spacing w:after="70"/>
+      </w:pPr>
+      <w:r>
+        <w:rPr>
+          <w:b/>
+          <w:color w:val="0B6B70"/>
+        </w:rPr>
+        <w:t xml:space="preserve">• </w:t>
+      </w:r>
+      <w:r>
+        <w:t>pour les participants du schéma 3 et les spécialistes ayant choisi le profil quantitatif : exactement 81 identifiants, des notes entières de 1 à 10 et une à quatre valeurs canoniques distinctes ;</w:t>
+      </w:r>
+    </w:p>
+    <w:p>
+      <w:pPr>
+        <w:pStyle w:val="ListBullet"/>
+        <w:ind w:left="520" w:hanging="280"/>
+        <w:spacing w:after="70"/>
+      </w:pPr>
+      <w:r>
+        <w:rPr>
+          <w:b/>
+          <w:color w:val="0B6B70"/>
+        </w:rPr>
+        <w:t xml:space="preserve">• </w:t>
+      </w:r>
+      <w:r>
+        <w:t xml:space="preserve">pour un spécialiste ayant choisi l'accès direct à l'entretien qualitatif : </w:t>
       </w:r>
       <w:r>
         <w:rPr>
@@ -10547,7 +11042,74 @@
         <w:t xml:space="preserve">• </w:t>
       </w:r>
       <w:r>
-        <w:t>une année d’études étudiante facultative limitée aux entiers de 1 à 6 pour toute nouvelle écriture ;</w:t>
+        <w:t xml:space="preserve">un rôle participant limité à </w:t>
+      </w:r>
+      <w:r>
+        <w:rPr>
+          <w:rFonts w:ascii="Consolas" w:hAnsi="Consolas"/>
+          <w:shd w:fill="EEF2F4"/>
+        </w:rPr>
+        <w:t>student</w:t>
+      </w:r>
+      <w:r>
+        <w:t xml:space="preserve"> ou </w:t>
+      </w:r>
+      <w:r>
+        <w:rPr>
+          <w:rFonts w:ascii="Consolas" w:hAnsi="Consolas"/>
+          <w:shd w:fill="EEF2F4"/>
+        </w:rPr>
+        <w:t>curious</w:t>
+      </w:r>
+      <w:r>
+        <w:t xml:space="preserve">, avec une année d’études facultative de 1 à 6 uniquement pour </w:t>
+      </w:r>
+      <w:r>
+        <w:rPr>
+          <w:rFonts w:ascii="Consolas" w:hAnsi="Consolas"/>
+          <w:shd w:fill="EEF2F4"/>
+        </w:rPr>
+        <w:t>student</w:t>
+      </w:r>
+      <w:r>
+        <w:t xml:space="preserve"> et obligatoirement absente pour </w:t>
+      </w:r>
+      <w:r>
+        <w:rPr>
+          <w:rFonts w:ascii="Consolas" w:hAnsi="Consolas"/>
+          <w:shd w:fill="EEF2F4"/>
+        </w:rPr>
+        <w:t>curious</w:t>
+      </w:r>
+      <w:r>
+        <w:t xml:space="preserve"> ;</w:t>
+      </w:r>
+    </w:p>
+    <w:p>
+      <w:pPr>
+        <w:pStyle w:val="ListBullet"/>
+        <w:ind w:left="520" w:hanging="280"/>
+        <w:spacing w:after="70"/>
+      </w:pPr>
+      <w:r>
+        <w:rPr>
+          <w:b/>
+          <w:color w:val="0B6B70"/>
+        </w:rPr>
+        <w:t xml:space="preserve">• </w:t>
+      </w:r>
+      <w:r>
+        <w:t xml:space="preserve">un avis sur la médecine normalisé de 3 à 2 000 caractères et la version </w:t>
+      </w:r>
+      <w:r>
+        <w:rPr>
+          <w:rFonts w:ascii="Consolas" w:hAnsi="Consolas"/>
+          <w:shd w:fill="EEF2F4"/>
+        </w:rPr>
+        <w:t>medicine-view-v1</w:t>
+      </w:r>
+      <w:r>
+        <w:t xml:space="preserve"> pour toute ligne participante de schéma 3 ;</w:t>
       </w:r>
     </w:p>
     <w:p>
@@ -10718,7 +11280,7 @@
         <w:t>CHECK</w:t>
       </w:r>
       <w:r>
-        <w:t>, afin qu'une erreur interne ne puisse pas créer silencieusement une ligne de schéma 2 incohérente. Les lignes historiques restent consultables et exportables, mais le dashboard les signale comme incompatibles avec les indicateurs du protocole courant.</w:t>
+        <w:t>, afin qu'une erreur interne ne puisse pas créer silencieusement une ligne de schéma 2 ou 3 incohérente. Les lignes historiques restent consultables et exportables, mais le dashboard les signale comme incompatibles avec les indicateurs du protocole courant.</w:t>
       </w:r>
     </w:p>
     <w:p>
@@ -10867,12 +11429,29 @@
         <w:t xml:space="preserve">• </w:t>
       </w:r>
       <w:r>
+        <w:t>la version de la question libre participant, lorsque le schéma vaut 3 ;</w:t>
+      </w:r>
+    </w:p>
+    <w:p>
+      <w:pPr>
+        <w:pStyle w:val="ListBullet"/>
+        <w:ind w:left="520" w:hanging="280"/>
+        <w:spacing w:after="70"/>
+      </w:pPr>
+      <w:r>
+        <w:rPr>
+          <w:b/>
+          <w:color w:val="0B6B70"/>
+        </w:rPr>
+        <w:t xml:space="preserve">• </w:t>
+      </w:r>
+      <w:r>
         <w:t>l’UUID et la révision du catalogue dynamique publié.</w:t>
       </w:r>
     </w:p>
     <w:p>
       <w:r>
-        <w:t>Les RPC v2, v3 et v4 enregistrent les deux derniers champs de provenance dans la ligne de réponse. Les RPC courantes v3 étudiante et v4 spécialiste les rendent obligatoires pour le schéma 2. Cela permet de retrouver l'instantané exact même après plusieurs publications et d'éviter d'analyser une réponse avec un catalogue différent de celui réellement utilisé.</w:t>
+        <w:t>Les RPC v2, v3 et v4 enregistrent l’UUID et la révision du catalogue publié dans la ligne de réponse. Les RPC courantes v4 participant et v4 spécialiste les rendent obligatoires respectivement pour les schémas 3 et 2. Cela permet de retrouver l'instantané exact même après plusieurs publications et d'éviter d'analyser une réponse avec un catalogue différent de celui réellement utilisé.</w:t>
       </w:r>
     </w:p>
     <w:p>
@@ -10927,24 +11506,41 @@
     </w:p>
     <w:p>
       <w:r>
-        <w:t>Les fonctions v1 et v2 restent disponibles pour la compatibilité et certaines lignes anciennes peuvent ne pas avoir une provenance dynamique complète. Le dashboard distingue :</w:t>
-      </w:r>
-    </w:p>
-    <w:p>
-      <w:pPr>
-        <w:pStyle w:val="ListBullet"/>
-        <w:ind w:left="520" w:hanging="280"/>
-        <w:spacing w:after="70"/>
-      </w:pPr>
-      <w:r>
-        <w:rPr>
-          <w:b/>
-          <w:color w:val="0B6B70"/>
-        </w:rPr>
-        <w:t xml:space="preserve">• </w:t>
-      </w:r>
-      <w:r>
-        <w:t>données de schéma 2 courantes et reproductibles ;</w:t>
+        <w:t>Les fonctions v1, v2 et v3 restent disponibles pour la compatibilité et certaines lignes anciennes peuvent ne pas avoir une provenance dynamique complète. Le dashboard distingue :</w:t>
+      </w:r>
+    </w:p>
+    <w:p>
+      <w:pPr>
+        <w:pStyle w:val="ListBullet"/>
+        <w:ind w:left="520" w:hanging="280"/>
+        <w:spacing w:after="70"/>
+      </w:pPr>
+      <w:r>
+        <w:rPr>
+          <w:b/>
+          <w:color w:val="0B6B70"/>
+        </w:rPr>
+        <w:t xml:space="preserve">• </w:t>
+      </w:r>
+      <w:r>
+        <w:t>données participantes de schéma 3 et données spécialistes de schéma 2, courantes et reproductibles ;</w:t>
+      </w:r>
+    </w:p>
+    <w:p>
+      <w:pPr>
+        <w:pStyle w:val="ListBullet"/>
+        <w:ind w:left="520" w:hanging="280"/>
+        <w:spacing w:after="70"/>
+      </w:pPr>
+      <w:r>
+        <w:rPr>
+          <w:b/>
+          <w:color w:val="0B6B70"/>
+        </w:rPr>
+        <w:t xml:space="preserve">• </w:t>
+      </w:r>
+      <w:r>
+        <w:t>données participantes de schéma 2 encore exploitables pour le questionnaire quantitatif, mais dépourvues du verbatim et du rôle explicite du nouveau protocole ;</w:t>
       </w:r>
     </w:p>
     <w:p>
@@ -12290,7 +12886,44 @@
         <w:t xml:space="preserve">• </w:t>
       </w:r>
       <w:r>
-        <w:t>les soumissions courantes v3 étudiantes et v4 spécialistes écrivent le schéma 2 et les versions scientifiques exactes ;</w:t>
+        <w:t xml:space="preserve">la soumission participante v4 distingue </w:t>
+      </w:r>
+      <w:r>
+        <w:rPr>
+          <w:rFonts w:ascii="Consolas" w:hAnsi="Consolas"/>
+          <w:shd w:fill="EEF2F4"/>
+        </w:rPr>
+        <w:t>student</w:t>
+      </w:r>
+      <w:r>
+        <w:t xml:space="preserve"> et </w:t>
+      </w:r>
+      <w:r>
+        <w:rPr>
+          <w:rFonts w:ascii="Consolas" w:hAnsi="Consolas"/>
+          <w:shd w:fill="EEF2F4"/>
+        </w:rPr>
+        <w:t>curious</w:t>
+      </w:r>
+      <w:r>
+        <w:t>, exige le verbatim sur la médecine, interdit l'année d'études aux explorateurs et écrit le schéma 3 avec les versions scientifiques exactes ;</w:t>
+      </w:r>
+    </w:p>
+    <w:p>
+      <w:pPr>
+        <w:pStyle w:val="ListBullet"/>
+        <w:ind w:left="520" w:hanging="280"/>
+        <w:spacing w:after="70"/>
+      </w:pPr>
+      <w:r>
+        <w:rPr>
+          <w:b/>
+          <w:color w:val="0B6B70"/>
+        </w:rPr>
+        <w:t xml:space="preserve">• </w:t>
+      </w:r>
+      <w:r>
+        <w:t>les soumissions spécialistes v4 écrivent le schéma 2 et les versions scientifiques exactes ;</w:t>
       </w:r>
     </w:p>
     <w:p>
@@ -12462,7 +13095,7 @@
         <w:t xml:space="preserve">• </w:t>
       </w:r>
       <w:r>
-        <w:t>les exports contiennent les verbatims, la provenance et neutralisent les préfixes de formule CSV ;</w:t>
+        <w:t>les listes, détails et exports distinguent les cohortes participantes, contiennent leurs verbatims et ceux des spécialistes avec la provenance, et neutralisent les préfixes de formule CSV ;</w:t>
       </w:r>
     </w:p>
     <w:p>
@@ -12737,7 +13370,27 @@
         <w:t xml:space="preserve">6. </w:t>
       </w:r>
       <w:r>
-        <w:t>effectuer une soumission étudiante v3 et deux soumissions spécialistes v4 synthétiques (profil complet et questionnaire passé), puis vérifier leur schéma, leur statut, leurs versions, leurs réponses qualitatives et leur provenance ;</w:t>
+        <w:t>effectuer deux soumissions participantes v4 synthétiques (</w:t>
+      </w:r>
+      <w:r>
+        <w:rPr>
+          <w:rFonts w:ascii="Consolas" w:hAnsi="Consolas"/>
+          <w:shd w:fill="EEF2F4"/>
+        </w:rPr>
+        <w:t>student</w:t>
+      </w:r>
+      <w:r>
+        <w:t xml:space="preserve"> et </w:t>
+      </w:r>
+      <w:r>
+        <w:rPr>
+          <w:rFonts w:ascii="Consolas" w:hAnsi="Consolas"/>
+          <w:shd w:fill="EEF2F4"/>
+        </w:rPr>
+        <w:t>curious</w:t>
+      </w:r>
+      <w:r>
+        <w:t>) et deux soumissions spécialistes v4 synthétiques (profil complet et questionnaire passé), puis vérifier leur schéma, leur rôle, leur statut, leurs versions, leurs réponses qualitatives et leur provenance ;</w:t>
       </w:r>
     </w:p>
     <w:p>
@@ -13569,6 +14222,26 @@
         <w:t>supabase/migrations/20260904193000_accuracy_and_qualitative_specialist_v2.sql</w:t>
       </w:r>
       <w:r>
+        <w:t xml:space="preserve">, </w:t>
+      </w:r>
+      <w:r>
+        <w:rPr>
+          <w:rFonts w:ascii="Consolas" w:hAnsi="Consolas"/>
+          <w:shd w:fill="EEF2F4"/>
+        </w:rPr>
+        <w:t>supabase/migrations/20260906090000_limit_student_study_year_to_six.sql</w:t>
+      </w:r>
+      <w:r>
+        <w:t xml:space="preserve">, </w:t>
+      </w:r>
+      <w:r>
+        <w:rPr>
+          <w:rFonts w:ascii="Consolas" w:hAnsi="Consolas"/>
+          <w:shd w:fill="EEF2F4"/>
+        </w:rPr>
+        <w:t>supabase/migrations/20260910090000_optional_specialist_questionnaire.sql</w:t>
+      </w:r>
+      <w:r>
         <w:t xml:space="preserve"> et </w:t>
       </w:r>
       <w:r>
@@ -13576,7 +14249,7 @@
           <w:rFonts w:ascii="Consolas" w:hAnsi="Consolas"/>
           <w:shd w:fill="EEF2F4"/>
         </w:rPr>
-        <w:t>supabase/migrations/20260906090000_limit_student_study_year_to_six.sql</w:t>
+        <w:t>supabase/migrations/20260911090000_participant_medicine_reflection.sql</w:t>
       </w:r>
     </w:p>
     <w:p>

</xml_diff>